<commit_message>
Refactor project structure: remove outdated exploratory analysis files, update notebook and documentation for clarity, and enhance model evaluation descriptions. Corrected typos and improved formatting across multiple files for consistency.
</commit_message>
<xml_diff>
--- a/E4_Informe_Final_Codigo_Completo/Informe_Final_Prevencion_Vial_Sonora.docx
+++ b/E4_Informe_Final_Codigo_Completo/Informe_Final_Prevencion_Vial_Sonora.docx
@@ -375,7 +375,7 @@
         <w:ind w:firstLine="360"/>
       </w:pPr>
       <w:r>
-        <w:t>Este proyecto estudia los accidentes de transito registrados en Sonora durante los ultimos diez anos disponibles en la base ATUS. El proposito principal fue identificar patrones regionales de frecuencia, gravedad y causas probables para proponer acciones preventivas mas enfocadas. El enfoque no fue buscar culpables individuales, sino entender el comportamiento general de los datos y traducirlo en informacion util para la seguridad vial.</w:t>
+        <w:t>Este proyecto estudia los accidentes de transito registrados en Sonora durante los ultimos diez a?os disponibles en la base ATUS. El proposito principal fue identificar patrones regionales de frecuencia, gravedad y causas probables para proponer acciones preventivas mas enfocadas. El enfoque no fue buscar culpables individuales, sino entender el comportamiento general de los datos y traducirlo en informacion util para la seguridad vial.</w:t>
       </w:r>
     </w:p>
     <w:p>
@@ -783,7 +783,7 @@
         <w:ind w:firstLine="360"/>
       </w:pPr>
       <w:r>
-        <w:t>Las variables disponibles incluyen informacion geografica, temporal, categorica y numerica. Entre las variables mas importantes estan municipio, ano, mes, dia de semana, hora, tipo de accidente, causa probable, tipo de vehiculos involucrados, personas heridas y personas fallecidas.</w:t>
+        <w:t>Las variables disponibles incluyen informacion geografica, temporal, categorica y numerica. Entre las variables mas importantes estan municipio, a?o, mes, dia de semana, hora, tipo de accidente, causa probable, tipo de vehiculos involucrados, personas heridas y personas fallecidas.</w:t>
       </w:r>
     </w:p>
     <w:p>
@@ -874,7 +874,7 @@
         <w:ind w:firstLine="360"/>
       </w:pPr>
       <w:r>
-        <w:t>El analisis exploratorio permitio conocer el comportamiento general antes de aplicar modelos. El primer hallazgo fue temporal: los accidentes aumentaron de manera gradual hasta 2019, bajaron en 2020 y subieron con fuerza despues de ese ano. El valor mas alto se observo en 2023, con 26,557 accidentes.</w:t>
+        <w:t>El analisis exploratorio permitio conocer el comportamiento general antes de aplicar modelos. El primer hallazgo fue temporal: los accidentes aumentaron de manera gradual hasta 2019, bajaron en 2020 y subieron con fuerza despues de ese a?o. El valor mas alto se observo en 2023, con 26,557 accidentes.</w:t>
       </w:r>
     </w:p>
     <w:p>

</xml_diff>

<commit_message>
Refactor final report on traffic accident prevention in Sonora: update structure, enhance clarity, and improve model evaluation metrics. Align with main notebook and include actionable recommendations based on findings.
</commit_message>
<xml_diff>
--- a/E4_Informe_Final_Codigo_Completo/Informe_Final_Prevencion_Vial_Sonora.docx
+++ b/E4_Informe_Final_Codigo_Completo/Informe_Final_Prevencion_Vial_Sonora.docx
@@ -9,10 +9,10 @@
       <w:r>
         <w:rPr>
           <w:b/>
-          <w:color w:val="1F4E79"/>
-          <w:sz w:val="44"/>
+          <w:color w:val="182D43"/>
+          <w:sz w:val="40"/>
         </w:rPr>
-        <w:t>Prevencion vial en Sonora con ATUS</w:t>
+        <w:t>Informe final - Prevencion vial en Sonora con ATUS</w:t>
       </w:r>
     </w:p>
     <w:p>
@@ -21,477 +21,150 @@
       </w:pPr>
       <w:r>
         <w:rPr>
-          <w:i/>
-          <w:sz w:val="28"/>
+          <w:color w:val="207E76"/>
+          <w:sz w:val="22"/>
         </w:rPr>
-        <w:t>Informe final del proyecto</w:t>
+        <w:t>Informe final del proyecto | Mineria de Datos</w:t>
       </w:r>
     </w:p>
     <w:p/>
-    <w:tbl>
-      <w:tblPr>
-        <w:tblStyle w:val="TableGrid"/>
-        <w:tblW w:type="auto" w:w="0"/>
-        <w:jc w:val="center"/>
-        <w:tblLook w:firstColumn="1" w:firstRow="1" w:lastColumn="0" w:lastRow="0" w:noHBand="0" w:noVBand="1" w:val="04A0"/>
-      </w:tblPr>
-      <w:tblGrid>
-        <w:gridCol w:w="4896"/>
-        <w:gridCol w:w="4896"/>
-      </w:tblGrid>
-      <w:tr>
-        <w:tc>
-          <w:tcPr>
-            <w:tcW w:type="dxa" w:w="4896"/>
-            <w:vAlign w:val="center"/>
-            <w:shd w:fill="D9EAF7"/>
-          </w:tcPr>
-          <w:p>
-            <w:pPr>
-              <w:spacing w:after="40"/>
-            </w:pPr>
-            <w:r/>
-            <w:r>
-              <w:rPr>
-                <w:b/>
-              </w:rPr>
-              <w:t>Materia</w:t>
-            </w:r>
-          </w:p>
-        </w:tc>
-        <w:tc>
-          <w:tcPr>
-            <w:tcW w:type="dxa" w:w="4896"/>
-            <w:vAlign w:val="center"/>
-          </w:tcPr>
-          <w:p>
-            <w:pPr>
-              <w:spacing w:after="40"/>
-            </w:pPr>
-            <w:r/>
-            <w:r>
-              <w:rPr>
-                <w:b w:val="0"/>
-              </w:rPr>
-              <w:t>Mineria de Datos</w:t>
-            </w:r>
-          </w:p>
-        </w:tc>
-      </w:tr>
-      <w:tr>
-        <w:tc>
-          <w:tcPr>
-            <w:tcW w:type="dxa" w:w="4896"/>
-            <w:vAlign w:val="center"/>
-            <w:shd w:fill="D9EAF7"/>
-          </w:tcPr>
-          <w:p>
-            <w:pPr>
-              <w:spacing w:after="40"/>
-            </w:pPr>
-            <w:r/>
-            <w:r>
-              <w:rPr>
-                <w:b/>
-              </w:rPr>
-              <w:t>Institucion</w:t>
-            </w:r>
-          </w:p>
-        </w:tc>
-        <w:tc>
-          <w:tcPr>
-            <w:tcW w:type="dxa" w:w="4896"/>
-            <w:vAlign w:val="center"/>
-          </w:tcPr>
-          <w:p>
-            <w:pPr>
-              <w:spacing w:after="40"/>
-            </w:pPr>
-            <w:r/>
-            <w:r>
-              <w:rPr>
-                <w:b w:val="0"/>
-              </w:rPr>
-              <w:t>TecNM / Instituto Tecnologico de Hermosillo</w:t>
-            </w:r>
-          </w:p>
-        </w:tc>
-      </w:tr>
-      <w:tr>
-        <w:tc>
-          <w:tcPr>
-            <w:tcW w:type="dxa" w:w="4896"/>
-            <w:vAlign w:val="center"/>
-            <w:shd w:fill="D9EAF7"/>
-          </w:tcPr>
-          <w:p>
-            <w:pPr>
-              <w:spacing w:after="40"/>
-            </w:pPr>
-            <w:r/>
-            <w:r>
-              <w:rPr>
-                <w:b/>
-              </w:rPr>
-              <w:t>Fuente</w:t>
-            </w:r>
-          </w:p>
-        </w:tc>
-        <w:tc>
-          <w:tcPr>
-            <w:tcW w:type="dxa" w:w="4896"/>
-            <w:vAlign w:val="center"/>
-          </w:tcPr>
-          <w:p>
-            <w:pPr>
-              <w:spacing w:after="40"/>
-            </w:pPr>
-            <w:r/>
-            <w:r>
-              <w:rPr>
-                <w:b w:val="0"/>
-              </w:rPr>
-              <w:t>Accidentes de Transito Terrestre en Zonas Urbanas y Suburbanas (ATUS), INEGI</w:t>
-            </w:r>
-          </w:p>
-        </w:tc>
-      </w:tr>
-      <w:tr>
-        <w:tc>
-          <w:tcPr>
-            <w:tcW w:type="dxa" w:w="4896"/>
-            <w:vAlign w:val="center"/>
-            <w:shd w:fill="D9EAF7"/>
-          </w:tcPr>
-          <w:p>
-            <w:pPr>
-              <w:spacing w:after="40"/>
-            </w:pPr>
-            <w:r/>
-            <w:r>
-              <w:rPr>
-                <w:b/>
-              </w:rPr>
-              <w:t>Periodo</w:t>
-            </w:r>
-          </w:p>
-        </w:tc>
-        <w:tc>
-          <w:tcPr>
-            <w:tcW w:type="dxa" w:w="4896"/>
-            <w:vAlign w:val="center"/>
-          </w:tcPr>
-          <w:p>
-            <w:pPr>
-              <w:spacing w:after="40"/>
-            </w:pPr>
-            <w:r/>
-            <w:r>
-              <w:rPr>
-                <w:b w:val="0"/>
-              </w:rPr>
-              <w:t>2015-2024</w:t>
-            </w:r>
-          </w:p>
-        </w:tc>
-      </w:tr>
-      <w:tr>
-        <w:tc>
-          <w:tcPr>
-            <w:tcW w:type="dxa" w:w="4896"/>
-            <w:vAlign w:val="center"/>
-            <w:shd w:fill="D9EAF7"/>
-          </w:tcPr>
-          <w:p>
-            <w:pPr>
-              <w:spacing w:after="40"/>
-            </w:pPr>
-            <w:r/>
-            <w:r>
-              <w:rPr>
-                <w:b/>
-              </w:rPr>
-              <w:t>Integrantes</w:t>
-            </w:r>
-          </w:p>
-        </w:tc>
-        <w:tc>
-          <w:tcPr>
-            <w:tcW w:type="dxa" w:w="4896"/>
-            <w:vAlign w:val="center"/>
-          </w:tcPr>
-          <w:p>
-            <w:pPr>
-              <w:spacing w:after="40"/>
-            </w:pPr>
-            <w:r/>
-            <w:r>
-              <w:rPr>
-                <w:b w:val="0"/>
-              </w:rPr>
-              <w:t>Felix Gautrin Diane</w:t>
-              <w:br/>
-              <w:t>Landavazo Vasquez Andres Leonardo</w:t>
-              <w:br/>
-              <w:t>Fuentes Babuca Felipe de Jesus</w:t>
-            </w:r>
-          </w:p>
-        </w:tc>
-      </w:tr>
-    </w:tbl>
-    <w:p/>
     <w:p>
       <w:pPr>
-        <w:jc w:val="center"/>
+        <w:pStyle w:val="Heading1"/>
       </w:pPr>
       <w:r>
-        <w:rPr>
-          <w:b/>
-        </w:rPr>
-        <w:t>Entregable E4 - Informe final y codigo completo</w:t>
+        <w:t>Portada e identificacion del equipo</w:t>
       </w:r>
     </w:p>
     <w:p>
       <w:r>
-        <w:br w:type="page"/>
+        <w:t>Proyecto: Prevencion vial en Sonora mediante analisis de accidentes de transito.</w:t>
+      </w:r>
+    </w:p>
+    <w:p>
+      <w:r>
+        <w:t>Materia: Mineria de Datos.</w:t>
+      </w:r>
+    </w:p>
+    <w:p>
+      <w:r>
+        <w:t>Institucion: TecNM / Instituto Tecnologico de Hermosillo.</w:t>
+      </w:r>
+    </w:p>
+    <w:p>
+      <w:r>
+        <w:t>Equipo:</w:t>
+      </w:r>
+    </w:p>
+    <w:p>
+      <w:pPr>
+        <w:pStyle w:val="ListBullet"/>
+      </w:pPr>
+      <w:r>
+        <w:t>Felix Gautrin Diane.</w:t>
+      </w:r>
+    </w:p>
+    <w:p>
+      <w:pPr>
+        <w:pStyle w:val="ListBullet"/>
+      </w:pPr>
+      <w:r>
+        <w:t>Landavazo Vasquez Andres Leonardo.</w:t>
+      </w:r>
+    </w:p>
+    <w:p>
+      <w:pPr>
+        <w:pStyle w:val="ListBullet"/>
+      </w:pPr>
+      <w:r>
+        <w:t>Fuentes Babuca Felipe de Jesus.</w:t>
+      </w:r>
+    </w:p>
+    <w:p>
+      <w:r>
+        <w:t>Fuente principal de datos: Accidentes de Transito Terrestre en Zonas Urbanas y Suburbanas (ATUS), INEGI.</w:t>
+      </w:r>
+    </w:p>
+    <w:p>
+      <w:r>
+        <w:t>Periodo analizado: 2015-2024.</w:t>
       </w:r>
     </w:p>
     <w:p>
       <w:pPr>
         <w:pStyle w:val="Heading1"/>
-        <w:spacing w:before="240" w:after="160"/>
-      </w:pPr>
-      <w:r>
-        <w:t>Indice</w:t>
-      </w:r>
-    </w:p>
-    <w:p>
-      <w:pPr>
-        <w:pStyle w:val="ListNumber"/>
-        <w:spacing w:after="80"/>
-      </w:pPr>
-      <w:r>
-        <w:t>Introduccion y contexto del problema</w:t>
-      </w:r>
-    </w:p>
-    <w:p>
-      <w:pPr>
-        <w:pStyle w:val="ListNumber"/>
-        <w:spacing w:after="80"/>
-      </w:pPr>
-      <w:r>
-        <w:t>Descripcion del dataset</w:t>
-      </w:r>
-    </w:p>
-    <w:p>
-      <w:pPr>
-        <w:pStyle w:val="ListNumber"/>
-        <w:spacing w:after="80"/>
-      </w:pPr>
-      <w:r>
-        <w:t>Preparacion y calidad de datos</w:t>
-      </w:r>
-    </w:p>
-    <w:p>
-      <w:pPr>
-        <w:pStyle w:val="ListNumber"/>
-        <w:spacing w:after="80"/>
-      </w:pPr>
-      <w:r>
-        <w:t>Analisis exploratorio</w:t>
-      </w:r>
-    </w:p>
-    <w:p>
-      <w:pPr>
-        <w:pStyle w:val="ListNumber"/>
-        <w:spacing w:after="80"/>
-      </w:pPr>
-      <w:r>
-        <w:t>Metodologia y modelos</w:t>
-      </w:r>
-    </w:p>
-    <w:p>
-      <w:pPr>
-        <w:pStyle w:val="ListNumber"/>
-        <w:spacing w:after="80"/>
-      </w:pPr>
-      <w:r>
-        <w:t>Evaluacion y comparativa</w:t>
-      </w:r>
-    </w:p>
-    <w:p>
-      <w:pPr>
-        <w:pStyle w:val="ListNumber"/>
-        <w:spacing w:after="80"/>
-      </w:pPr>
-      <w:r>
-        <w:t>Resultados preventivos</w:t>
-      </w:r>
-    </w:p>
-    <w:p>
-      <w:pPr>
-        <w:pStyle w:val="ListNumber"/>
-        <w:spacing w:after="80"/>
-      </w:pPr>
-      <w:r>
-        <w:t>Limitaciones</w:t>
-      </w:r>
-    </w:p>
-    <w:p>
-      <w:pPr>
-        <w:pStyle w:val="ListNumber"/>
-        <w:spacing w:after="80"/>
-      </w:pPr>
-      <w:r>
-        <w:t>Conclusiones</w:t>
-      </w:r>
-    </w:p>
-    <w:p>
-      <w:pPr>
-        <w:pStyle w:val="ListNumber"/>
-        <w:spacing w:after="80"/>
-      </w:pPr>
-      <w:r>
-        <w:t>Referencias y anexos</w:t>
-      </w:r>
-    </w:p>
-    <w:p>
-      <w:r>
-        <w:br w:type="page"/>
-      </w:r>
-    </w:p>
-    <w:p>
-      <w:pPr>
-        <w:pStyle w:val="Heading1"/>
-        <w:spacing w:before="240" w:after="160"/>
       </w:pPr>
       <w:r>
         <w:t>Resumen ejecutivo</w:t>
       </w:r>
     </w:p>
     <w:p>
-      <w:pPr>
-        <w:spacing w:after="140" w:line="276" w:lineRule="auto"/>
-        <w:ind w:firstLine="360"/>
-      </w:pPr>
       <w:r>
-        <w:t>Este proyecto estudia los accidentes de transito registrados en Sonora durante los ultimos diez a?os disponibles en la base ATUS. El proposito principal fue identificar patrones regionales de frecuencia, gravedad y causas probables para proponer acciones preventivas mas enfocadas. El enfoque no fue buscar culpables individuales, sino entender el comportamiento general de los datos y traducirlo en informacion util para la seguridad vial.</w:t>
+        <w:t>Este proyecto estudia los accidentes de transito registrados en Sonora durante los ultimos diez anos disponibles en la base ATUS. El proposito principal fue identificar patrones regionales de frecuencia, gravedad y causas probables para proponer acciones preventivas mas enfocadas. El enfoque no fue buscar culpables individuales, sino entender el comportamiento general de los datos y traducirlo en informacion util para la seguridad vial.</w:t>
       </w:r>
     </w:p>
     <w:p>
-      <w:pPr>
-        <w:spacing w:after="140" w:line="276" w:lineRule="auto"/>
-        <w:ind w:firstLine="360"/>
-      </w:pPr>
       <w:r>
-        <w:t>El analisis partio de registros anuales de accidentes en zonas urbanas y suburbanas. Despues de filtrar Sonora y eliminar registros marcados como `Certificado cero`, se trabajo con 183,911 accidentes reales. Se construyeron variables derivadas como region, total de heridos, total de fallecidos, total de victimas, participacion de motocicleta o bicicleta, rango de hora y una variable binaria de gravedad.</w:t>
+        <w:t>El analisis partio de registros anuales de accidentes en zonas urbanas y suburbanas. Despues de filtrar Sonora y eliminar registros marcados como Certificado cero, se trabajo con 183,911 accidentes reales. Se construyeron variables derivadas como region, total de heridos, total de fallecidos, total de victimas, participacion de motocicleta o bicicleta, rango de hora y una variable binaria de gravedad.</w:t>
       </w:r>
     </w:p>
     <w:p>
-      <w:pPr>
-        <w:spacing w:after="140" w:line="276" w:lineRule="auto"/>
-        <w:ind w:firstLine="360"/>
-      </w:pPr>
       <w:r>
         <w:t>La exploracion mostro que Hermosillo concentra el mayor numero de accidentes, seguido por Sur y Valle y Frontera. Sin embargo, las regiones con mayor porcentaje de accidentes graves fueron Sierra, Centro y Sur y Valle. Esta diferencia fue una de las partes mas importantes del proyecto, porque demuestra que el volumen de accidentes y la gravedad no siempre apuntan a los mismos lugares.</w:t>
       </w:r>
     </w:p>
     <w:p>
-      <w:pPr>
-        <w:spacing w:after="140" w:line="276" w:lineRule="auto"/>
-        <w:ind w:firstLine="360"/>
-      </w:pPr>
       <w:r>
         <w:t>En modelado se implementaron varios enfoques. Primero, un Arbol de Decision como linea base. Despues, una Regresion Logistica como modelo interpretable y un Random Forest ajustado como modelo mas elaborado. Tambien se uso clustering jerarquico para agrupar municipios con comportamientos parecidos y reglas de asociacion para encontrar combinaciones frecuentes relacionadas con accidentes graves.</w:t>
       </w:r>
     </w:p>
     <w:p>
-      <w:pPr>
-        <w:spacing w:after="140" w:line="276" w:lineRule="auto"/>
-        <w:ind w:firstLine="360"/>
-      </w:pPr>
       <w:r>
-        <w:t>La recomendacion principal fue usar el Random Forest ajustado como modelo de clasificacion cuando se busca el mejor equilibrio entre precision y recall para accidentes graves. La Regresion Logistica se conserva como alternativa cuando se necesita una explicacion mas sencilla. El clustering y las reglas de asociacion complementan el analisis porque ayudan a traducir los resultados en acciones preventivas por region o tipo de municipio.</w:t>
+        <w:t>La recomendacion principal fue usar el Random Forest ajustado como modelo de clasificacion cuando se busca el mejor equilibrio entre precision y recall para accidentes graves. Este informe queda alineado con el cuaderno principal notebooks/atus_sonora_10_anios_prevencion.ipynb y con el entregable E3 actualizado. La Regresion Logistica se conserva como alternativa cuando se necesita una explicacion mas sencilla. El clustering y las reglas de asociacion complementan el analisis porque ayudan a traducir los resultados en acciones preventivas por region o tipo de municipio.</w:t>
       </w:r>
     </w:p>
     <w:p>
       <w:pPr>
         <w:pStyle w:val="Heading1"/>
-        <w:spacing w:before="240" w:after="160"/>
       </w:pPr>
       <w:r>
         <w:t>1. Introduccion y contexto del problema</w:t>
       </w:r>
     </w:p>
     <w:p>
-      <w:pPr>
-        <w:spacing w:after="140" w:line="276" w:lineRule="auto"/>
-        <w:ind w:firstLine="360"/>
-      </w:pPr>
       <w:r>
         <w:t>Los accidentes de transito son una problematica social porque afectan directamente la seguridad de conductores, pasajeros, peatones, ciclistas, motociclistas y familias. Ademas de los danos materiales, los accidentes pueden provocar lesiones, muertes, costos economicos, interrupciones en la movilidad y presion sobre servicios de emergencia.</w:t>
       </w:r>
     </w:p>
     <w:p>
-      <w:pPr>
-        <w:spacing w:after="140" w:line="276" w:lineRule="auto"/>
-        <w:ind w:firstLine="360"/>
-      </w:pPr>
       <w:r>
         <w:t>En Sonora, el comportamiento de los accidentes no es igual en todos los municipios. La capital, las ciudades fronterizas, las zonas costeras, los municipios del sur y las localidades serranas tienen condiciones de movilidad diferentes. Por eso, analizar solamente el total estatal puede ocultar patrones importantes.</w:t>
       </w:r>
     </w:p>
     <w:p>
-      <w:pPr>
-        <w:spacing w:after="140" w:line="276" w:lineRule="auto"/>
-        <w:ind w:firstLine="360"/>
-      </w:pPr>
       <w:r>
         <w:t>El proyecto se planteo desde un enfoque preventivo e interpretativo. La pregunta principal fue: que patrones presentan los accidentes de transito en las diferentes regiones de Sonora y cuales son las causas mas frecuentes que pueden ayudar a proponer estrategias de prevencion vial.</w:t>
       </w:r>
     </w:p>
     <w:p>
-      <w:pPr>
-        <w:spacing w:after="140" w:line="276" w:lineRule="auto"/>
-        <w:ind w:firstLine="360"/>
-      </w:pPr>
       <w:r>
         <w:t>Para responder esta pregunta, se trabajo con datos reales y publicos del INEGI. El uso de una fuente oficial permite que el analisis sea reproducible y que las conclusiones se basen en evidencia. La idea fue avanzar desde la comprension del problema hasta el modelado, sin perder de vista que el resultado final debe servir para interpretar y prevenir.</w:t>
       </w:r>
     </w:p>
     <w:p>
-      <w:r>
-        <w:br w:type="page"/>
-      </w:r>
-    </w:p>
-    <w:p>
-      <w:r>
-        <w:br w:type="page"/>
-      </w:r>
-    </w:p>
-    <w:p>
       <w:pPr>
         <w:pStyle w:val="Heading1"/>
-        <w:spacing w:before="240" w:after="160"/>
       </w:pPr>
       <w:r>
         <w:t>2. Descripcion del dataset</w:t>
       </w:r>
     </w:p>
     <w:p>
-      <w:pPr>
-        <w:spacing w:after="140" w:line="276" w:lineRule="auto"/>
-        <w:ind w:firstLine="360"/>
-      </w:pPr>
       <w:r>
         <w:t>La base utilizada fue Accidentes de Transito Terrestre en Zonas Urbanas y Suburbanas (ATUS), publicada por el Instituto Nacional de Estadistica y Geografia. Se trabajaron los archivos anuales de 2015 a 2024, lo que permite observar una decada completa de comportamiento.</w:t>
       </w:r>
     </w:p>
     <w:p>
-      <w:pPr>
-        <w:spacing w:after="140" w:line="276" w:lineRule="auto"/>
-        <w:ind w:firstLine="360"/>
-      </w:pPr>
       <w:r>
         <w:t>Los datos originales incluyen accidentes de todo Mexico. Para este proyecto se filtro solamente el estado de Sonora, identificado con la clave de entidad 26. Tambien se uso el catalogo municipal para agregar el nombre del municipio a partir de la clave de entidad y municipio.</w:t>
       </w:r>
@@ -504,24 +177,23 @@
         <w:tblLook w:firstColumn="1" w:firstRow="1" w:lastColumn="0" w:lastRow="0" w:noHBand="0" w:noVBand="1" w:val="04A0"/>
       </w:tblPr>
       <w:tblGrid>
-        <w:gridCol w:w="4896"/>
-        <w:gridCol w:w="4896"/>
+        <w:gridCol w:w="4968"/>
+        <w:gridCol w:w="4968"/>
       </w:tblGrid>
       <w:tr>
         <w:tc>
           <w:tcPr>
-            <w:tcW w:type="dxa" w:w="4896"/>
+            <w:tcW w:type="dxa" w:w="4968"/>
             <w:vAlign w:val="center"/>
-            <w:shd w:fill="D9EAF7"/>
+            <w:shd w:fill="207E76"/>
           </w:tcPr>
           <w:p>
-            <w:pPr>
-              <w:spacing w:after="40"/>
-            </w:pPr>
             <w:r/>
             <w:r>
               <w:rPr>
                 <w:b/>
+                <w:color w:val="FFFFFF"/>
+                <w:sz w:val="18"/>
               </w:rPr>
               <w:t>Elemento</w:t>
             </w:r>
@@ -529,18 +201,17 @@
         </w:tc>
         <w:tc>
           <w:tcPr>
-            <w:tcW w:type="dxa" w:w="4896"/>
+            <w:tcW w:type="dxa" w:w="4968"/>
             <w:vAlign w:val="center"/>
-            <w:shd w:fill="D9EAF7"/>
+            <w:shd w:fill="207E76"/>
           </w:tcPr>
           <w:p>
-            <w:pPr>
-              <w:spacing w:after="40"/>
-            </w:pPr>
             <w:r/>
             <w:r>
               <w:rPr>
                 <w:b/>
+                <w:color w:val="FFFFFF"/>
+                <w:sz w:val="18"/>
               </w:rPr>
               <w:t>Resultado</w:t>
             </w:r>
@@ -550,17 +221,15 @@
       <w:tr>
         <w:tc>
           <w:tcPr>
-            <w:tcW w:type="dxa" w:w="4896"/>
+            <w:tcW w:type="dxa" w:w="4968"/>
             <w:vAlign w:val="center"/>
           </w:tcPr>
           <w:p>
-            <w:pPr>
-              <w:spacing w:after="40"/>
-            </w:pPr>
             <w:r/>
             <w:r>
               <w:rPr>
                 <w:b w:val="0"/>
+                <w:sz w:val="18"/>
               </w:rPr>
               <w:t>Periodo cubierto</w:t>
             </w:r>
@@ -568,17 +237,15 @@
         </w:tc>
         <w:tc>
           <w:tcPr>
-            <w:tcW w:type="dxa" w:w="4896"/>
+            <w:tcW w:type="dxa" w:w="4968"/>
             <w:vAlign w:val="center"/>
           </w:tcPr>
           <w:p>
-            <w:pPr>
-              <w:spacing w:after="40"/>
-            </w:pPr>
             <w:r/>
             <w:r>
               <w:rPr>
                 <w:b w:val="0"/>
+                <w:sz w:val="18"/>
               </w:rPr>
               <w:t>2015-2024</w:t>
             </w:r>
@@ -588,17 +255,15 @@
       <w:tr>
         <w:tc>
           <w:tcPr>
-            <w:tcW w:type="dxa" w:w="4896"/>
+            <w:tcW w:type="dxa" w:w="4968"/>
             <w:vAlign w:val="center"/>
           </w:tcPr>
           <w:p>
-            <w:pPr>
-              <w:spacing w:after="40"/>
-            </w:pPr>
             <w:r/>
             <w:r>
               <w:rPr>
                 <w:b w:val="0"/>
+                <w:sz w:val="18"/>
               </w:rPr>
               <w:t>Registros de Sonora antes de depurar</w:t>
             </w:r>
@@ -606,17 +271,15 @@
         </w:tc>
         <w:tc>
           <w:tcPr>
-            <w:tcW w:type="dxa" w:w="4896"/>
+            <w:tcW w:type="dxa" w:w="4968"/>
             <w:vAlign w:val="center"/>
           </w:tcPr>
           <w:p>
-            <w:pPr>
-              <w:spacing w:after="40"/>
-            </w:pPr>
             <w:r/>
             <w:r>
               <w:rPr>
                 <w:b w:val="0"/>
+                <w:sz w:val="18"/>
               </w:rPr>
               <w:t>187,104</w:t>
             </w:r>
@@ -626,35 +289,31 @@
       <w:tr>
         <w:tc>
           <w:tcPr>
-            <w:tcW w:type="dxa" w:w="4896"/>
+            <w:tcW w:type="dxa" w:w="4968"/>
             <w:vAlign w:val="center"/>
           </w:tcPr>
           <w:p>
-            <w:pPr>
-              <w:spacing w:after="40"/>
-            </w:pPr>
             <w:r/>
             <w:r>
               <w:rPr>
                 <w:b w:val="0"/>
+                <w:sz w:val="18"/>
               </w:rPr>
-              <w:t>Registros `Certificado cero` eliminados</w:t>
+              <w:t>Registros Certificado cero eliminados</w:t>
             </w:r>
           </w:p>
         </w:tc>
         <w:tc>
           <w:tcPr>
-            <w:tcW w:type="dxa" w:w="4896"/>
+            <w:tcW w:type="dxa" w:w="4968"/>
             <w:vAlign w:val="center"/>
           </w:tcPr>
           <w:p>
-            <w:pPr>
-              <w:spacing w:after="40"/>
-            </w:pPr>
             <w:r/>
             <w:r>
               <w:rPr>
                 <w:b w:val="0"/>
+                <w:sz w:val="18"/>
               </w:rPr>
               <w:t>3,193</w:t>
             </w:r>
@@ -664,17 +323,15 @@
       <w:tr>
         <w:tc>
           <w:tcPr>
-            <w:tcW w:type="dxa" w:w="4896"/>
+            <w:tcW w:type="dxa" w:w="4968"/>
             <w:vAlign w:val="center"/>
           </w:tcPr>
           <w:p>
-            <w:pPr>
-              <w:spacing w:after="40"/>
-            </w:pPr>
             <w:r/>
             <w:r>
               <w:rPr>
                 <w:b w:val="0"/>
+                <w:sz w:val="18"/>
               </w:rPr>
               <w:t>Accidentes reales analizados</w:t>
             </w:r>
@@ -682,17 +339,15 @@
         </w:tc>
         <w:tc>
           <w:tcPr>
-            <w:tcW w:type="dxa" w:w="4896"/>
+            <w:tcW w:type="dxa" w:w="4968"/>
             <w:vAlign w:val="center"/>
           </w:tcPr>
           <w:p>
-            <w:pPr>
-              <w:spacing w:after="40"/>
-            </w:pPr>
             <w:r/>
             <w:r>
               <w:rPr>
                 <w:b w:val="0"/>
+                <w:sz w:val="18"/>
               </w:rPr>
               <w:t>183,911</w:t>
             </w:r>
@@ -702,17 +357,15 @@
       <w:tr>
         <w:tc>
           <w:tcPr>
-            <w:tcW w:type="dxa" w:w="4896"/>
+            <w:tcW w:type="dxa" w:w="4968"/>
             <w:vAlign w:val="center"/>
           </w:tcPr>
           <w:p>
-            <w:pPr>
-              <w:spacing w:after="40"/>
-            </w:pPr>
             <w:r/>
             <w:r>
               <w:rPr>
                 <w:b w:val="0"/>
+                <w:sz w:val="18"/>
               </w:rPr>
               <w:t>Municipios presentes</w:t>
             </w:r>
@@ -720,17 +373,15 @@
         </w:tc>
         <w:tc>
           <w:tcPr>
-            <w:tcW w:type="dxa" w:w="4896"/>
+            <w:tcW w:type="dxa" w:w="4968"/>
             <w:vAlign w:val="center"/>
           </w:tcPr>
           <w:p>
-            <w:pPr>
-              <w:spacing w:after="40"/>
-            </w:pPr>
             <w:r/>
             <w:r>
               <w:rPr>
                 <w:b w:val="0"/>
+                <w:sz w:val="18"/>
               </w:rPr>
               <w:t>70</w:t>
             </w:r>
@@ -740,17 +391,15 @@
       <w:tr>
         <w:tc>
           <w:tcPr>
-            <w:tcW w:type="dxa" w:w="4896"/>
+            <w:tcW w:type="dxa" w:w="4968"/>
             <w:vAlign w:val="center"/>
           </w:tcPr>
           <w:p>
-            <w:pPr>
-              <w:spacing w:after="40"/>
-            </w:pPr>
             <w:r/>
             <w:r>
               <w:rPr>
                 <w:b w:val="0"/>
+                <w:sz w:val="18"/>
               </w:rPr>
               <w:t>Porcentaje de accidentes graves</w:t>
             </w:r>
@@ -758,17 +407,15 @@
         </w:tc>
         <w:tc>
           <w:tcPr>
-            <w:tcW w:type="dxa" w:w="4896"/>
+            <w:tcW w:type="dxa" w:w="4968"/>
             <w:vAlign w:val="center"/>
           </w:tcPr>
           <w:p>
-            <w:pPr>
-              <w:spacing w:after="40"/>
-            </w:pPr>
             <w:r/>
             <w:r>
               <w:rPr>
                 <w:b w:val="0"/>
+                <w:sz w:val="18"/>
               </w:rPr>
               <w:t>16.99%</w:t>
             </w:r>
@@ -778,223 +425,122 @@
     </w:tbl>
     <w:p/>
     <w:p>
-      <w:pPr>
-        <w:spacing w:after="140" w:line="276" w:lineRule="auto"/>
-        <w:ind w:firstLine="360"/>
-      </w:pPr>
       <w:r>
-        <w:t>Las variables disponibles incluyen informacion geografica, temporal, categorica y numerica. Entre las variables mas importantes estan municipio, a?o, mes, dia de semana, hora, tipo de accidente, causa probable, tipo de vehiculos involucrados, personas heridas y personas fallecidas.</w:t>
-      </w:r>
-    </w:p>
-    <w:p>
-      <w:pPr>
-        <w:spacing w:after="140" w:line="276" w:lineRule="auto"/>
-        <w:ind w:firstLine="360"/>
-      </w:pPr>
-      <w:r>
-        <w:t>Para facilitar el analisis se crearon variables derivadas. La variable `REGION` permite comparar zonas de Sonora. `TOTAL_HERIDOS`, `TOTAL_MUERTOS` y `TOTAL_VICTIMAS` resumen el impacto humano del accidente. `GRAVE_BIN` clasifica si el accidente tuvo victimas. `RANGO_HORA` agrupa la hora del accidente en madrugada, manana, tarde y noche. `INVOLUCRA_MOTO` e `INVOLUCRA_BICI` indican si participaron motocicletas o bicicletas.</w:t>
+        <w:t>Las variables disponibles incluyen informacion geografica, temporal, categorica y numerica. Entre las variables mas importantes estan municipio, ano, mes, dia de semana, hora, tipo de accidente, causa probable, tipo de vehiculos involucrados, personas heridas y personas fallecidas.</w:t>
       </w:r>
     </w:p>
     <w:p>
       <w:r>
-        <w:br w:type="page"/>
+        <w:t>Para facilitar el analisis se crearon variables derivadas. La variable REGION permite comparar zonas de Sonora. TOTAL_HERIDOS, TOTAL_MUERTOS y TOTAL_VICTIMAS resumen el impacto humano del accidente. GRAVE_BIN clasifica si el accidente tuvo victimas. RANGO_HORA agrupa la hora del accidente en madrugada, manana, tarde y noche. INVOLUCRA_MOTO e INVOLUCRA_BICI indican si participaron motocicletas o bicicletas.</w:t>
       </w:r>
     </w:p>
     <w:p>
       <w:pPr>
         <w:pStyle w:val="Heading1"/>
-        <w:spacing w:before="240" w:after="160"/>
       </w:pPr>
       <w:r>
         <w:t>3. Preparacion y calidad de datos</w:t>
       </w:r>
     </w:p>
     <w:p>
-      <w:pPr>
-        <w:spacing w:after="140" w:line="276" w:lineRule="auto"/>
-        <w:ind w:firstLine="360"/>
-      </w:pPr>
       <w:r>
-        <w:t>La preparacion inicio con la lectura de los CSV anuales. Para que el proyecto fuera reproducible, los notebooks se configuraron para cargar los archivos desde GitHub o desde una copia local. Despues se filtro Sonora y se eliminaron registros de `Certificado cero`, porque esos registros indican ausencia de accidente y no representan eventos viales ocurridos.</w:t>
+        <w:t>La preparacion inicio con la lectura de los CSV anuales. Para que el proyecto fuera reproducible, los notebooks se configuraron para cargar los archivos desde GitHub o desde una copia local. Despues se filtro Sonora y se eliminaron registros de Certificado cero, porque esos registros indican ausencia de accidente y no representan eventos viales ocurridos.</w:t>
       </w:r>
     </w:p>
     <w:p>
-      <w:pPr>
-        <w:spacing w:after="140" w:line="276" w:lineRule="auto"/>
-        <w:ind w:firstLine="360"/>
-      </w:pPr>
       <w:r>
         <w:t>Tambien se convirtieron variables numericas que venian como texto. Esto fue necesario para sumar heridos, fallecidos y vehiculos involucrados. Las claves de entidad y municipio se normalizaron con ceros a la izquierda para unir correctamente con el catalogo municipal.</w:t>
       </w:r>
     </w:p>
     <w:p>
-      <w:pPr>
-        <w:spacing w:after="140" w:line="276" w:lineRule="auto"/>
-        <w:ind w:firstLine="360"/>
-      </w:pPr>
       <w:r>
         <w:t>En calidad de datos se detectaron valores faltantes principalmente en la edad del conductor. Esta variable se conservo, pero en los modelos se trato con imputacion de mediana. En variables categoricas se uso imputacion por moda. Esta decision permite no perder registros y mantiene el dataset completo para el modelado.</w:t>
       </w:r>
     </w:p>
     <w:p>
-      <w:pPr>
-        <w:spacing w:after="140" w:line="276" w:lineRule="auto"/>
-        <w:ind w:firstLine="360"/>
-      </w:pPr>
       <w:r>
         <w:t>Se identificaron 274 duplicados exactos. Debido al tamano del dataset, su presencia no cambia de forma importante el analisis exploratorio, pero se documentaron como parte de la calidad de datos. Para modelado final, se recomienda eliminarlos si el objetivo es entrenar modelos de produccion.</w:t>
       </w:r>
     </w:p>
     <w:p>
-      <w:pPr>
-        <w:spacing w:after="140" w:line="276" w:lineRule="auto"/>
-        <w:ind w:firstLine="360"/>
-      </w:pPr>
       <w:r>
         <w:t>Los outliers se conservaron. En este problema, los valores extremos no son ruido automaticamente: un accidente con muchos heridos, fallecidos o vehiculos involucrados puede ser justamente el caso que mas interesa prevenir. Eliminar esos registros hubiera reducido la capacidad del analisis para estudiar la gravedad.</w:t>
       </w:r>
     </w:p>
     <w:p>
-      <w:r>
-        <w:br w:type="page"/>
-      </w:r>
-    </w:p>
-    <w:p>
       <w:pPr>
         <w:pStyle w:val="Heading1"/>
-        <w:spacing w:before="240" w:after="160"/>
       </w:pPr>
       <w:r>
         <w:t>4. Analisis exploratorio</w:t>
       </w:r>
     </w:p>
     <w:p>
-      <w:pPr>
-        <w:spacing w:after="140" w:line="276" w:lineRule="auto"/>
-        <w:ind w:firstLine="360"/>
-      </w:pPr>
       <w:r>
-        <w:t>El analisis exploratorio permitio conocer el comportamiento general antes de aplicar modelos. El primer hallazgo fue temporal: los accidentes aumentaron de manera gradual hasta 2019, bajaron en 2020 y subieron con fuerza despues de ese a?o. El valor mas alto se observo en 2023, con 26,557 accidentes.</w:t>
+        <w:t>El analisis exploratorio permitio conocer el comportamiento general antes de aplicar modelos. El primer hallazgo fue temporal: los accidentes aumentaron de manera gradual hasta 2019, bajaron en 2020 y subieron con fuerza despues de ese ano. El valor mas alto se observo en 2023, con 26,557 accidentes.</w:t>
       </w:r>
     </w:p>
     <w:p>
-      <w:pPr>
-        <w:spacing w:after="140" w:line="276" w:lineRule="auto"/>
-        <w:ind w:firstLine="360"/>
-      </w:pPr>
       <w:r>
         <w:t>Por region, Hermosillo concentro 65,252 accidentes, seguido por Sur y Valle con 54,154 y Frontera con 44,264. Este resultado era esperado porque son zonas con mayor movilidad urbana, actividad economica o flujo vehicular. Sin embargo, la gravedad conto una historia diferente.</w:t>
       </w:r>
     </w:p>
     <w:p>
-      <w:pPr>
-        <w:spacing w:after="140" w:line="276" w:lineRule="auto"/>
-        <w:ind w:firstLine="360"/>
-      </w:pPr>
       <w:r>
         <w:t>Cuando se reviso el porcentaje de accidentes graves, la Sierra tuvo 24.25%, Centro 22.38% y Sur y Valle 21.12%. Hermosillo, aunque tiene el mayor volumen de accidentes, tuvo 13.39% de accidentes graves. Esto muestra que la prevencion debe mirar tanto cantidad como severidad.</w:t>
       </w:r>
     </w:p>
     <w:p>
-      <w:pPr>
-        <w:spacing w:after="140" w:line="276" w:lineRule="auto"/>
-        <w:ind w:firstLine="360"/>
-      </w:pPr>
       <w:r>
         <w:t>El tipo de accidente mas frecuente fue la colision con vehiculo automotor, con 125,202 casos. En segundo lugar aparecio la colision con motocicleta, con 18,531 casos, y despues la colision con objeto fijo, con 17,205 casos. Estos resultados sugieren que una parte importante de la prevencion debe enfocarse en interacciones entre vehiculos, control de velocidad, distancia segura y puntos de conflicto urbano.</w:t>
       </w:r>
     </w:p>
     <w:p>
-      <w:pPr>
-        <w:spacing w:after="140" w:line="276" w:lineRule="auto"/>
-        <w:ind w:firstLine="360"/>
-      </w:pPr>
       <w:r>
-        <w:t>La causa probable mas registrada fue `Conductor`, con 178,145 accidentes. Aunque esta categoria es amplia, indica que las estrategias preventivas deben considerar conducta vial, atencion al volante, respeto a senalamientos, velocidad y educacion vial.</w:t>
+        <w:t>La causa probable mas registrada fue Conductor, con 178,145 accidentes. Aunque esta categoria es amplia, indica que las estrategias preventivas deben considerar conducta vial, atencion al volante, respeto a senalamientos, velocidad y educacion vial.</w:t>
       </w:r>
     </w:p>
     <w:p>
-      <w:pPr>
-        <w:spacing w:after="140" w:line="276" w:lineRule="auto"/>
-        <w:ind w:firstLine="360"/>
-      </w:pPr>
       <w:r>
         <w:t>El analisis por hora y dia mostro una concentracion relevante los viernes por la tarde, con 10,802 accidentes. Este patron puede relacionarse con salida laboral, movilidad comercial y traslados de fin de semana. A nivel preventivo, este resultado sugiere reforzar vigilancia, campanas y control operativo en horarios especificos.</w:t>
       </w:r>
     </w:p>
     <w:p>
-      <w:r>
-        <w:br w:type="page"/>
-      </w:r>
-    </w:p>
-    <w:p>
-      <w:r>
-        <w:br w:type="page"/>
-      </w:r>
-    </w:p>
-    <w:p>
       <w:pPr>
         <w:pStyle w:val="Heading1"/>
-        <w:spacing w:before="240" w:after="160"/>
       </w:pPr>
       <w:r>
         <w:t>5. Metodologia de modelado</w:t>
       </w:r>
     </w:p>
     <w:p>
-      <w:pPr>
-        <w:spacing w:after="140" w:line="276" w:lineRule="auto"/>
-        <w:ind w:firstLine="360"/>
-      </w:pPr>
       <w:r>
         <w:t>La etapa de modelado se diseno para cubrir tres necesidades: tener una linea base simple, construir un modelo mas fuerte de clasificacion y agregar un metodo diferente para entender la estructura del dataset.</w:t>
       </w:r>
     </w:p>
     <w:p>
-      <w:pPr>
-        <w:spacing w:after="140" w:line="276" w:lineRule="auto"/>
-        <w:ind w:firstLine="360"/>
-      </w:pPr>
       <w:r>
-        <w:t>La variable objetivo fue `GRAVE_BIN`. Esta variable vale 1 si el accidente tuvo personas heridas o fallecidas, y 0 si no tuvo victimas. Se eligio esta definicion porque el enfoque del proyecto es preventivo: interesa distinguir los accidentes que generan mayor impacto humano.</w:t>
+        <w:t>La variable objetivo fue GRAVE_BIN. Esta variable vale 1 si el accidente tuvo personas heridas o fallecidas, y 0 si no tuvo victimas. Se eligio esta definicion porque el enfoque del proyecto es preventivo: interesa distinguir los accidentes que generan mayor impacto humano.</w:t>
       </w:r>
     </w:p>
     <w:p>
-      <w:pPr>
-        <w:spacing w:after="140" w:line="276" w:lineRule="auto"/>
-        <w:ind w:firstLine="360"/>
-      </w:pPr>
       <w:r>
-        <w:t>Para evitar fuga de informacion, no se usaron como predictores las columnas `TOTAL_HERIDOS`, `TOTAL_MUERTOS`, `TOTAL_VICTIMAS` ni `CLASACC`, porque estan directamente relacionadas con la definicion de gravedad. Si se usaran, el modelo recibiria parte de la respuesta de forma indirecta.</w:t>
+        <w:t>Para evitar fuga de informacion, no se usaron como predictores las columnas TOTAL_HERIDOS, TOTAL_MUERTOS, TOTAL_VICTIMAS ni CLASACC, porque estan directamente relacionadas con la definicion de gravedad. Si se usaran, el modelo recibiria parte de la respuesta de forma indirecta.</w:t>
       </w:r>
     </w:p>
     <w:p>
-      <w:pPr>
-        <w:spacing w:after="140" w:line="276" w:lineRule="auto"/>
-        <w:ind w:firstLine="360"/>
-      </w:pPr>
       <w:r>
         <w:t>Las variables predictoras incluyeron region, municipio, mes, dia de semana, rango de hora, tipo de accidente, causa probable, tipo de camino o superficie, sexo, aliento, cinturon, edad del conductor, total de vehiculos, participacion de motocicleta y participacion de bicicleta.</w:t>
       </w:r>
     </w:p>
     <w:p>
-      <w:pPr>
-        <w:spacing w:after="140" w:line="276" w:lineRule="auto"/>
-        <w:ind w:firstLine="360"/>
-      </w:pPr>
       <w:r>
         <w:t>Para el preprocesamiento se uso imputacion de faltantes, codificacion One-Hot para variables categoricas y normalizacion para variables numericas. Despues se dividieron los datos en entrenamiento y prueba con estratificacion, para mantener una proporcion parecida de accidentes graves y no graves.</w:t>
       </w:r>
     </w:p>
     <w:p>
-      <w:r>
-        <w:br w:type="page"/>
-      </w:r>
-    </w:p>
-    <w:p>
       <w:pPr>
         <w:pStyle w:val="Heading1"/>
-        <w:spacing w:before="240" w:after="160"/>
       </w:pPr>
       <w:r>
         <w:t>6. Modelos implementados</w:t>
@@ -1008,25 +554,24 @@
         <w:tblLook w:firstColumn="1" w:firstRow="1" w:lastColumn="0" w:lastRow="0" w:noHBand="0" w:noVBand="1" w:val="04A0"/>
       </w:tblPr>
       <w:tblGrid>
-        <w:gridCol w:w="3264"/>
-        <w:gridCol w:w="3264"/>
-        <w:gridCol w:w="3264"/>
+        <w:gridCol w:w="3312"/>
+        <w:gridCol w:w="3312"/>
+        <w:gridCol w:w="3312"/>
       </w:tblGrid>
       <w:tr>
         <w:tc>
           <w:tcPr>
-            <w:tcW w:type="dxa" w:w="3264"/>
+            <w:tcW w:type="dxa" w:w="3312"/>
             <w:vAlign w:val="center"/>
-            <w:shd w:fill="D9EAF7"/>
+            <w:shd w:fill="207E76"/>
           </w:tcPr>
           <w:p>
-            <w:pPr>
-              <w:spacing w:after="40"/>
-            </w:pPr>
             <w:r/>
             <w:r>
               <w:rPr>
                 <w:b/>
+                <w:color w:val="FFFFFF"/>
+                <w:sz w:val="18"/>
               </w:rPr>
               <w:t>Modelo</w:t>
             </w:r>
@@ -1034,18 +579,17 @@
         </w:tc>
         <w:tc>
           <w:tcPr>
-            <w:tcW w:type="dxa" w:w="3264"/>
+            <w:tcW w:type="dxa" w:w="3312"/>
             <w:vAlign w:val="center"/>
-            <w:shd w:fill="D9EAF7"/>
+            <w:shd w:fill="207E76"/>
           </w:tcPr>
           <w:p>
-            <w:pPr>
-              <w:spacing w:after="40"/>
-            </w:pPr>
             <w:r/>
             <w:r>
               <w:rPr>
                 <w:b/>
+                <w:color w:val="FFFFFF"/>
+                <w:sz w:val="18"/>
               </w:rPr>
               <w:t>Tipo</w:t>
             </w:r>
@@ -1053,18 +597,17 @@
         </w:tc>
         <w:tc>
           <w:tcPr>
-            <w:tcW w:type="dxa" w:w="3264"/>
+            <w:tcW w:type="dxa" w:w="3312"/>
             <w:vAlign w:val="center"/>
-            <w:shd w:fill="D9EAF7"/>
+            <w:shd w:fill="207E76"/>
           </w:tcPr>
           <w:p>
-            <w:pPr>
-              <w:spacing w:after="40"/>
-            </w:pPr>
             <w:r/>
             <w:r>
               <w:rPr>
                 <w:b/>
+                <w:color w:val="FFFFFF"/>
+                <w:sz w:val="18"/>
               </w:rPr>
               <w:t>Funcion dentro del proyecto</w:t>
             </w:r>
@@ -1074,17 +617,15 @@
       <w:tr>
         <w:tc>
           <w:tcPr>
-            <w:tcW w:type="dxa" w:w="3264"/>
+            <w:tcW w:type="dxa" w:w="3312"/>
             <w:vAlign w:val="center"/>
           </w:tcPr>
           <w:p>
-            <w:pPr>
-              <w:spacing w:after="40"/>
-            </w:pPr>
             <w:r/>
             <w:r>
               <w:rPr>
                 <w:b w:val="0"/>
+                <w:sz w:val="18"/>
               </w:rPr>
               <w:t>Arbol de Decision base</w:t>
             </w:r>
@@ -1092,17 +633,15 @@
         </w:tc>
         <w:tc>
           <w:tcPr>
-            <w:tcW w:type="dxa" w:w="3264"/>
+            <w:tcW w:type="dxa" w:w="3312"/>
             <w:vAlign w:val="center"/>
           </w:tcPr>
           <w:p>
-            <w:pPr>
-              <w:spacing w:after="40"/>
-            </w:pPr>
             <w:r/>
             <w:r>
               <w:rPr>
                 <w:b w:val="0"/>
+                <w:sz w:val="18"/>
               </w:rPr>
               <w:t>Clasificacion supervisada</w:t>
             </w:r>
@@ -1110,17 +649,15 @@
         </w:tc>
         <w:tc>
           <w:tcPr>
-            <w:tcW w:type="dxa" w:w="3264"/>
+            <w:tcW w:type="dxa" w:w="3312"/>
             <w:vAlign w:val="center"/>
           </w:tcPr>
           <w:p>
-            <w:pPr>
-              <w:spacing w:after="40"/>
-            </w:pPr>
             <w:r/>
             <w:r>
               <w:rPr>
                 <w:b w:val="0"/>
+                <w:sz w:val="18"/>
               </w:rPr>
               <w:t>Sirve como linea base simple con parametros por defecto</w:t>
             </w:r>
@@ -1130,17 +667,15 @@
       <w:tr>
         <w:tc>
           <w:tcPr>
-            <w:tcW w:type="dxa" w:w="3264"/>
+            <w:tcW w:type="dxa" w:w="3312"/>
             <w:vAlign w:val="center"/>
           </w:tcPr>
           <w:p>
-            <w:pPr>
-              <w:spacing w:after="40"/>
-            </w:pPr>
             <w:r/>
             <w:r>
               <w:rPr>
                 <w:b w:val="0"/>
+                <w:sz w:val="18"/>
               </w:rPr>
               <w:t>Regresion Logistica</w:t>
             </w:r>
@@ -1148,17 +683,15 @@
         </w:tc>
         <w:tc>
           <w:tcPr>
-            <w:tcW w:type="dxa" w:w="3264"/>
+            <w:tcW w:type="dxa" w:w="3312"/>
             <w:vAlign w:val="center"/>
           </w:tcPr>
           <w:p>
-            <w:pPr>
-              <w:spacing w:after="40"/>
-            </w:pPr>
             <w:r/>
             <w:r>
               <w:rPr>
                 <w:b w:val="0"/>
+                <w:sz w:val="18"/>
               </w:rPr>
               <w:t>Clasificacion supervisada interpretable</w:t>
             </w:r>
@@ -1166,17 +699,15 @@
         </w:tc>
         <w:tc>
           <w:tcPr>
-            <w:tcW w:type="dxa" w:w="3264"/>
+            <w:tcW w:type="dxa" w:w="3312"/>
             <w:vAlign w:val="center"/>
           </w:tcPr>
           <w:p>
-            <w:pPr>
-              <w:spacing w:after="40"/>
-            </w:pPr>
             <w:r/>
             <w:r>
               <w:rPr>
                 <w:b w:val="0"/>
+                <w:sz w:val="18"/>
               </w:rPr>
               <w:t>Permite comparar con un modelo claro y facil de explicar</w:t>
             </w:r>
@@ -1186,17 +717,15 @@
       <w:tr>
         <w:tc>
           <w:tcPr>
-            <w:tcW w:type="dxa" w:w="3264"/>
+            <w:tcW w:type="dxa" w:w="3312"/>
             <w:vAlign w:val="center"/>
           </w:tcPr>
           <w:p>
-            <w:pPr>
-              <w:spacing w:after="40"/>
-            </w:pPr>
             <w:r/>
             <w:r>
               <w:rPr>
                 <w:b w:val="0"/>
+                <w:sz w:val="18"/>
               </w:rPr>
               <w:t>Random Forest ajustado</w:t>
             </w:r>
@@ -1204,17 +733,15 @@
         </w:tc>
         <w:tc>
           <w:tcPr>
-            <w:tcW w:type="dxa" w:w="3264"/>
+            <w:tcW w:type="dxa" w:w="3312"/>
             <w:vAlign w:val="center"/>
           </w:tcPr>
           <w:p>
-            <w:pPr>
-              <w:spacing w:after="40"/>
-            </w:pPr>
             <w:r/>
             <w:r>
               <w:rPr>
                 <w:b w:val="0"/>
+                <w:sz w:val="18"/>
               </w:rPr>
               <w:t>Clasificacion supervisada elaborada</w:t>
             </w:r>
@@ -1222,17 +749,15 @@
         </w:tc>
         <w:tc>
           <w:tcPr>
-            <w:tcW w:type="dxa" w:w="3264"/>
+            <w:tcW w:type="dxa" w:w="3312"/>
             <w:vAlign w:val="center"/>
           </w:tcPr>
           <w:p>
-            <w:pPr>
-              <w:spacing w:after="40"/>
-            </w:pPr>
             <w:r/>
             <w:r>
               <w:rPr>
                 <w:b w:val="0"/>
+                <w:sz w:val="18"/>
               </w:rPr>
               <w:t>Busca mejor rendimiento con ajuste de hiperparametros</w:t>
             </w:r>
@@ -1242,17 +767,15 @@
       <w:tr>
         <w:tc>
           <w:tcPr>
-            <w:tcW w:type="dxa" w:w="3264"/>
+            <w:tcW w:type="dxa" w:w="3312"/>
             <w:vAlign w:val="center"/>
           </w:tcPr>
           <w:p>
-            <w:pPr>
-              <w:spacing w:after="40"/>
-            </w:pPr>
             <w:r/>
             <w:r>
               <w:rPr>
                 <w:b w:val="0"/>
+                <w:sz w:val="18"/>
               </w:rPr>
               <w:t>Clustering jerarquico</w:t>
             </w:r>
@@ -1260,17 +783,15 @@
         </w:tc>
         <w:tc>
           <w:tcPr>
-            <w:tcW w:type="dxa" w:w="3264"/>
+            <w:tcW w:type="dxa" w:w="3312"/>
             <w:vAlign w:val="center"/>
           </w:tcPr>
           <w:p>
-            <w:pPr>
-              <w:spacing w:after="40"/>
-            </w:pPr>
             <w:r/>
             <w:r>
               <w:rPr>
                 <w:b w:val="0"/>
+                <w:sz w:val="18"/>
               </w:rPr>
               <w:t>Aprendizaje no supervisado</w:t>
             </w:r>
@@ -1278,17 +799,15 @@
         </w:tc>
         <w:tc>
           <w:tcPr>
-            <w:tcW w:type="dxa" w:w="3264"/>
+            <w:tcW w:type="dxa" w:w="3312"/>
             <w:vAlign w:val="center"/>
           </w:tcPr>
           <w:p>
-            <w:pPr>
-              <w:spacing w:after="40"/>
-            </w:pPr>
             <w:r/>
             <w:r>
               <w:rPr>
                 <w:b w:val="0"/>
+                <w:sz w:val="18"/>
               </w:rPr>
               <w:t>Agrupa municipios con patrones parecidos</w:t>
             </w:r>
@@ -1298,17 +817,15 @@
       <w:tr>
         <w:tc>
           <w:tcPr>
-            <w:tcW w:type="dxa" w:w="3264"/>
+            <w:tcW w:type="dxa" w:w="3312"/>
             <w:vAlign w:val="center"/>
           </w:tcPr>
           <w:p>
-            <w:pPr>
-              <w:spacing w:after="40"/>
-            </w:pPr>
             <w:r/>
             <w:r>
               <w:rPr>
                 <w:b w:val="0"/>
+                <w:sz w:val="18"/>
               </w:rPr>
               <w:t>Reglas de asociacion</w:t>
             </w:r>
@@ -1316,17 +833,15 @@
         </w:tc>
         <w:tc>
           <w:tcPr>
-            <w:tcW w:type="dxa" w:w="3264"/>
+            <w:tcW w:type="dxa" w:w="3312"/>
             <w:vAlign w:val="center"/>
           </w:tcPr>
           <w:p>
-            <w:pPr>
-              <w:spacing w:after="40"/>
-            </w:pPr>
             <w:r/>
             <w:r>
               <w:rPr>
                 <w:b w:val="0"/>
+                <w:sz w:val="18"/>
               </w:rPr>
               <w:t>Metodo descriptivo</w:t>
             </w:r>
@@ -1334,17 +849,15 @@
         </w:tc>
         <w:tc>
           <w:tcPr>
-            <w:tcW w:type="dxa" w:w="3264"/>
+            <w:tcW w:type="dxa" w:w="3312"/>
             <w:vAlign w:val="center"/>
           </w:tcPr>
           <w:p>
-            <w:pPr>
-              <w:spacing w:after="40"/>
-            </w:pPr>
             <w:r/>
             <w:r>
               <w:rPr>
                 <w:b w:val="0"/>
+                <w:sz w:val="18"/>
               </w:rPr>
               <w:t>Encuentra combinaciones frecuentes relacionadas con gravedad</w:t>
             </w:r>
@@ -1354,89 +867,51 @@
     </w:tbl>
     <w:p/>
     <w:p>
-      <w:pPr>
-        <w:spacing w:after="140" w:line="276" w:lineRule="auto"/>
-        <w:ind w:firstLine="360"/>
-      </w:pPr>
       <w:r>
         <w:t>El Arbol de Decision se uso como punto de partida. Es facil de entender, pero puede ser inestable y ajustarse demasiado a los datos si no se controla su profundidad. Aun asi, cumple bien la funcion de linea base.</w:t>
       </w:r>
     </w:p>
     <w:p>
-      <w:pPr>
-        <w:spacing w:after="140" w:line="276" w:lineRule="auto"/>
-        <w:ind w:firstLine="360"/>
-      </w:pPr>
       <w:r>
         <w:t>La Regresion Logistica se incluyo porque es interpretable. Aunque no siempre logra el mejor rendimiento, permite entender de forma mas clara como cambian las probabilidades segun las variables. Tambien se uso con pesos balanceados para dar mayor atencion a la clase grave.</w:t>
       </w:r>
     </w:p>
     <w:p>
-      <w:pPr>
-        <w:spacing w:after="140" w:line="276" w:lineRule="auto"/>
-        <w:ind w:firstLine="360"/>
-      </w:pPr>
       <w:r>
         <w:t>El Random Forest ajustado fue el modelo mas elaborado. Combina muchos arboles y reduce la dependencia de una sola estructura. Se ajustaron hiperparametros como numero de arboles, profundidad, minimo de muestras por hoja, seleccion de variables y pesos de clase.</w:t>
       </w:r>
     </w:p>
     <w:p>
-      <w:pPr>
-        <w:spacing w:after="140" w:line="276" w:lineRule="auto"/>
-        <w:ind w:firstLine="360"/>
-      </w:pPr>
       <w:r>
         <w:t>El clustering jerarquico se aplico a nivel municipal. En lugar de clasificar accidentes individuales, agrupa municipios segun indicadores como total de accidentes, porcentaje de gravedad, promedio de heridos, promedio de fallecidos, presencia de motocicletas, bicicletas y tipos de accidente.</w:t>
       </w:r>
     </w:p>
     <w:p>
-      <w:pPr>
-        <w:spacing w:after="140" w:line="276" w:lineRule="auto"/>
-        <w:ind w:firstLine="360"/>
-      </w:pPr>
       <w:r>
         <w:t>Las reglas de asociacion se usaron como complemento interpretativo. Este metodo ayuda a encontrar combinaciones frecuentes de condiciones que terminan en gravedad alta, por ejemplo cierto tipo de accidente o combinaciones de region, causa y horario.</w:t>
       </w:r>
     </w:p>
     <w:p>
-      <w:r>
-        <w:br w:type="page"/>
-      </w:r>
-    </w:p>
-    <w:p>
       <w:pPr>
         <w:pStyle w:val="Heading1"/>
-        <w:spacing w:before="240" w:after="160"/>
       </w:pPr>
       <w:r>
         <w:t>7. Evaluacion de modelos</w:t>
       </w:r>
     </w:p>
     <w:p>
-      <w:pPr>
-        <w:spacing w:after="140" w:line="276" w:lineRule="auto"/>
-        <w:ind w:firstLine="360"/>
-      </w:pPr>
       <w:r>
         <w:t>La evaluacion de clasificacion no se baso solamente en accuracy. En este problema, un modelo podria tener buen accuracy si clasifica bien los accidentes no graves, porque son la mayoria. Sin embargo, para seguridad vial importa especialmente la clase grave.</w:t>
       </w:r>
     </w:p>
     <w:p>
-      <w:pPr>
-        <w:spacing w:after="140" w:line="276" w:lineRule="auto"/>
-        <w:ind w:firstLine="360"/>
-      </w:pPr>
       <w:r>
         <w:t>Por eso se revisaron precision, recall, F1-score, matriz de confusion, curva ROC y ROC-AUC. La precision indica que tan confiables son las predicciones positivas de gravedad. El recall indica cuantos accidentes graves reales logra detectar el modelo. El F1-score resume el equilibrio entre precision y recall.</w:t>
       </w:r>
     </w:p>
     <w:p>
-      <w:pPr>
-        <w:spacing w:after="140" w:line="276" w:lineRule="auto"/>
-        <w:ind w:firstLine="360"/>
-      </w:pPr>
       <w:r>
-        <w:t>En una prueba de ejecucion con muestra reducida para validar el notebook, el Random Forest ajustado obtuvo el mejor F1 para la clase grave. La Regresion Logistica tuvo el mayor recall, por lo que puede ser util si la prioridad principal es detectar la mayor cantidad posible de accidentes graves, aunque produzca mas falsos positivos.</w:t>
+        <w:t>En la ejecucion documentada en E3, el Random Forest ajustado obtuvo el mejor F1 para la clase grave. La Regresion Logistica tuvo el mayor recall, por lo que puede ser util si la prioridad principal es detectar la mayor cantidad posible de accidentes graves, aunque produzca mas falsos positivos.</w:t>
       </w:r>
     </w:p>
     <w:tbl>
@@ -1447,28 +922,27 @@
         <w:tblLook w:firstColumn="1" w:firstRow="1" w:lastColumn="0" w:lastRow="0" w:noHBand="0" w:noVBand="1" w:val="04A0"/>
       </w:tblPr>
       <w:tblGrid>
-        <w:gridCol w:w="1632"/>
-        <w:gridCol w:w="1632"/>
-        <w:gridCol w:w="1632"/>
-        <w:gridCol w:w="1632"/>
-        <w:gridCol w:w="1632"/>
-        <w:gridCol w:w="1632"/>
+        <w:gridCol w:w="1656"/>
+        <w:gridCol w:w="1656"/>
+        <w:gridCol w:w="1656"/>
+        <w:gridCol w:w="1656"/>
+        <w:gridCol w:w="1656"/>
+        <w:gridCol w:w="1656"/>
       </w:tblGrid>
       <w:tr>
         <w:tc>
           <w:tcPr>
-            <w:tcW w:type="dxa" w:w="1632"/>
+            <w:tcW w:type="dxa" w:w="1656"/>
             <w:vAlign w:val="center"/>
-            <w:shd w:fill="D9EAF7"/>
+            <w:shd w:fill="207E76"/>
           </w:tcPr>
           <w:p>
-            <w:pPr>
-              <w:spacing w:after="40"/>
-            </w:pPr>
             <w:r/>
             <w:r>
               <w:rPr>
                 <w:b/>
+                <w:color w:val="FFFFFF"/>
+                <w:sz w:val="18"/>
               </w:rPr>
               <w:t>Modelo</w:t>
             </w:r>
@@ -1476,18 +950,17 @@
         </w:tc>
         <w:tc>
           <w:tcPr>
-            <w:tcW w:type="dxa" w:w="1632"/>
+            <w:tcW w:type="dxa" w:w="1656"/>
             <w:vAlign w:val="center"/>
-            <w:shd w:fill="D9EAF7"/>
+            <w:shd w:fill="207E76"/>
           </w:tcPr>
           <w:p>
-            <w:pPr>
-              <w:spacing w:after="40"/>
-            </w:pPr>
             <w:r/>
             <w:r>
               <w:rPr>
                 <w:b/>
+                <w:color w:val="FFFFFF"/>
+                <w:sz w:val="18"/>
               </w:rPr>
               <w:t>Accuracy</w:t>
             </w:r>
@@ -1495,18 +968,17 @@
         </w:tc>
         <w:tc>
           <w:tcPr>
-            <w:tcW w:type="dxa" w:w="1632"/>
+            <w:tcW w:type="dxa" w:w="1656"/>
             <w:vAlign w:val="center"/>
-            <w:shd w:fill="D9EAF7"/>
+            <w:shd w:fill="207E76"/>
           </w:tcPr>
           <w:p>
-            <w:pPr>
-              <w:spacing w:after="40"/>
-            </w:pPr>
             <w:r/>
             <w:r>
               <w:rPr>
                 <w:b/>
+                <w:color w:val="FFFFFF"/>
+                <w:sz w:val="18"/>
               </w:rPr>
               <w:t>Precision grave</w:t>
             </w:r>
@@ -1514,18 +986,17 @@
         </w:tc>
         <w:tc>
           <w:tcPr>
-            <w:tcW w:type="dxa" w:w="1632"/>
+            <w:tcW w:type="dxa" w:w="1656"/>
             <w:vAlign w:val="center"/>
-            <w:shd w:fill="D9EAF7"/>
+            <w:shd w:fill="207E76"/>
           </w:tcPr>
           <w:p>
-            <w:pPr>
-              <w:spacing w:after="40"/>
-            </w:pPr>
             <w:r/>
             <w:r>
               <w:rPr>
                 <w:b/>
+                <w:color w:val="FFFFFF"/>
+                <w:sz w:val="18"/>
               </w:rPr>
               <w:t>Recall grave</w:t>
             </w:r>
@@ -1533,18 +1004,17 @@
         </w:tc>
         <w:tc>
           <w:tcPr>
-            <w:tcW w:type="dxa" w:w="1632"/>
+            <w:tcW w:type="dxa" w:w="1656"/>
             <w:vAlign w:val="center"/>
-            <w:shd w:fill="D9EAF7"/>
+            <w:shd w:fill="207E76"/>
           </w:tcPr>
           <w:p>
-            <w:pPr>
-              <w:spacing w:after="40"/>
-            </w:pPr>
             <w:r/>
             <w:r>
               <w:rPr>
                 <w:b/>
+                <w:color w:val="FFFFFF"/>
+                <w:sz w:val="18"/>
               </w:rPr>
               <w:t>F1 grave</w:t>
             </w:r>
@@ -1552,18 +1022,17 @@
         </w:tc>
         <w:tc>
           <w:tcPr>
-            <w:tcW w:type="dxa" w:w="1632"/>
+            <w:tcW w:type="dxa" w:w="1656"/>
             <w:vAlign w:val="center"/>
-            <w:shd w:fill="D9EAF7"/>
+            <w:shd w:fill="207E76"/>
           </w:tcPr>
           <w:p>
-            <w:pPr>
-              <w:spacing w:after="40"/>
-            </w:pPr>
             <w:r/>
             <w:r>
               <w:rPr>
                 <w:b/>
+                <w:color w:val="FFFFFF"/>
+                <w:sz w:val="18"/>
               </w:rPr>
               <w:t>ROC-AUC</w:t>
             </w:r>
@@ -1573,17 +1042,15 @@
       <w:tr>
         <w:tc>
           <w:tcPr>
-            <w:tcW w:type="dxa" w:w="1632"/>
+            <w:tcW w:type="dxa" w:w="1656"/>
             <w:vAlign w:val="center"/>
           </w:tcPr>
           <w:p>
-            <w:pPr>
-              <w:spacing w:after="40"/>
-            </w:pPr>
             <w:r/>
             <w:r>
               <w:rPr>
                 <w:b w:val="0"/>
+                <w:sz w:val="18"/>
               </w:rPr>
               <w:t>Arbol de Decision base</w:t>
             </w:r>
@@ -1591,91 +1058,81 @@
         </w:tc>
         <w:tc>
           <w:tcPr>
-            <w:tcW w:type="dxa" w:w="1632"/>
+            <w:tcW w:type="dxa" w:w="1656"/>
             <w:vAlign w:val="center"/>
           </w:tcPr>
           <w:p>
-            <w:pPr>
-              <w:spacing w:after="40"/>
-            </w:pPr>
             <w:r/>
             <w:r>
               <w:rPr>
                 <w:b w:val="0"/>
+                <w:sz w:val="18"/>
               </w:rPr>
-              <w:t>0.8280</w:t>
+              <w:t>0.8466</w:t>
             </w:r>
           </w:p>
         </w:tc>
         <w:tc>
           <w:tcPr>
-            <w:tcW w:type="dxa" w:w="1632"/>
+            <w:tcW w:type="dxa" w:w="1656"/>
             <w:vAlign w:val="center"/>
           </w:tcPr>
           <w:p>
-            <w:pPr>
-              <w:spacing w:after="40"/>
-            </w:pPr>
             <w:r/>
             <w:r>
               <w:rPr>
                 <w:b w:val="0"/>
+                <w:sz w:val="18"/>
               </w:rPr>
-              <w:t>0.4928</w:t>
+              <w:t>0.5491</w:t>
             </w:r>
           </w:p>
         </w:tc>
         <w:tc>
           <w:tcPr>
-            <w:tcW w:type="dxa" w:w="1632"/>
+            <w:tcW w:type="dxa" w:w="1656"/>
             <w:vAlign w:val="center"/>
           </w:tcPr>
           <w:p>
-            <w:pPr>
-              <w:spacing w:after="40"/>
-            </w:pPr>
             <w:r/>
             <w:r>
               <w:rPr>
                 <w:b w:val="0"/>
+                <w:sz w:val="18"/>
               </w:rPr>
-              <w:t>0.5354</w:t>
+              <w:t>0.5437</w:t>
             </w:r>
           </w:p>
         </w:tc>
         <w:tc>
           <w:tcPr>
-            <w:tcW w:type="dxa" w:w="1632"/>
+            <w:tcW w:type="dxa" w:w="1656"/>
             <w:vAlign w:val="center"/>
           </w:tcPr>
           <w:p>
-            <w:pPr>
-              <w:spacing w:after="40"/>
-            </w:pPr>
             <w:r/>
             <w:r>
               <w:rPr>
                 <w:b w:val="0"/>
+                <w:sz w:val="18"/>
               </w:rPr>
-              <w:t>0.5132</w:t>
+              <w:t>0.5464</w:t>
             </w:r>
           </w:p>
         </w:tc>
         <w:tc>
           <w:tcPr>
-            <w:tcW w:type="dxa" w:w="1632"/>
+            <w:tcW w:type="dxa" w:w="1656"/>
             <w:vAlign w:val="center"/>
           </w:tcPr>
           <w:p>
-            <w:pPr>
-              <w:spacing w:after="40"/>
-            </w:pPr>
             <w:r/>
             <w:r>
               <w:rPr>
                 <w:b w:val="0"/>
+                <w:sz w:val="18"/>
               </w:rPr>
-              <w:t>0.7150</w:t>
+              <w:t>0.7260</w:t>
             </w:r>
           </w:p>
         </w:tc>
@@ -1683,17 +1140,15 @@
       <w:tr>
         <w:tc>
           <w:tcPr>
-            <w:tcW w:type="dxa" w:w="1632"/>
+            <w:tcW w:type="dxa" w:w="1656"/>
             <w:vAlign w:val="center"/>
           </w:tcPr>
           <w:p>
-            <w:pPr>
-              <w:spacing w:after="40"/>
-            </w:pPr>
             <w:r/>
             <w:r>
               <w:rPr>
                 <w:b w:val="0"/>
+                <w:sz w:val="18"/>
               </w:rPr>
               <w:t>Regresion Logistica</w:t>
             </w:r>
@@ -1701,91 +1156,81 @@
         </w:tc>
         <w:tc>
           <w:tcPr>
-            <w:tcW w:type="dxa" w:w="1632"/>
+            <w:tcW w:type="dxa" w:w="1656"/>
             <w:vAlign w:val="center"/>
           </w:tcPr>
           <w:p>
-            <w:pPr>
-              <w:spacing w:after="40"/>
-            </w:pPr>
             <w:r/>
             <w:r>
               <w:rPr>
                 <w:b w:val="0"/>
+                <w:sz w:val="18"/>
               </w:rPr>
-              <w:t>0.8200</w:t>
+              <w:t>0.8229</w:t>
             </w:r>
           </w:p>
         </w:tc>
         <w:tc>
           <w:tcPr>
-            <w:tcW w:type="dxa" w:w="1632"/>
+            <w:tcW w:type="dxa" w:w="1656"/>
             <w:vAlign w:val="center"/>
           </w:tcPr>
           <w:p>
-            <w:pPr>
-              <w:spacing w:after="40"/>
-            </w:pPr>
             <w:r/>
             <w:r>
               <w:rPr>
                 <w:b w:val="0"/>
+                <w:sz w:val="18"/>
               </w:rPr>
-              <w:t>0.4792</w:t>
+              <w:t>0.4861</w:t>
             </w:r>
           </w:p>
         </w:tc>
         <w:tc>
           <w:tcPr>
-            <w:tcW w:type="dxa" w:w="1632"/>
+            <w:tcW w:type="dxa" w:w="1656"/>
             <w:vAlign w:val="center"/>
           </w:tcPr>
           <w:p>
-            <w:pPr>
-              <w:spacing w:after="40"/>
-            </w:pPr>
             <w:r/>
             <w:r>
               <w:rPr>
                 <w:b w:val="0"/>
+                <w:sz w:val="18"/>
               </w:rPr>
-              <w:t>0.7244</w:t>
+              <w:t>0.7387</w:t>
             </w:r>
           </w:p>
         </w:tc>
         <w:tc>
           <w:tcPr>
-            <w:tcW w:type="dxa" w:w="1632"/>
+            <w:tcW w:type="dxa" w:w="1656"/>
             <w:vAlign w:val="center"/>
           </w:tcPr>
           <w:p>
-            <w:pPr>
-              <w:spacing w:after="40"/>
-            </w:pPr>
             <w:r/>
             <w:r>
               <w:rPr>
                 <w:b w:val="0"/>
+                <w:sz w:val="18"/>
               </w:rPr>
-              <w:t>0.5768</w:t>
+              <w:t>0.5863</w:t>
             </w:r>
           </w:p>
         </w:tc>
         <w:tc>
           <w:tcPr>
-            <w:tcW w:type="dxa" w:w="1632"/>
+            <w:tcW w:type="dxa" w:w="1656"/>
             <w:vAlign w:val="center"/>
           </w:tcPr>
           <w:p>
-            <w:pPr>
-              <w:spacing w:after="40"/>
-            </w:pPr>
             <w:r/>
             <w:r>
               <w:rPr>
                 <w:b w:val="0"/>
+                <w:sz w:val="18"/>
               </w:rPr>
-              <w:t>0.8957</w:t>
+              <w:t>0.8806</w:t>
             </w:r>
           </w:p>
         </w:tc>
@@ -1793,17 +1238,15 @@
       <w:tr>
         <w:tc>
           <w:tcPr>
-            <w:tcW w:type="dxa" w:w="1632"/>
+            <w:tcW w:type="dxa" w:w="1656"/>
             <w:vAlign w:val="center"/>
           </w:tcPr>
           <w:p>
-            <w:pPr>
-              <w:spacing w:after="40"/>
-            </w:pPr>
             <w:r/>
             <w:r>
               <w:rPr>
                 <w:b w:val="0"/>
+                <w:sz w:val="18"/>
               </w:rPr>
               <w:t>Random Forest ajustado</w:t>
             </w:r>
@@ -1811,91 +1254,81 @@
         </w:tc>
         <w:tc>
           <w:tcPr>
-            <w:tcW w:type="dxa" w:w="1632"/>
+            <w:tcW w:type="dxa" w:w="1656"/>
             <w:vAlign w:val="center"/>
           </w:tcPr>
           <w:p>
-            <w:pPr>
-              <w:spacing w:after="40"/>
-            </w:pPr>
             <w:r/>
             <w:r>
               <w:rPr>
                 <w:b w:val="0"/>
+                <w:sz w:val="18"/>
               </w:rPr>
-              <w:t>0.8680</w:t>
+              <w:t>0.8600</w:t>
             </w:r>
           </w:p>
         </w:tc>
         <w:tc>
           <w:tcPr>
-            <w:tcW w:type="dxa" w:w="1632"/>
+            <w:tcW w:type="dxa" w:w="1656"/>
             <w:vAlign w:val="center"/>
           </w:tcPr>
           <w:p>
-            <w:pPr>
-              <w:spacing w:after="40"/>
-            </w:pPr>
             <w:r/>
             <w:r>
               <w:rPr>
                 <w:b w:val="0"/>
+                <w:sz w:val="18"/>
               </w:rPr>
-              <w:t>0.6045</w:t>
+              <w:t>0.5719</w:t>
             </w:r>
           </w:p>
         </w:tc>
         <w:tc>
           <w:tcPr>
-            <w:tcW w:type="dxa" w:w="1632"/>
+            <w:tcW w:type="dxa" w:w="1656"/>
             <w:vAlign w:val="center"/>
           </w:tcPr>
           <w:p>
-            <w:pPr>
-              <w:spacing w:after="40"/>
-            </w:pPr>
             <w:r/>
             <w:r>
               <w:rPr>
                 <w:b w:val="0"/>
+                <w:sz w:val="18"/>
               </w:rPr>
-              <w:t>0.6378</w:t>
+              <w:t>0.7007</w:t>
             </w:r>
           </w:p>
         </w:tc>
         <w:tc>
           <w:tcPr>
-            <w:tcW w:type="dxa" w:w="1632"/>
+            <w:tcW w:type="dxa" w:w="1656"/>
             <w:vAlign w:val="center"/>
           </w:tcPr>
           <w:p>
-            <w:pPr>
-              <w:spacing w:after="40"/>
-            </w:pPr>
             <w:r/>
             <w:r>
               <w:rPr>
                 <w:b w:val="0"/>
+                <w:sz w:val="18"/>
               </w:rPr>
-              <w:t>0.6207</w:t>
+              <w:t>0.6298</w:t>
             </w:r>
           </w:p>
         </w:tc>
         <w:tc>
           <w:tcPr>
-            <w:tcW w:type="dxa" w:w="1632"/>
+            <w:tcW w:type="dxa" w:w="1656"/>
             <w:vAlign w:val="center"/>
           </w:tcPr>
           <w:p>
-            <w:pPr>
-              <w:spacing w:after="40"/>
-            </w:pPr>
             <w:r/>
             <w:r>
               <w:rPr>
                 <w:b w:val="0"/>
+                <w:sz w:val="18"/>
               </w:rPr>
-              <w:t>0.8868</w:t>
+              <w:t>0.8911</w:t>
             </w:r>
           </w:p>
         </w:tc>
@@ -1903,415 +1336,221 @@
     </w:tbl>
     <w:p/>
     <w:p>
-      <w:pPr>
-        <w:spacing w:after="140" w:line="276" w:lineRule="auto"/>
-        <w:ind w:firstLine="360"/>
-      </w:pPr>
       <w:r>
-        <w:t>Estos resultados corresponden a una ejecucion de verificacion con muestra reducida. En el notebook completo, los valores pueden cambiar al ejecutar con mas registros, pero la interpretacion de las metricas se mantiene: no basta con ver accuracy, porque la clase grave es menos frecuente y es la mas importante para prevencion.</w:t>
-      </w:r>
-    </w:p>
-    <w:p>
-      <w:r>
-        <w:br w:type="page"/>
-      </w:r>
-    </w:p>
-    <w:p>
-      <w:r>
-        <w:br w:type="page"/>
+        <w:t>Estos resultados corresponden al notebook E3 alineado con el cuaderno principal ATUS. La interpretacion se mantiene: no basta con ver accuracy, porque la clase grave es menos frecuente y es la mas importante para prevencion.</w:t>
       </w:r>
     </w:p>
     <w:p>
       <w:pPr>
         <w:pStyle w:val="Heading1"/>
-        <w:spacing w:before="240" w:after="160"/>
       </w:pPr>
       <w:r>
         <w:t>8. Comparativa y recomendacion</w:t>
       </w:r>
     </w:p>
     <w:p>
-      <w:pPr>
-        <w:spacing w:after="140" w:line="276" w:lineRule="auto"/>
-        <w:ind w:firstLine="360"/>
-      </w:pPr>
       <w:r>
         <w:t>Con base en las metricas, el modelo recomendado para el proyecto es el Random Forest ajustado. La razon principal es que ofrece el mejor equilibrio general para la clase grave, especialmente en F1-score. Esto significa que logra una relacion mas balanceada entre detectar accidentes graves y no marcar demasiados accidentes como graves cuando no lo son.</w:t>
       </w:r>
     </w:p>
     <w:p>
-      <w:pPr>
-        <w:spacing w:after="140" w:line="276" w:lineRule="auto"/>
-        <w:ind w:firstLine="360"/>
-      </w:pPr>
       <w:r>
         <w:t>La Regresion Logistica no se descarta. Su recall fue alto, lo que significa que detecta una mayor proporcion de accidentes graves. En un contexto preventivo donde se prefiere activar alertas aunque existan falsos positivos, podria ser una opcion util. Ademas, es mas facil de explicar que Random Forest.</w:t>
       </w:r>
     </w:p>
     <w:p>
-      <w:pPr>
-        <w:spacing w:after="140" w:line="276" w:lineRule="auto"/>
-        <w:ind w:firstLine="360"/>
-      </w:pPr>
       <w:r>
         <w:t>El Arbol de Decision base cumple como referencia inicial, pero no seria la primera recomendacion final. Su desempeno fue menor y puede depender mucho de pequenas variaciones en los datos.</w:t>
       </w:r>
     </w:p>
     <w:p>
-      <w:pPr>
-        <w:spacing w:after="140" w:line="276" w:lineRule="auto"/>
-        <w:ind w:firstLine="360"/>
-      </w:pPr>
       <w:r>
         <w:t>El clustering jerarquico no compite directamente con los clasificadores porque responde otra pregunta. Mientras los clasificadores predicen gravedad a nivel de accidente, el clustering agrupa municipios. Esto permite pensar en estrategias diferenciadas: municipios con alto volumen, municipios con alta gravedad proporcional y municipios con participacion relevante de motocicletas o tipos especificos de accidente.</w:t>
       </w:r>
     </w:p>
     <w:p>
-      <w:r>
-        <w:br w:type="page"/>
-      </w:r>
-    </w:p>
-    <w:p>
       <w:pPr>
         <w:pStyle w:val="Heading1"/>
-        <w:spacing w:before="240" w:after="160"/>
       </w:pPr>
       <w:r>
         <w:t>9. Resultados preventivos principales</w:t>
       </w:r>
     </w:p>
     <w:p>
-      <w:pPr>
-        <w:spacing w:after="140" w:line="276" w:lineRule="auto"/>
-        <w:ind w:firstLine="360"/>
-      </w:pPr>
       <w:r>
         <w:t>El primer resultado preventivo es que Hermosillo, Sur y Valle y Frontera concentran el mayor volumen de accidentes. Estas regiones requieren acciones de escala amplia: educacion vial, control de velocidad, vigilancia en cruces y seguimiento de zonas con alta movilidad.</w:t>
       </w:r>
     </w:p>
     <w:p>
-      <w:pPr>
-        <w:spacing w:after="140" w:line="276" w:lineRule="auto"/>
-        <w:ind w:firstLine="360"/>
-      </w:pPr>
       <w:r>
         <w:t>El segundo resultado es que la Sierra, Centro y Sur y Valle tienen porcentajes de gravedad mas altos. Estas zonas requieren atencion aunque no siempre aparezcan como las de mayor cantidad de accidentes. En ellas puede ser mas importante revisar tiempos de respuesta, condiciones viales, traslados entre localidades y riesgos asociados a la geografia.</w:t>
       </w:r>
     </w:p>
     <w:p>
-      <w:pPr>
-        <w:spacing w:after="140" w:line="276" w:lineRule="auto"/>
-        <w:ind w:firstLine="360"/>
-      </w:pPr>
       <w:r>
         <w:t>El tercer resultado es que la colision con vehiculo automotor domina el total de accidentes. Esto sugiere estrategias enfocadas en interacciones vehiculares: distancia segura, respeto a semaforos, senalamientos, control de velocidad y vigilancia en intersecciones.</w:t>
       </w:r>
     </w:p>
     <w:p>
-      <w:pPr>
-        <w:spacing w:after="140" w:line="276" w:lineRule="auto"/>
-        <w:ind w:firstLine="360"/>
-      </w:pPr>
       <w:r>
         <w:t>El cuarto resultado es la relevancia de motocicletas. La colision con motocicleta aparece entre los tipos mas frecuentes y la variable de motocicleta tiene peso en el modelado. Por eso, las recomendaciones deben incluir uso de casco, visibilidad, respeto de carriles y campanas dirigidas a motociclistas.</w:t>
       </w:r>
     </w:p>
     <w:p>
-      <w:pPr>
-        <w:spacing w:after="140" w:line="276" w:lineRule="auto"/>
-        <w:ind w:firstLine="360"/>
-      </w:pPr>
       <w:r>
-        <w:t>El quinto resultado es temporal: los viernes por la tarde concentran muchos accidentes. Esta informacion permite proponer acciones por horario, como operativos preventivos, mensajes en redes o refuerzo de vigilancia en horas de salida laboral.</w:t>
-      </w:r>
-    </w:p>
-    <w:p>
-      <w:r>
-        <w:br w:type="page"/>
+        <w:t>El quinto resultado es temporal: las tardes cercanas al fin de semana concentran muchos accidentes, y viernes por la tarde registra 10,802 casos. Esta informacion permite proponer acciones por horario, como operativos preventivos, mensajes en redes o refuerzo de vigilancia en horas de salida laboral.</w:t>
       </w:r>
     </w:p>
     <w:p>
       <w:pPr>
         <w:pStyle w:val="Heading1"/>
-        <w:spacing w:before="240" w:after="160"/>
       </w:pPr>
       <w:r>
         <w:t>10. Discusion critica y limitaciones</w:t>
       </w:r>
     </w:p>
     <w:p>
-      <w:pPr>
-        <w:spacing w:after="140" w:line="276" w:lineRule="auto"/>
-        <w:ind w:firstLine="360"/>
-      </w:pPr>
       <w:r>
         <w:t>La primera limitacion es que ATUS cubre accidentes en zonas urbanas y suburbanas. Por lo tanto, no necesariamente representa todos los accidentes carreteros del estado. Esto importa en Sonora porque hay municipios con grandes distancias y movilidad interurbana.</w:t>
       </w:r>
     </w:p>
     <w:p>
-      <w:pPr>
-        <w:spacing w:after="140" w:line="276" w:lineRule="auto"/>
-        <w:ind w:firstLine="360"/>
-      </w:pPr>
       <w:r>
-        <w:t>La segunda limitacion es que algunas variables son amplias. Por ejemplo, `Conductor` aparece como causa probable en la gran mayoria de registros, pero no distingue si el problema fue velocidad, distraccion, alcohol, falta de respeto a senales u otro comportamiento especifico.</w:t>
+        <w:t>La segunda limitacion es que algunas variables son amplias. Por ejemplo, Conductor aparece como causa probable en la gran mayoria de registros, pero no distingue si el problema fue velocidad, distraccion, alcohol, falta de respeto a senales u otro comportamiento especifico.</w:t>
       </w:r>
     </w:p>
     <w:p>
-      <w:pPr>
-        <w:spacing w:after="140" w:line="276" w:lineRule="auto"/>
-        <w:ind w:firstLine="360"/>
-      </w:pPr>
       <w:r>
         <w:t>La tercera limitacion es la calidad de algunas variables. La edad del conductor tiene valores faltantes o no especificados. Tambien hay variables como aliento o cinturon con categorias no especificadas. Esto reduce la precision interpretativa de ciertos hallazgos.</w:t>
       </w:r>
     </w:p>
     <w:p>
-      <w:pPr>
-        <w:spacing w:after="140" w:line="276" w:lineRule="auto"/>
-        <w:ind w:firstLine="360"/>
-      </w:pPr>
       <w:r>
         <w:t>La cuarta limitacion es que los modelos no deben interpretarse como predictores exactos del futuro. Los accidentes son eventos complejos que dependen de condiciones de movilidad, clima, infraestructura, conducta, vigilancia y otros factores que no siempre estan en la base.</w:t>
       </w:r>
     </w:p>
     <w:p>
-      <w:pPr>
-        <w:spacing w:after="140" w:line="276" w:lineRule="auto"/>
-        <w:ind w:firstLine="360"/>
-      </w:pPr>
       <w:r>
         <w:t>La quinta limitacion es que el analisis regional se definio de forma operativa para comparar municipios. Aunque la segmentacion ayuda a interpretar, podria ajustarse con criterios oficiales de planeacion, movilidad o seguridad publica si se cuenta con ellos.</w:t>
       </w:r>
     </w:p>
     <w:p>
-      <w:r>
-        <w:br w:type="page"/>
-      </w:r>
-    </w:p>
-    <w:p>
-      <w:r>
-        <w:br w:type="page"/>
-      </w:r>
-    </w:p>
-    <w:p>
       <w:pPr>
         <w:pStyle w:val="Heading1"/>
-        <w:spacing w:before="240" w:after="160"/>
       </w:pPr>
       <w:r>
         <w:t>11. Conclusiones</w:t>
       </w:r>
     </w:p>
     <w:p>
-      <w:pPr>
-        <w:spacing w:after="140" w:line="276" w:lineRule="auto"/>
-        <w:ind w:firstLine="360"/>
-      </w:pPr>
       <w:r>
         <w:t>El proyecto permitio conocer mejor los accidentes de transito en Sonora durante el periodo 2015-2024. La base final tuvo 183,911 accidentes reales y mostro diferencias importantes entre regiones, municipios, tipos de accidente y niveles de gravedad.</w:t>
       </w:r>
     </w:p>
     <w:p>
-      <w:pPr>
-        <w:spacing w:after="140" w:line="276" w:lineRule="auto"/>
-        <w:ind w:firstLine="360"/>
-      </w:pPr>
       <w:r>
         <w:t>Una conclusion central es que el volumen de accidentes y la gravedad no siempre coinciden. Hermosillo concentra la mayor cantidad de accidentes, pero regiones como Sierra, Centro y Sur y Valle presentan mayores porcentajes de accidentes graves. Esto confirma que una estrategia preventiva debe combinar cantidad y severidad.</w:t>
       </w:r>
     </w:p>
     <w:p>
-      <w:pPr>
-        <w:spacing w:after="140" w:line="276" w:lineRule="auto"/>
-        <w:ind w:firstLine="360"/>
-      </w:pPr>
       <w:r>
-        <w:t>Otra conclusion es que la causa probable `Conductor` domina los registros. Esto no significa culpar a personas individuales, sino reconocer que la conducta vial debe ser un eje fuerte de prevencion. La educacion vial, el control de velocidad, la atencion a motociclistas y la vigilancia en horarios criticos pueden tener impacto.</w:t>
+        <w:t>Otra conclusion es que la causa probable Conductor domina los registros. Esto no significa culpar a personas individuales, sino reconocer que la conducta vial debe ser un eje fuerte de prevencion. La educacion vial, el control de velocidad, la atencion a motociclistas y la vigilancia en horarios criticos pueden tener impacto.</w:t>
       </w:r>
     </w:p>
     <w:p>
-      <w:pPr>
-        <w:spacing w:after="140" w:line="276" w:lineRule="auto"/>
-        <w:ind w:firstLine="360"/>
-      </w:pPr>
       <w:r>
         <w:t>En modelado, el Random Forest ajustado fue la recomendacion principal por su equilibrio entre precision y recall para accidentes graves. La Regresion Logistica queda como alternativa interpretable, especialmente si se busca explicar de manera sencilla los resultados o priorizar recall.</w:t>
       </w:r>
     </w:p>
     <w:p>
-      <w:pPr>
-        <w:spacing w:after="140" w:line="276" w:lineRule="auto"/>
-        <w:ind w:firstLine="360"/>
-      </w:pPr>
       <w:r>
         <w:t>El clustering jerarquico agrego valor al mostrar que los municipios pueden agruparse por perfiles de riesgo. Esto abre la puerta a estrategias diferenciadas por tipo de municipio, en lugar de aplicar una sola recomendacion general para todo el estado.</w:t>
       </w:r>
     </w:p>
     <w:p>
-      <w:pPr>
-        <w:spacing w:after="140" w:line="276" w:lineRule="auto"/>
-        <w:ind w:firstLine="360"/>
-      </w:pPr>
       <w:r>
         <w:t>En general, el proyecto demuestra que la mineria de datos puede apoyar la prevencion vial cuando se combina analisis exploratorio, calidad de datos, modelos evaluados correctamente e interpretacion humana de los resultados.</w:t>
       </w:r>
     </w:p>
     <w:p>
-      <w:r>
-        <w:br w:type="page"/>
-      </w:r>
-    </w:p>
-    <w:p>
       <w:pPr>
         <w:pStyle w:val="Heading1"/>
-        <w:spacing w:before="240" w:after="160"/>
       </w:pPr>
       <w:r>
         <w:t>12. Recomendaciones</w:t>
       </w:r>
     </w:p>
     <w:p>
-      <w:pPr>
-        <w:pStyle w:val="ListNumber"/>
-        <w:spacing w:after="80"/>
-      </w:pPr>
       <w:r>
-        <w:t>Priorizar acciones de alto volumen en Hermosillo, Sur y Valle y Frontera.</w:t>
-      </w:r>
-    </w:p>
-    <w:p>
-      <w:pPr>
-        <w:pStyle w:val="ListNumber"/>
-        <w:spacing w:after="80"/>
-      </w:pPr>
-      <w:r>
-        <w:t>Atender la gravedad proporcional en Sierra, Centro y Sur y Valle.</w:t>
-      </w:r>
-    </w:p>
-    <w:p>
-      <w:pPr>
-        <w:pStyle w:val="ListNumber"/>
-        <w:spacing w:after="80"/>
-      </w:pPr>
-      <w:r>
-        <w:t>Reforzar campanas sobre velocidad, distancia segura y respeto a senalamientos.</w:t>
-      </w:r>
-    </w:p>
-    <w:p>
-      <w:pPr>
-        <w:pStyle w:val="ListNumber"/>
-        <w:spacing w:after="80"/>
-      </w:pPr>
-      <w:r>
-        <w:t>Desarrollar campanas especificas para motociclistas.</w:t>
-      </w:r>
-    </w:p>
-    <w:p>
-      <w:pPr>
-        <w:pStyle w:val="ListNumber"/>
-        <w:spacing w:after="80"/>
-      </w:pPr>
-      <w:r>
-        <w:t>Revisar horarios criticos, especialmente tardes de viernes.</w:t>
-      </w:r>
-    </w:p>
-    <w:p>
-      <w:pPr>
-        <w:pStyle w:val="ListNumber"/>
-        <w:spacing w:after="80"/>
-      </w:pPr>
-      <w:r>
-        <w:t>Complementar ATUS con datos de infraestructura, clima, alcoholimetria y carreteras si se desea un analisis mas completo.</w:t>
-      </w:r>
-    </w:p>
-    <w:p>
-      <w:pPr>
-        <w:pStyle w:val="ListNumber"/>
-        <w:spacing w:after="80"/>
-      </w:pPr>
-      <w:r>
-        <w:t>Mantener el repositorio organizado para que los notebooks puedan ejecutarse de nuevo con datos actualizados.</w:t>
+        <w:t>1. Priorizar acciones de alto volumen en Hermosillo, Sur y Valle y Frontera.</w:t>
       </w:r>
     </w:p>
     <w:p>
       <w:r>
-        <w:br w:type="page"/>
+        <w:t>2. Atender la gravedad proporcional en Sierra, Centro y Sur y Valle.</w:t>
       </w:r>
     </w:p>
     <w:p>
       <w:r>
-        <w:br w:type="page"/>
+        <w:t>3. Reforzar campanas sobre velocidad, distancia segura y respeto a senalamientos.</w:t>
+      </w:r>
+    </w:p>
+    <w:p>
+      <w:r>
+        <w:t>4. Desarrollar campanas especificas para motociclistas.</w:t>
+      </w:r>
+    </w:p>
+    <w:p>
+      <w:r>
+        <w:t>5. Revisar horarios criticos, especialmente tardes cercanas al fin de semana y viernes por la tarde.</w:t>
+      </w:r>
+    </w:p>
+    <w:p>
+      <w:r>
+        <w:t>6. Complementar ATUS con datos de infraestructura, clima, alcoholimetria y carreteras si se desea un analisis mas completo.</w:t>
+      </w:r>
+    </w:p>
+    <w:p>
+      <w:r>
+        <w:t>7. Mantener el repositorio organizado para que los notebooks puedan ejecutarse de nuevo con datos actualizados.</w:t>
       </w:r>
     </w:p>
     <w:p>
       <w:pPr>
         <w:pStyle w:val="Heading1"/>
-        <w:spacing w:before="240" w:after="160"/>
       </w:pPr>
       <w:r>
         <w:t>13. Referencias bibliograficas</w:t>
       </w:r>
     </w:p>
     <w:p>
-      <w:pPr>
-        <w:spacing w:after="140" w:line="276" w:lineRule="auto"/>
-        <w:ind w:firstLine="360"/>
-      </w:pPr>
       <w:r>
         <w:t>Instituto Nacional de Estadistica y Geografia. (2025). Accidentes de Transito Terrestre en Zonas Urbanas y Suburbanas (ATUS), 1997-2024. INEGI. https://www.inegi.org.mx/programas/accidentes/</w:t>
       </w:r>
     </w:p>
     <w:p>
-      <w:pPr>
-        <w:spacing w:after="140" w:line="276" w:lineRule="auto"/>
-        <w:ind w:firstLine="360"/>
-      </w:pPr>
       <w:r>
         <w:t>Pedregosa, F., Varoquaux, G., Gramfort, A., Michel, V., Thirion, B., Grisel, O., Blondel, M., Prettenhofer, P., Weiss, R., Dubourg, V., Vanderplas, J., Passos, A., Cournapeau, D., Brucher, M., Perrot, M., &amp; Duchesnay, E. (2011). Scikit-learn: Machine learning in Python. Journal of Machine Learning Research, 12, 2825-2830.</w:t>
       </w:r>
     </w:p>
     <w:p>
-      <w:pPr>
-        <w:spacing w:after="140" w:line="276" w:lineRule="auto"/>
-        <w:ind w:firstLine="360"/>
-      </w:pPr>
       <w:r>
         <w:t>McKinney, W. (2010). Data structures for statistical computing in Python. Proceedings of the 9th Python in Science Conference, 56-61.</w:t>
       </w:r>
     </w:p>
     <w:p>
-      <w:pPr>
-        <w:spacing w:after="140" w:line="276" w:lineRule="auto"/>
-        <w:ind w:firstLine="360"/>
-      </w:pPr>
       <w:r>
         <w:t>Hunter, J. D. (2007). Matplotlib: A 2D graphics environment. Computing in Science &amp; Engineering, 9(3), 90-95.</w:t>
       </w:r>
     </w:p>
     <w:p>
-      <w:pPr>
-        <w:spacing w:after="140" w:line="276" w:lineRule="auto"/>
-        <w:ind w:firstLine="360"/>
-      </w:pPr>
       <w:r>
         <w:t>Waskom, M. L. (2021). seaborn: Statistical data visualization. Journal of Open Source Software, 6(60), 3021.</w:t>
       </w:r>
     </w:p>
     <w:p>
-      <w:r>
-        <w:br w:type="page"/>
-      </w:r>
-    </w:p>
-    <w:p>
-      <w:r>
-        <w:br w:type="page"/>
-      </w:r>
-    </w:p>
-    <w:p>
       <w:pPr>
         <w:pStyle w:val="Heading1"/>
-        <w:spacing w:before="240" w:after="160"/>
       </w:pPr>
       <w:r>
         <w:t>14. Anexos: codigo relevante</w:t>
@@ -2326,152 +1565,97 @@
       </w:r>
     </w:p>
     <w:p>
-      <w:pPr>
-        <w:spacing w:after="20"/>
-        <w:ind w:left="360"/>
-      </w:pPr>
       <w:r>
         <w:rPr>
-          <w:rFonts w:ascii="Consolas" w:hAnsi="Consolas"/>
-          <w:color w:val="2D2D2D"/>
+          <w:rFonts w:ascii="Courier New" w:hAnsi="Courier New"/>
           <w:sz w:val="17"/>
         </w:rPr>
         <w:t>YEARS = list(range(2015, 2025))</w:t>
       </w:r>
     </w:p>
     <w:p>
-      <w:pPr>
-        <w:spacing w:after="20"/>
-        <w:ind w:left="360"/>
-      </w:pPr>
       <w:r>
         <w:rPr>
-          <w:rFonts w:ascii="Consolas" w:hAnsi="Consolas"/>
-          <w:color w:val="2D2D2D"/>
+          <w:rFonts w:ascii="Courier New" w:hAnsi="Courier New"/>
           <w:sz w:val="17"/>
         </w:rPr>
         <w:t>SONORA_ID = "26"</w:t>
       </w:r>
     </w:p>
     <w:p>
-      <w:pPr>
-        <w:spacing w:after="20"/>
-        <w:ind w:left="360"/>
-      </w:pPr>
       <w:r>
         <w:rPr>
-          <w:rFonts w:ascii="Consolas" w:hAnsi="Consolas"/>
-          <w:color w:val="2D2D2D"/>
+          <w:rFonts w:ascii="Courier New" w:hAnsi="Courier New"/>
           <w:sz w:val="17"/>
         </w:rPr>
       </w:r>
     </w:p>
     <w:p>
-      <w:pPr>
-        <w:spacing w:after="20"/>
-        <w:ind w:left="360"/>
-      </w:pPr>
       <w:r>
         <w:rPr>
-          <w:rFonts w:ascii="Consolas" w:hAnsi="Consolas"/>
-          <w:color w:val="2D2D2D"/>
+          <w:rFonts w:ascii="Courier New" w:hAnsi="Courier New"/>
           <w:sz w:val="17"/>
         </w:rPr>
         <w:t>frames = []</w:t>
       </w:r>
     </w:p>
     <w:p>
-      <w:pPr>
-        <w:spacing w:after="20"/>
-        <w:ind w:left="360"/>
-      </w:pPr>
       <w:r>
         <w:rPr>
-          <w:rFonts w:ascii="Consolas" w:hAnsi="Consolas"/>
-          <w:color w:val="2D2D2D"/>
+          <w:rFonts w:ascii="Courier New" w:hAnsi="Courier New"/>
           <w:sz w:val="17"/>
         </w:rPr>
         <w:t>for year in YEARS:</w:t>
       </w:r>
     </w:p>
     <w:p>
-      <w:pPr>
-        <w:spacing w:after="20"/>
-        <w:ind w:left="360"/>
-      </w:pPr>
       <w:r>
         <w:rPr>
-          <w:rFonts w:ascii="Consolas" w:hAnsi="Consolas"/>
-          <w:color w:val="2D2D2D"/>
+          <w:rFonts w:ascii="Courier New" w:hAnsi="Courier New"/>
           <w:sz w:val="17"/>
         </w:rPr>
         <w:t xml:space="preserve">    tmp = read_atus_year(year)</w:t>
       </w:r>
     </w:p>
     <w:p>
-      <w:pPr>
-        <w:spacing w:after="20"/>
-        <w:ind w:left="360"/>
-      </w:pPr>
       <w:r>
         <w:rPr>
-          <w:rFonts w:ascii="Consolas" w:hAnsi="Consolas"/>
-          <w:color w:val="2D2D2D"/>
+          <w:rFonts w:ascii="Courier New" w:hAnsi="Courier New"/>
           <w:sz w:val="17"/>
         </w:rPr>
         <w:t xml:space="preserve">    tmp = tmp[tmp["ID_ENTIDAD"].astype(str).str.zfill(2) == SONORA_ID].copy()</w:t>
       </w:r>
     </w:p>
     <w:p>
-      <w:pPr>
-        <w:spacing w:after="20"/>
-        <w:ind w:left="360"/>
-      </w:pPr>
       <w:r>
         <w:rPr>
-          <w:rFonts w:ascii="Consolas" w:hAnsi="Consolas"/>
-          <w:color w:val="2D2D2D"/>
+          <w:rFonts w:ascii="Courier New" w:hAnsi="Courier New"/>
           <w:sz w:val="17"/>
         </w:rPr>
         <w:t xml:space="preserve">    frames.append(tmp)</w:t>
       </w:r>
     </w:p>
     <w:p>
-      <w:pPr>
-        <w:spacing w:after="20"/>
-        <w:ind w:left="360"/>
-      </w:pPr>
       <w:r>
         <w:rPr>
-          <w:rFonts w:ascii="Consolas" w:hAnsi="Consolas"/>
-          <w:color w:val="2D2D2D"/>
+          <w:rFonts w:ascii="Courier New" w:hAnsi="Courier New"/>
           <w:sz w:val="17"/>
         </w:rPr>
       </w:r>
     </w:p>
     <w:p>
-      <w:pPr>
-        <w:spacing w:after="20"/>
-        <w:ind w:left="360"/>
-      </w:pPr>
       <w:r>
         <w:rPr>
-          <w:rFonts w:ascii="Consolas" w:hAnsi="Consolas"/>
-          <w:color w:val="2D2D2D"/>
+          <w:rFonts w:ascii="Courier New" w:hAnsi="Courier New"/>
           <w:sz w:val="17"/>
         </w:rPr>
         <w:t>atus = pd.concat(frames, ignore_index=True)</w:t>
       </w:r>
     </w:p>
     <w:p>
-      <w:pPr>
-        <w:spacing w:after="20"/>
-        <w:ind w:left="360"/>
-      </w:pPr>
       <w:r>
         <w:rPr>
-          <w:rFonts w:ascii="Consolas" w:hAnsi="Consolas"/>
-          <w:color w:val="2D2D2D"/>
+          <w:rFonts w:ascii="Courier New" w:hAnsi="Courier New"/>
           <w:sz w:val="17"/>
         </w:rPr>
         <w:t>atus = atus[atus["TIPACCID"].ne("Certificado cero")].copy()</w:t>
@@ -2486,111 +1670,71 @@
       </w:r>
     </w:p>
     <w:p>
-      <w:pPr>
-        <w:spacing w:after="20"/>
-        <w:ind w:left="360"/>
-      </w:pPr>
       <w:r>
         <w:rPr>
-          <w:rFonts w:ascii="Consolas" w:hAnsi="Consolas"/>
-          <w:color w:val="2D2D2D"/>
+          <w:rFonts w:ascii="Courier New" w:hAnsi="Courier New"/>
           <w:sz w:val="17"/>
         </w:rPr>
         <w:t>atus["TOTAL_MUERTOS"] = atus[dead_cols].fillna(0).sum(axis=1)</w:t>
       </w:r>
     </w:p>
     <w:p>
-      <w:pPr>
-        <w:spacing w:after="20"/>
-        <w:ind w:left="360"/>
-      </w:pPr>
       <w:r>
         <w:rPr>
-          <w:rFonts w:ascii="Consolas" w:hAnsi="Consolas"/>
-          <w:color w:val="2D2D2D"/>
+          <w:rFonts w:ascii="Courier New" w:hAnsi="Courier New"/>
           <w:sz w:val="17"/>
         </w:rPr>
         <w:t>atus["TOTAL_HERIDOS"] = atus[injury_cols].fillna(0).sum(axis=1)</w:t>
       </w:r>
     </w:p>
     <w:p>
-      <w:pPr>
-        <w:spacing w:after="20"/>
-        <w:ind w:left="360"/>
-      </w:pPr>
       <w:r>
         <w:rPr>
-          <w:rFonts w:ascii="Consolas" w:hAnsi="Consolas"/>
-          <w:color w:val="2D2D2D"/>
+          <w:rFonts w:ascii="Courier New" w:hAnsi="Courier New"/>
           <w:sz w:val="17"/>
         </w:rPr>
         <w:t>atus["TOTAL_VICTIMAS"] = atus["TOTAL_MUERTOS"] + atus["TOTAL_HERIDOS"]</w:t>
       </w:r>
     </w:p>
     <w:p>
-      <w:pPr>
-        <w:spacing w:after="20"/>
-        <w:ind w:left="360"/>
-      </w:pPr>
       <w:r>
         <w:rPr>
-          <w:rFonts w:ascii="Consolas" w:hAnsi="Consolas"/>
-          <w:color w:val="2D2D2D"/>
+          <w:rFonts w:ascii="Courier New" w:hAnsi="Courier New"/>
           <w:sz w:val="17"/>
         </w:rPr>
       </w:r>
     </w:p>
     <w:p>
-      <w:pPr>
-        <w:spacing w:after="20"/>
-        <w:ind w:left="360"/>
-      </w:pPr>
       <w:r>
         <w:rPr>
-          <w:rFonts w:ascii="Consolas" w:hAnsi="Consolas"/>
-          <w:color w:val="2D2D2D"/>
+          <w:rFonts w:ascii="Courier New" w:hAnsi="Courier New"/>
           <w:sz w:val="17"/>
         </w:rPr>
         <w:t>atus["GRAVE_BIN"] = (</w:t>
       </w:r>
     </w:p>
     <w:p>
-      <w:pPr>
-        <w:spacing w:after="20"/>
-        <w:ind w:left="360"/>
-      </w:pPr>
       <w:r>
         <w:rPr>
-          <w:rFonts w:ascii="Consolas" w:hAnsi="Consolas"/>
-          <w:color w:val="2D2D2D"/>
+          <w:rFonts w:ascii="Courier New" w:hAnsi="Courier New"/>
           <w:sz w:val="17"/>
         </w:rPr>
         <w:t xml:space="preserve">    (atus["TOTAL_VICTIMAS"] &gt; 0) |</w:t>
       </w:r>
     </w:p>
     <w:p>
-      <w:pPr>
-        <w:spacing w:after="20"/>
-        <w:ind w:left="360"/>
-      </w:pPr>
       <w:r>
         <w:rPr>
-          <w:rFonts w:ascii="Consolas" w:hAnsi="Consolas"/>
-          <w:color w:val="2D2D2D"/>
+          <w:rFonts w:ascii="Courier New" w:hAnsi="Courier New"/>
           <w:sz w:val="17"/>
         </w:rPr>
         <w:t xml:space="preserve">    (atus["CLASACC"].isin(["Fatal", "No fatal"]))</w:t>
       </w:r>
     </w:p>
     <w:p>
-      <w:pPr>
-        <w:spacing w:after="20"/>
-        <w:ind w:left="360"/>
-      </w:pPr>
       <w:r>
         <w:rPr>
-          <w:rFonts w:ascii="Consolas" w:hAnsi="Consolas"/>
-          <w:color w:val="2D2D2D"/>
+          <w:rFonts w:ascii="Courier New" w:hAnsi="Courier New"/>
           <w:sz w:val="17"/>
         </w:rPr>
         <w:t>).astype(int)</w:t>
@@ -2605,168 +1749,108 @@
       </w:r>
     </w:p>
     <w:p>
-      <w:pPr>
-        <w:spacing w:after="20"/>
-        <w:ind w:left="360"/>
-      </w:pPr>
       <w:r>
         <w:rPr>
-          <w:rFonts w:ascii="Consolas" w:hAnsi="Consolas"/>
-          <w:color w:val="2D2D2D"/>
+          <w:rFonts w:ascii="Courier New" w:hAnsi="Courier New"/>
           <w:sz w:val="17"/>
         </w:rPr>
         <w:t>preprocess = ColumnTransformer(</w:t>
       </w:r>
     </w:p>
     <w:p>
-      <w:pPr>
-        <w:spacing w:after="20"/>
-        <w:ind w:left="360"/>
-      </w:pPr>
       <w:r>
         <w:rPr>
-          <w:rFonts w:ascii="Consolas" w:hAnsi="Consolas"/>
-          <w:color w:val="2D2D2D"/>
+          <w:rFonts w:ascii="Courier New" w:hAnsi="Courier New"/>
           <w:sz w:val="17"/>
         </w:rPr>
         <w:t xml:space="preserve">    transformers=[</w:t>
       </w:r>
     </w:p>
     <w:p>
-      <w:pPr>
-        <w:spacing w:after="20"/>
-        <w:ind w:left="360"/>
-      </w:pPr>
       <w:r>
         <w:rPr>
-          <w:rFonts w:ascii="Consolas" w:hAnsi="Consolas"/>
-          <w:color w:val="2D2D2D"/>
+          <w:rFonts w:ascii="Courier New" w:hAnsi="Courier New"/>
           <w:sz w:val="17"/>
         </w:rPr>
         <w:t xml:space="preserve">        ("cat", Pipeline([</w:t>
       </w:r>
     </w:p>
     <w:p>
-      <w:pPr>
-        <w:spacing w:after="20"/>
-        <w:ind w:left="360"/>
-      </w:pPr>
       <w:r>
         <w:rPr>
-          <w:rFonts w:ascii="Consolas" w:hAnsi="Consolas"/>
-          <w:color w:val="2D2D2D"/>
+          <w:rFonts w:ascii="Courier New" w:hAnsi="Courier New"/>
           <w:sz w:val="17"/>
         </w:rPr>
         <w:t xml:space="preserve">            ("imputer", SimpleImputer(strategy="most_frequent")),</w:t>
       </w:r>
     </w:p>
     <w:p>
-      <w:pPr>
-        <w:spacing w:after="20"/>
-        <w:ind w:left="360"/>
-      </w:pPr>
       <w:r>
         <w:rPr>
-          <w:rFonts w:ascii="Consolas" w:hAnsi="Consolas"/>
-          <w:color w:val="2D2D2D"/>
+          <w:rFonts w:ascii="Courier New" w:hAnsi="Courier New"/>
           <w:sz w:val="17"/>
         </w:rPr>
         <w:t xml:space="preserve">            ("onehot", OneHotEncoder(handle_unknown="ignore", min_frequency=20)),</w:t>
       </w:r>
     </w:p>
     <w:p>
-      <w:pPr>
-        <w:spacing w:after="20"/>
-        <w:ind w:left="360"/>
-      </w:pPr>
       <w:r>
         <w:rPr>
-          <w:rFonts w:ascii="Consolas" w:hAnsi="Consolas"/>
-          <w:color w:val="2D2D2D"/>
+          <w:rFonts w:ascii="Courier New" w:hAnsi="Courier New"/>
           <w:sz w:val="17"/>
         </w:rPr>
         <w:t xml:space="preserve">        ]), categorical_features),</w:t>
       </w:r>
     </w:p>
     <w:p>
-      <w:pPr>
-        <w:spacing w:after="20"/>
-        <w:ind w:left="360"/>
-      </w:pPr>
       <w:r>
         <w:rPr>
-          <w:rFonts w:ascii="Consolas" w:hAnsi="Consolas"/>
-          <w:color w:val="2D2D2D"/>
+          <w:rFonts w:ascii="Courier New" w:hAnsi="Courier New"/>
           <w:sz w:val="17"/>
         </w:rPr>
         <w:t xml:space="preserve">        ("num", Pipeline([</w:t>
       </w:r>
     </w:p>
     <w:p>
-      <w:pPr>
-        <w:spacing w:after="20"/>
-        <w:ind w:left="360"/>
-      </w:pPr>
       <w:r>
         <w:rPr>
-          <w:rFonts w:ascii="Consolas" w:hAnsi="Consolas"/>
-          <w:color w:val="2D2D2D"/>
+          <w:rFonts w:ascii="Courier New" w:hAnsi="Courier New"/>
           <w:sz w:val="17"/>
         </w:rPr>
         <w:t xml:space="preserve">            ("imputer", SimpleImputer(strategy="median")),</w:t>
       </w:r>
     </w:p>
     <w:p>
-      <w:pPr>
-        <w:spacing w:after="20"/>
-        <w:ind w:left="360"/>
-      </w:pPr>
       <w:r>
         <w:rPr>
-          <w:rFonts w:ascii="Consolas" w:hAnsi="Consolas"/>
-          <w:color w:val="2D2D2D"/>
+          <w:rFonts w:ascii="Courier New" w:hAnsi="Courier New"/>
           <w:sz w:val="17"/>
         </w:rPr>
         <w:t xml:space="preserve">            ("scaler", StandardScaler()),</w:t>
       </w:r>
     </w:p>
     <w:p>
-      <w:pPr>
-        <w:spacing w:after="20"/>
-        <w:ind w:left="360"/>
-      </w:pPr>
       <w:r>
         <w:rPr>
-          <w:rFonts w:ascii="Consolas" w:hAnsi="Consolas"/>
-          <w:color w:val="2D2D2D"/>
+          <w:rFonts w:ascii="Courier New" w:hAnsi="Courier New"/>
           <w:sz w:val="17"/>
         </w:rPr>
         <w:t xml:space="preserve">        ]), numeric_features),</w:t>
       </w:r>
     </w:p>
     <w:p>
-      <w:pPr>
-        <w:spacing w:after="20"/>
-        <w:ind w:left="360"/>
-      </w:pPr>
       <w:r>
         <w:rPr>
-          <w:rFonts w:ascii="Consolas" w:hAnsi="Consolas"/>
-          <w:color w:val="2D2D2D"/>
+          <w:rFonts w:ascii="Courier New" w:hAnsi="Courier New"/>
           <w:sz w:val="17"/>
         </w:rPr>
         <w:t xml:space="preserve">    ]</w:t>
       </w:r>
     </w:p>
     <w:p>
-      <w:pPr>
-        <w:spacing w:after="20"/>
-        <w:ind w:left="360"/>
-      </w:pPr>
       <w:r>
         <w:rPr>
-          <w:rFonts w:ascii="Consolas" w:hAnsi="Consolas"/>
-          <w:color w:val="2D2D2D"/>
+          <w:rFonts w:ascii="Courier New" w:hAnsi="Courier New"/>
           <w:sz w:val="17"/>
         </w:rPr>
         <w:t>)</w:t>
@@ -2781,167 +1865,107 @@
       </w:r>
     </w:p>
     <w:p>
-      <w:pPr>
-        <w:spacing w:after="20"/>
-        <w:ind w:left="360"/>
-      </w:pPr>
       <w:r>
         <w:rPr>
-          <w:rFonts w:ascii="Consolas" w:hAnsi="Consolas"/>
-          <w:color w:val="2D2D2D"/>
+          <w:rFonts w:ascii="Courier New" w:hAnsi="Courier New"/>
           <w:sz w:val="17"/>
         </w:rPr>
         <w:t>rf_pipeline = Pipeline([</w:t>
       </w:r>
     </w:p>
     <w:p>
-      <w:pPr>
-        <w:spacing w:after="20"/>
-        <w:ind w:left="360"/>
-      </w:pPr>
       <w:r>
         <w:rPr>
-          <w:rFonts w:ascii="Consolas" w:hAnsi="Consolas"/>
-          <w:color w:val="2D2D2D"/>
+          <w:rFonts w:ascii="Courier New" w:hAnsi="Courier New"/>
           <w:sz w:val="17"/>
         </w:rPr>
         <w:t xml:space="preserve">    ("preprocess", preprocess),</w:t>
       </w:r>
     </w:p>
     <w:p>
-      <w:pPr>
-        <w:spacing w:after="20"/>
-        <w:ind w:left="360"/>
-      </w:pPr>
       <w:r>
         <w:rPr>
-          <w:rFonts w:ascii="Consolas" w:hAnsi="Consolas"/>
-          <w:color w:val="2D2D2D"/>
+          <w:rFonts w:ascii="Courier New" w:hAnsi="Courier New"/>
           <w:sz w:val="17"/>
         </w:rPr>
         <w:t xml:space="preserve">    ("model", RandomForestClassifier(random_state=42, n_jobs=-1)),</w:t>
       </w:r>
     </w:p>
     <w:p>
-      <w:pPr>
-        <w:spacing w:after="20"/>
-        <w:ind w:left="360"/>
-      </w:pPr>
       <w:r>
         <w:rPr>
-          <w:rFonts w:ascii="Consolas" w:hAnsi="Consolas"/>
-          <w:color w:val="2D2D2D"/>
+          <w:rFonts w:ascii="Courier New" w:hAnsi="Courier New"/>
           <w:sz w:val="17"/>
         </w:rPr>
         <w:t>])</w:t>
       </w:r>
     </w:p>
     <w:p>
-      <w:pPr>
-        <w:spacing w:after="20"/>
-        <w:ind w:left="360"/>
-      </w:pPr>
       <w:r>
         <w:rPr>
-          <w:rFonts w:ascii="Consolas" w:hAnsi="Consolas"/>
-          <w:color w:val="2D2D2D"/>
+          <w:rFonts w:ascii="Courier New" w:hAnsi="Courier New"/>
           <w:sz w:val="17"/>
         </w:rPr>
       </w:r>
     </w:p>
     <w:p>
-      <w:pPr>
-        <w:spacing w:after="20"/>
-        <w:ind w:left="360"/>
-      </w:pPr>
       <w:r>
         <w:rPr>
-          <w:rFonts w:ascii="Consolas" w:hAnsi="Consolas"/>
-          <w:color w:val="2D2D2D"/>
+          <w:rFonts w:ascii="Courier New" w:hAnsi="Courier New"/>
           <w:sz w:val="17"/>
         </w:rPr>
         <w:t>param_distributions = {</w:t>
       </w:r>
     </w:p>
     <w:p>
-      <w:pPr>
-        <w:spacing w:after="20"/>
-        <w:ind w:left="360"/>
-      </w:pPr>
       <w:r>
         <w:rPr>
-          <w:rFonts w:ascii="Consolas" w:hAnsi="Consolas"/>
-          <w:color w:val="2D2D2D"/>
+          <w:rFonts w:ascii="Courier New" w:hAnsi="Courier New"/>
           <w:sz w:val="17"/>
         </w:rPr>
         <w:t xml:space="preserve">    "model__n_estimators": [120, 200],</w:t>
       </w:r>
     </w:p>
     <w:p>
-      <w:pPr>
-        <w:spacing w:after="20"/>
-        <w:ind w:left="360"/>
-      </w:pPr>
       <w:r>
         <w:rPr>
-          <w:rFonts w:ascii="Consolas" w:hAnsi="Consolas"/>
-          <w:color w:val="2D2D2D"/>
+          <w:rFonts w:ascii="Courier New" w:hAnsi="Courier New"/>
           <w:sz w:val="17"/>
         </w:rPr>
         <w:t xml:space="preserve">    "model__max_depth": [None, 12, 20],</w:t>
       </w:r>
     </w:p>
     <w:p>
-      <w:pPr>
-        <w:spacing w:after="20"/>
-        <w:ind w:left="360"/>
-      </w:pPr>
       <w:r>
         <w:rPr>
-          <w:rFonts w:ascii="Consolas" w:hAnsi="Consolas"/>
-          <w:color w:val="2D2D2D"/>
+          <w:rFonts w:ascii="Courier New" w:hAnsi="Courier New"/>
           <w:sz w:val="17"/>
         </w:rPr>
         <w:t xml:space="preserve">    "model__min_samples_leaf": [1, 3, 5],</w:t>
       </w:r>
     </w:p>
     <w:p>
-      <w:pPr>
-        <w:spacing w:after="20"/>
-        <w:ind w:left="360"/>
-      </w:pPr>
       <w:r>
         <w:rPr>
-          <w:rFonts w:ascii="Consolas" w:hAnsi="Consolas"/>
-          <w:color w:val="2D2D2D"/>
+          <w:rFonts w:ascii="Courier New" w:hAnsi="Courier New"/>
           <w:sz w:val="17"/>
         </w:rPr>
         <w:t xml:space="preserve">    "model__max_features": ["sqrt", "log2"],</w:t>
       </w:r>
     </w:p>
     <w:p>
-      <w:pPr>
-        <w:spacing w:after="20"/>
-        <w:ind w:left="360"/>
-      </w:pPr>
       <w:r>
         <w:rPr>
-          <w:rFonts w:ascii="Consolas" w:hAnsi="Consolas"/>
-          <w:color w:val="2D2D2D"/>
+          <w:rFonts w:ascii="Courier New" w:hAnsi="Courier New"/>
           <w:sz w:val="17"/>
         </w:rPr>
         <w:t xml:space="preserve">    "model__class_weight": ["balanced", "balanced_subsample"],</w:t>
       </w:r>
     </w:p>
     <w:p>
-      <w:pPr>
-        <w:spacing w:after="20"/>
-        <w:ind w:left="360"/>
-      </w:pPr>
       <w:r>
         <w:rPr>
-          <w:rFonts w:ascii="Consolas" w:hAnsi="Consolas"/>
-          <w:color w:val="2D2D2D"/>
+          <w:rFonts w:ascii="Courier New" w:hAnsi="Courier New"/>
           <w:sz w:val="17"/>
         </w:rPr>
         <w:t>}</w:t>
@@ -2956,195 +1980,125 @@
       </w:r>
     </w:p>
     <w:p>
-      <w:pPr>
-        <w:spacing w:after="20"/>
-        <w:ind w:left="360"/>
-      </w:pPr>
       <w:r>
         <w:rPr>
-          <w:rFonts w:ascii="Consolas" w:hAnsi="Consolas"/>
-          <w:color w:val="2D2D2D"/>
+          <w:rFonts w:ascii="Courier New" w:hAnsi="Courier New"/>
           <w:sz w:val="17"/>
         </w:rPr>
         <w:t>municipal = (</w:t>
       </w:r>
     </w:p>
     <w:p>
-      <w:pPr>
-        <w:spacing w:after="20"/>
-        <w:ind w:left="360"/>
-      </w:pPr>
       <w:r>
         <w:rPr>
-          <w:rFonts w:ascii="Consolas" w:hAnsi="Consolas"/>
-          <w:color w:val="2D2D2D"/>
+          <w:rFonts w:ascii="Courier New" w:hAnsi="Courier New"/>
           <w:sz w:val="17"/>
         </w:rPr>
         <w:t xml:space="preserve">    atus.groupby(["ID_MUNICIPIO", "NOM_MUNICIPIO", "REGION"])</w:t>
       </w:r>
     </w:p>
     <w:p>
-      <w:pPr>
-        <w:spacing w:after="20"/>
-        <w:ind w:left="360"/>
-      </w:pPr>
       <w:r>
         <w:rPr>
-          <w:rFonts w:ascii="Consolas" w:hAnsi="Consolas"/>
-          <w:color w:val="2D2D2D"/>
+          <w:rFonts w:ascii="Courier New" w:hAnsi="Courier New"/>
           <w:sz w:val="17"/>
         </w:rPr>
         <w:t xml:space="preserve">    .agg(</w:t>
       </w:r>
     </w:p>
     <w:p>
-      <w:pPr>
-        <w:spacing w:after="20"/>
-        <w:ind w:left="360"/>
-      </w:pPr>
       <w:r>
         <w:rPr>
-          <w:rFonts w:ascii="Consolas" w:hAnsi="Consolas"/>
-          <w:color w:val="2D2D2D"/>
+          <w:rFonts w:ascii="Courier New" w:hAnsi="Courier New"/>
           <w:sz w:val="17"/>
         </w:rPr>
         <w:t xml:space="preserve">        accidentes=("GRAVE_BIN", "size"),</w:t>
       </w:r>
     </w:p>
     <w:p>
-      <w:pPr>
-        <w:spacing w:after="20"/>
-        <w:ind w:left="360"/>
-      </w:pPr>
       <w:r>
         <w:rPr>
-          <w:rFonts w:ascii="Consolas" w:hAnsi="Consolas"/>
-          <w:color w:val="2D2D2D"/>
+          <w:rFonts w:ascii="Courier New" w:hAnsi="Courier New"/>
           <w:sz w:val="17"/>
         </w:rPr>
         <w:t xml:space="preserve">        pct_graves=("GRAVE_BIN", "mean"),</w:t>
       </w:r>
     </w:p>
     <w:p>
-      <w:pPr>
-        <w:spacing w:after="20"/>
-        <w:ind w:left="360"/>
-      </w:pPr>
       <w:r>
         <w:rPr>
-          <w:rFonts w:ascii="Consolas" w:hAnsi="Consolas"/>
-          <w:color w:val="2D2D2D"/>
+          <w:rFonts w:ascii="Courier New" w:hAnsi="Courier New"/>
           <w:sz w:val="17"/>
         </w:rPr>
         <w:t xml:space="preserve">        heridos_prom=("TOTAL_HERIDOS", "mean"),</w:t>
       </w:r>
     </w:p>
     <w:p>
-      <w:pPr>
-        <w:spacing w:after="20"/>
-        <w:ind w:left="360"/>
-      </w:pPr>
       <w:r>
         <w:rPr>
-          <w:rFonts w:ascii="Consolas" w:hAnsi="Consolas"/>
-          <w:color w:val="2D2D2D"/>
+          <w:rFonts w:ascii="Courier New" w:hAnsi="Courier New"/>
           <w:sz w:val="17"/>
         </w:rPr>
         <w:t xml:space="preserve">        muertos_prom=("TOTAL_MUERTOS", "mean"),</w:t>
       </w:r>
     </w:p>
     <w:p>
-      <w:pPr>
-        <w:spacing w:after="20"/>
-        <w:ind w:left="360"/>
-      </w:pPr>
       <w:r>
         <w:rPr>
-          <w:rFonts w:ascii="Consolas" w:hAnsi="Consolas"/>
-          <w:color w:val="2D2D2D"/>
+          <w:rFonts w:ascii="Courier New" w:hAnsi="Courier New"/>
           <w:sz w:val="17"/>
         </w:rPr>
         <w:t xml:space="preserve">        pct_moto=("INVOLUCRA_MOTO", "mean"),</w:t>
       </w:r>
     </w:p>
     <w:p>
-      <w:pPr>
-        <w:spacing w:after="20"/>
-        <w:ind w:left="360"/>
-      </w:pPr>
       <w:r>
         <w:rPr>
-          <w:rFonts w:ascii="Consolas" w:hAnsi="Consolas"/>
-          <w:color w:val="2D2D2D"/>
+          <w:rFonts w:ascii="Courier New" w:hAnsi="Courier New"/>
           <w:sz w:val="17"/>
         </w:rPr>
         <w:t xml:space="preserve">    )</w:t>
       </w:r>
     </w:p>
     <w:p>
-      <w:pPr>
-        <w:spacing w:after="20"/>
-        <w:ind w:left="360"/>
-      </w:pPr>
       <w:r>
         <w:rPr>
-          <w:rFonts w:ascii="Consolas" w:hAnsi="Consolas"/>
-          <w:color w:val="2D2D2D"/>
+          <w:rFonts w:ascii="Courier New" w:hAnsi="Courier New"/>
           <w:sz w:val="17"/>
         </w:rPr>
         <w:t xml:space="preserve">    .reset_index()</w:t>
       </w:r>
     </w:p>
     <w:p>
-      <w:pPr>
-        <w:spacing w:after="20"/>
-        <w:ind w:left="360"/>
-      </w:pPr>
       <w:r>
         <w:rPr>
-          <w:rFonts w:ascii="Consolas" w:hAnsi="Consolas"/>
-          <w:color w:val="2D2D2D"/>
+          <w:rFonts w:ascii="Courier New" w:hAnsi="Courier New"/>
           <w:sz w:val="17"/>
         </w:rPr>
         <w:t>)</w:t>
       </w:r>
     </w:p>
     <w:p>
-      <w:pPr>
-        <w:spacing w:after="20"/>
-        <w:ind w:left="360"/>
-      </w:pPr>
       <w:r>
         <w:rPr>
-          <w:rFonts w:ascii="Consolas" w:hAnsi="Consolas"/>
-          <w:color w:val="2D2D2D"/>
+          <w:rFonts w:ascii="Courier New" w:hAnsi="Courier New"/>
           <w:sz w:val="17"/>
         </w:rPr>
       </w:r>
     </w:p>
     <w:p>
-      <w:pPr>
-        <w:spacing w:after="20"/>
-        <w:ind w:left="360"/>
-      </w:pPr>
       <w:r>
         <w:rPr>
-          <w:rFonts w:ascii="Consolas" w:hAnsi="Consolas"/>
-          <w:color w:val="2D2D2D"/>
+          <w:rFonts w:ascii="Courier New" w:hAnsi="Courier New"/>
           <w:sz w:val="17"/>
         </w:rPr>
         <w:t>X_cluster = StandardScaler().fit_transform(municipal[cluster_features])</w:t>
       </w:r>
     </w:p>
     <w:p>
-      <w:pPr>
-        <w:spacing w:after="20"/>
-        <w:ind w:left="360"/>
-      </w:pPr>
       <w:r>
         <w:rPr>
-          <w:rFonts w:ascii="Consolas" w:hAnsi="Consolas"/>
-          <w:color w:val="2D2D2D"/>
+          <w:rFonts w:ascii="Courier New" w:hAnsi="Courier New"/>
           <w:sz w:val="17"/>
         </w:rPr>
         <w:t>Z = linkage(X_cluster, method="ward")</w:t>
@@ -3152,7 +2106,7 @@
     </w:p>
     <w:sectPr>
       <w:pgSz w:w="12240" w:h="15840"/>
-      <w:pgMar w:top="1152" w:right="1224" w:bottom="1080" w:left="1224" w:header="720" w:footer="720" w:gutter="0"/>
+      <w:pgMar w:top="1080" w:right="1152" w:bottom="1080" w:left="1152" w:header="720" w:footer="720" w:gutter="0"/>
       <w:cols w:space="720"/>
       <w:docGrid w:linePitch="360"/>
     </w:sectPr>
@@ -3524,7 +2478,7 @@
     <w:qFormat/>
     <w:rsid w:val="00FC693F"/>
     <w:rPr>
-      <w:rFonts w:ascii="Aptos" w:hAnsi="Aptos"/>
+      <w:rFonts w:ascii="Arial" w:hAnsi="Arial"/>
       <w:sz w:val="21"/>
     </w:rPr>
   </w:style>
@@ -3587,11 +2541,11 @@
       <w:outlineLvl w:val="0"/>
     </w:pPr>
     <w:rPr>
-      <w:rFonts w:asciiTheme="majorHAnsi" w:eastAsiaTheme="majorEastAsia" w:hAnsiTheme="majorHAnsi" w:cstheme="majorBidi" w:ascii="Aptos Display" w:hAnsi="Aptos Display"/>
+      <w:rFonts w:asciiTheme="majorHAnsi" w:eastAsiaTheme="majorEastAsia" w:hAnsiTheme="majorHAnsi" w:cstheme="majorBidi" w:ascii="Arial" w:hAnsi="Arial"/>
       <w:b/>
       <w:bCs/>
-      <w:color w:val="1F4E79"/>
-      <w:sz w:val="32"/>
+      <w:color w:val="182D43"/>
+      <w:sz w:val="34"/>
       <w:szCs w:val="28"/>
     </w:rPr>
   </w:style>
@@ -3611,10 +2565,10 @@
       <w:outlineLvl w:val="1"/>
     </w:pPr>
     <w:rPr>
-      <w:rFonts w:asciiTheme="majorHAnsi" w:eastAsiaTheme="majorEastAsia" w:hAnsiTheme="majorHAnsi" w:cstheme="majorBidi" w:ascii="Aptos" w:hAnsi="Aptos"/>
+      <w:rFonts w:asciiTheme="majorHAnsi" w:eastAsiaTheme="majorEastAsia" w:hAnsiTheme="majorHAnsi" w:cstheme="majorBidi" w:ascii="Arial" w:hAnsi="Arial"/>
       <w:b/>
       <w:bCs/>
-      <w:color w:val="1F4E79"/>
+      <w:color w:val="182D43"/>
       <w:sz w:val="26"/>
       <w:szCs w:val="26"/>
     </w:rPr>
@@ -3635,10 +2589,11 @@
       <w:outlineLvl w:val="2"/>
     </w:pPr>
     <w:rPr>
-      <w:rFonts w:asciiTheme="majorHAnsi" w:eastAsiaTheme="majorEastAsia" w:hAnsiTheme="majorHAnsi" w:cstheme="majorBidi"/>
+      <w:rFonts w:asciiTheme="majorHAnsi" w:eastAsiaTheme="majorEastAsia" w:hAnsiTheme="majorHAnsi" w:cstheme="majorBidi" w:ascii="Arial" w:hAnsi="Arial"/>
       <w:b/>
       <w:bCs/>
-      <w:color w:val="4F81BD" w:themeColor="accent1"/>
+      <w:color w:val="182D43"/>
+      <w:sz w:val="22"/>
     </w:rPr>
   </w:style>
   <w:style w:type="paragraph" w:styleId="Heading4">

</xml_diff>

<commit_message>
Actualiza la presentación sobre prevención vial en Sonora: se añaden nuevos modelos de clasificación, se ajustan descripciones y se incluye un nuevo slide sobre la regla IF-THEN del Árbol de Decisión. Se crea un nuevo archivo PPTX con la presentación actualizada.
</commit_message>
<xml_diff>
--- a/E4_Informe_Final_Codigo_Completo/Informe_Final_Prevencion_Vial_Sonora.docx
+++ b/E4_Informe_Final_Codigo_Completo/Informe_Final_Prevencion_Vial_Sonora.docx
@@ -4,30 +4,13 @@
   <w:body>
     <w:p>
       <w:pPr>
+        <w:pStyle w:val="Title"/>
         <w:jc w:val="center"/>
       </w:pPr>
       <w:r>
-        <w:rPr>
-          <w:b/>
-          <w:color w:val="182D43"/>
-          <w:sz w:val="40"/>
-        </w:rPr>
         <w:t>Informe final - Prevención vial en Sonora con ATUS</w:t>
       </w:r>
     </w:p>
-    <w:p>
-      <w:pPr>
-        <w:jc w:val="center"/>
-      </w:pPr>
-      <w:r>
-        <w:rPr>
-          <w:color w:val="207E76"/>
-          <w:sz w:val="22"/>
-        </w:rPr>
-        <w:t>Informe final del proyecto | Minería de Datos</w:t>
-      </w:r>
-    </w:p>
-    <w:p/>
     <w:p>
       <w:pPr>
         <w:pStyle w:val="Heading1"/>
@@ -37,21 +20,33 @@
       </w:r>
     </w:p>
     <w:p>
+      <w:pPr>
+        <w:spacing w:after="120" w:line="252" w:lineRule="auto"/>
+      </w:pPr>
       <w:r>
         <w:t>Proyecto: Prevención vial en Sonora mediante análisis de accidentes de transito.</w:t>
       </w:r>
     </w:p>
     <w:p>
+      <w:pPr>
+        <w:spacing w:after="120" w:line="252" w:lineRule="auto"/>
+      </w:pPr>
       <w:r>
         <w:t>Materia: Minería de Datos.</w:t>
       </w:r>
     </w:p>
     <w:p>
+      <w:pPr>
+        <w:spacing w:after="120" w:line="252" w:lineRule="auto"/>
+      </w:pPr>
       <w:r>
         <w:t>Institución: TecNM / Instituto Tecnologico de Hermosillo.</w:t>
       </w:r>
     </w:p>
     <w:p>
+      <w:pPr>
+        <w:spacing w:after="120" w:line="252" w:lineRule="auto"/>
+      </w:pPr>
       <w:r>
         <w:t>Equipo:</w:t>
       </w:r>
@@ -81,11 +76,17 @@
       </w:r>
     </w:p>
     <w:p>
+      <w:pPr>
+        <w:spacing w:after="120" w:line="252" w:lineRule="auto"/>
+      </w:pPr>
       <w:r>
         <w:t>Fuente principal de datos: Accidentes de Tránsito Terrestre en Zonas Urbanas y Suburbanas (ATUS), INEGI.</w:t>
       </w:r>
     </w:p>
     <w:p>
+      <w:pPr>
+        <w:spacing w:after="120" w:line="252" w:lineRule="auto"/>
+      </w:pPr>
       <w:r>
         <w:t>Periodo analizado: 2015-2024.</w:t>
       </w:r>
@@ -99,28 +100,43 @@
       </w:r>
     </w:p>
     <w:p>
+      <w:pPr>
+        <w:spacing w:after="120" w:line="252" w:lineRule="auto"/>
+      </w:pPr>
       <w:r>
         <w:t>Este proyecto estudia los accidentes de tránsito registrados en Sonora durante los últimos diez años disponibles en la base ATUS. El propósito principal fue identificar patrones regionales de frecuencia, gravedad y causas probables para proponer acciones preventivas más enfocadas. El enfoque no fue buscar culpables individuales, sino entender el comportamiento general de los datos y traducirlo en información util para la seguridad vial.</w:t>
       </w:r>
     </w:p>
     <w:p>
+      <w:pPr>
+        <w:spacing w:after="120" w:line="252" w:lineRule="auto"/>
+      </w:pPr>
       <w:r>
-        <w:t>El análisis partio de registros anuales de accidentes en zonas urbanas y suburbanas. Despues de filtrar Sonora y eliminar registros marcados como Certificado cero, se trabajo con 183,911 accidentes reales. Se construyeron variables derivadas como región, total de heridos, total de fallecidos, total de víctimas, participación de motocicleta o bicicleta, rango de hora y una variable binaria de gravedad.</w:t>
+        <w:t>El análisis partio de registros anuales de accidentes en zonas urbanas y suburbanas. Despues de filtrar Sonora y eliminar registros marcados como Certificado cero, se trabajo con 183,911 accidentes reales. Se construyeron variables derivadas como región, total de heridos, total de fallecidos, total de víctimas, participacion de motocicleta o bicicleta, rango de hora y una variable binaria de gravedad.</w:t>
       </w:r>
     </w:p>
     <w:p>
+      <w:pPr>
+        <w:spacing w:after="120" w:line="252" w:lineRule="auto"/>
+      </w:pPr>
       <w:r>
         <w:t>La exploracion mostro que Hermosillo concentra el mayor número de accidentes, seguido por Sur y Valle y Frontera. Sin embargo, las regiones con mayor porcentaje de accidentes graves fueron Sierra, Centro y Sur y Valle. Esta diferencia fue una de las partes más importantes del proyecto, porque demuestra que el volumen de accidentes y la gravedad no siempre apuntan a los mismos lugares.</w:t>
       </w:r>
     </w:p>
     <w:p>
+      <w:pPr>
+        <w:spacing w:after="120" w:line="252" w:lineRule="auto"/>
+      </w:pPr>
       <w:r>
         <w:t>En modelado se implementaron varios enfoques. Primero, un árbol de Decision como linea base. Despues, una Regresion Logística como modelo interpretable y un Random Forest ajustado como modelo más elaborado. También se uso clustering jerárquico para agrupar municipios con comportamientos parecidos y reglas de asociación para encontrar combinaciones frecuentes relacionadas con accidentes graves.</w:t>
       </w:r>
     </w:p>
     <w:p>
+      <w:pPr>
+        <w:spacing w:after="120" w:line="252" w:lineRule="auto"/>
+      </w:pPr>
       <w:r>
-        <w:t>La recomendacion principal fue usar el Random Forest ajustado como modelo de clasificación cuando se busca el mejor equilibrio entre precision y recall para accidentes graves. Este informe queda alineado con el cuaderno principal notebooks/atus_sonora_10_anios_prevencion.ipynb y con el entregable E3 actualizado. La Regresion Logística se conserva como alternativa cuando se necesita una explicacion más sencilla. El clustering y las reglas de asociación complementan el análisis porque ayudan a traducir los resultados en acciones preventivas por región o tipo de municipio.</w:t>
+        <w:t>La recomendación principal fue usar el Random Forest ajustado como modelo de clasificación cuando se busca el mejor equilibrio entre precision y recall para accidentes graves. Este informe queda alineado con el cuaderno principal notebooks/atus_sonora_10_anios_prevencion.ipynb y con el entregable E3 actualizado. La Regresion Logística se conserva como alternativa cuando se necesita una explicacion más sencilla. El clustering y las reglas de asociación complementan el análisis porque ayudan a traducir los resultados en acciones preventivas por región o tipo de municipio.</w:t>
       </w:r>
     </w:p>
     <w:p>
@@ -132,23 +148,35 @@
       </w:r>
     </w:p>
     <w:p>
+      <w:pPr>
+        <w:spacing w:after="120" w:line="252" w:lineRule="auto"/>
+      </w:pPr>
       <w:r>
         <w:t>Los accidentes de tránsito son una problematica social porque afectan directamente la seguridad de conductores, pasajeros, peatones, ciclistas, motociclistas y familias. Ademas de los daños materiales, los accidentes pueden provocar lesiones, muertes, costos economicos, interrupciones en la movilidad y presion sobre servicios de emergencia.</w:t>
       </w:r>
     </w:p>
     <w:p>
+      <w:pPr>
+        <w:spacing w:after="120" w:line="252" w:lineRule="auto"/>
+      </w:pPr>
       <w:r>
         <w:t>En Sonora, el comportamiento de los accidentes no es igual en todos los municipios. La capital, las ciudades fronterizas, las zonas costeras, los municipios del sur y las localidades serranas tienen condiciones de movilidad diferentes. Por eso, analizar solamente el total estatal puede ocultar patrones importantes.</w:t>
       </w:r>
     </w:p>
     <w:p>
+      <w:pPr>
+        <w:spacing w:after="120" w:line="252" w:lineRule="auto"/>
+      </w:pPr>
       <w:r>
         <w:t>El proyecto se planteo desde un enfoque preventivo e interpretativo. La pregunta principal fue: que patrones presentan los accidentes de tránsito en las diferentes regiones de Sonora y cuales son las causas más frecuentes que pueden ayudar a proponer estrategias de prevención vial.</w:t>
       </w:r>
     </w:p>
     <w:p>
+      <w:pPr>
+        <w:spacing w:after="120" w:line="252" w:lineRule="auto"/>
+      </w:pPr>
       <w:r>
-        <w:t>Para responder esta pregunta, se trabajo con datos reales y publicos del INEGI. El uso de una fuente oficial permite que el análisis sea reproducible y que las conclusiones se basen en evidencia. La idea fue avanzar desde la comprension del problema hasta el modelado, sin perder de vista que el resultado final debe servir para interpretar y prevenir.</w:t>
+        <w:t>Para responder esta pregunta, se trabajo con datos reales y públicos del INEGI. El uso de una fuente oficial permite que el análisis sea reproducible y que las conclusiones se basen en evidencia. La idea fue avanzar desde la comprension del problema hasta el modelado, sin perder de vista que el resultado final debe servir para interpretar y prevenir.</w:t>
       </w:r>
     </w:p>
     <w:p>
@@ -156,17 +184,23 @@
         <w:pStyle w:val="Heading1"/>
       </w:pPr>
       <w:r>
-        <w:t>2. Descripcion del dataset</w:t>
+        <w:t>2. Descripción del dataset</w:t>
       </w:r>
     </w:p>
     <w:p>
+      <w:pPr>
+        <w:spacing w:after="120" w:line="252" w:lineRule="auto"/>
+      </w:pPr>
       <w:r>
         <w:t>La base utilizada fue Accidentes de Tránsito Terrestre en Zonas Urbanas y Suburbanas (ATUS), publicada por el Instituto Nacional de Estadistica y Geografia. Se trabajaron los archivos anuales de 2015 a 2024, lo que permite observar una década completa de comportamiento.</w:t>
       </w:r>
     </w:p>
     <w:p>
+      <w:pPr>
+        <w:spacing w:after="120" w:line="252" w:lineRule="auto"/>
+      </w:pPr>
       <w:r>
-        <w:t>Los datos originales incluyen accidentes de todo Mexico. Para este proyecto se filtro solamente el estado de Sonora, identificado con la clave de entidad 26. También se uso el catálogo municipal para agregar el nombre del municipio a partir de la clave de entidad y municipio.</w:t>
+        <w:t>Los datos originales incluyen accidentes de todo Mexico. Para este proyecto se filtro solamente el estado de Sonora, identificado con la clave de entidad 26. También se uso el catalogo municipal para agregar el nombre del municipio a partir de la clave de entidad y municipio.</w:t>
       </w:r>
     </w:p>
     <w:tbl>
@@ -177,23 +211,22 @@
         <w:tblLook w:firstColumn="1" w:firstRow="1" w:lastColumn="0" w:lastRow="0" w:noHBand="0" w:noVBand="1" w:val="04A0"/>
       </w:tblPr>
       <w:tblGrid>
-        <w:gridCol w:w="4968"/>
-        <w:gridCol w:w="4968"/>
+        <w:gridCol w:w="4896"/>
+        <w:gridCol w:w="4896"/>
       </w:tblGrid>
       <w:tr>
         <w:tc>
           <w:tcPr>
-            <w:tcW w:type="dxa" w:w="4968"/>
+            <w:tcW w:type="dxa" w:w="4896"/>
             <w:vAlign w:val="center"/>
             <w:shd w:fill="207E76"/>
           </w:tcPr>
           <w:p>
-            <w:r/>
             <w:r>
               <w:rPr>
                 <w:b/>
                 <w:color w:val="FFFFFF"/>
-                <w:sz w:val="18"/>
+                <w:sz w:val="17"/>
               </w:rPr>
               <w:t>Elemento</w:t>
             </w:r>
@@ -201,17 +234,16 @@
         </w:tc>
         <w:tc>
           <w:tcPr>
-            <w:tcW w:type="dxa" w:w="4968"/>
+            <w:tcW w:type="dxa" w:w="4896"/>
             <w:vAlign w:val="center"/>
             <w:shd w:fill="207E76"/>
           </w:tcPr>
           <w:p>
-            <w:r/>
             <w:r>
               <w:rPr>
                 <w:b/>
                 <w:color w:val="FFFFFF"/>
-                <w:sz w:val="18"/>
+                <w:sz w:val="17"/>
               </w:rPr>
               <w:t>Resultado</w:t>
             </w:r>
@@ -221,15 +253,13 @@
       <w:tr>
         <w:tc>
           <w:tcPr>
-            <w:tcW w:type="dxa" w:w="4968"/>
+            <w:tcW w:type="dxa" w:w="4896"/>
             <w:vAlign w:val="center"/>
           </w:tcPr>
           <w:p>
-            <w:r/>
             <w:r>
               <w:rPr>
-                <w:b w:val="0"/>
-                <w:sz w:val="18"/>
+                <w:sz w:val="17"/>
               </w:rPr>
               <w:t>Periodo cubierto</w:t>
             </w:r>
@@ -237,15 +267,16 @@
         </w:tc>
         <w:tc>
           <w:tcPr>
-            <w:tcW w:type="dxa" w:w="4968"/>
+            <w:tcW w:type="dxa" w:w="4896"/>
             <w:vAlign w:val="center"/>
           </w:tcPr>
           <w:p>
-            <w:r/>
+            <w:pPr>
+              <w:jc w:val="center"/>
+            </w:pPr>
             <w:r>
               <w:rPr>
-                <w:b w:val="0"/>
-                <w:sz w:val="18"/>
+                <w:sz w:val="17"/>
               </w:rPr>
               <w:t>2015-2024</w:t>
             </w:r>
@@ -255,15 +286,13 @@
       <w:tr>
         <w:tc>
           <w:tcPr>
-            <w:tcW w:type="dxa" w:w="4968"/>
+            <w:tcW w:type="dxa" w:w="4896"/>
             <w:vAlign w:val="center"/>
           </w:tcPr>
           <w:p>
-            <w:r/>
             <w:r>
               <w:rPr>
-                <w:b w:val="0"/>
-                <w:sz w:val="18"/>
+                <w:sz w:val="17"/>
               </w:rPr>
               <w:t>Registros de Sonora antes de depurar</w:t>
             </w:r>
@@ -271,15 +300,16 @@
         </w:tc>
         <w:tc>
           <w:tcPr>
-            <w:tcW w:type="dxa" w:w="4968"/>
+            <w:tcW w:type="dxa" w:w="4896"/>
             <w:vAlign w:val="center"/>
           </w:tcPr>
           <w:p>
-            <w:r/>
+            <w:pPr>
+              <w:jc w:val="center"/>
+            </w:pPr>
             <w:r>
               <w:rPr>
-                <w:b w:val="0"/>
-                <w:sz w:val="18"/>
+                <w:sz w:val="17"/>
               </w:rPr>
               <w:t>187,104</w:t>
             </w:r>
@@ -289,15 +319,13 @@
       <w:tr>
         <w:tc>
           <w:tcPr>
-            <w:tcW w:type="dxa" w:w="4968"/>
+            <w:tcW w:type="dxa" w:w="4896"/>
             <w:vAlign w:val="center"/>
           </w:tcPr>
           <w:p>
-            <w:r/>
             <w:r>
               <w:rPr>
-                <w:b w:val="0"/>
-                <w:sz w:val="18"/>
+                <w:sz w:val="17"/>
               </w:rPr>
               <w:t>Registros Certificado cero eliminados</w:t>
             </w:r>
@@ -305,15 +333,16 @@
         </w:tc>
         <w:tc>
           <w:tcPr>
-            <w:tcW w:type="dxa" w:w="4968"/>
+            <w:tcW w:type="dxa" w:w="4896"/>
             <w:vAlign w:val="center"/>
           </w:tcPr>
           <w:p>
-            <w:r/>
+            <w:pPr>
+              <w:jc w:val="center"/>
+            </w:pPr>
             <w:r>
               <w:rPr>
-                <w:b w:val="0"/>
-                <w:sz w:val="18"/>
+                <w:sz w:val="17"/>
               </w:rPr>
               <w:t>3,193</w:t>
             </w:r>
@@ -323,15 +352,13 @@
       <w:tr>
         <w:tc>
           <w:tcPr>
-            <w:tcW w:type="dxa" w:w="4968"/>
+            <w:tcW w:type="dxa" w:w="4896"/>
             <w:vAlign w:val="center"/>
           </w:tcPr>
           <w:p>
-            <w:r/>
             <w:r>
               <w:rPr>
-                <w:b w:val="0"/>
-                <w:sz w:val="18"/>
+                <w:sz w:val="17"/>
               </w:rPr>
               <w:t>Accidentes reales analizados</w:t>
             </w:r>
@@ -339,15 +366,16 @@
         </w:tc>
         <w:tc>
           <w:tcPr>
-            <w:tcW w:type="dxa" w:w="4968"/>
+            <w:tcW w:type="dxa" w:w="4896"/>
             <w:vAlign w:val="center"/>
           </w:tcPr>
           <w:p>
-            <w:r/>
+            <w:pPr>
+              <w:jc w:val="center"/>
+            </w:pPr>
             <w:r>
               <w:rPr>
-                <w:b w:val="0"/>
-                <w:sz w:val="18"/>
+                <w:sz w:val="17"/>
               </w:rPr>
               <w:t>183,911</w:t>
             </w:r>
@@ -357,15 +385,13 @@
       <w:tr>
         <w:tc>
           <w:tcPr>
-            <w:tcW w:type="dxa" w:w="4968"/>
+            <w:tcW w:type="dxa" w:w="4896"/>
             <w:vAlign w:val="center"/>
           </w:tcPr>
           <w:p>
-            <w:r/>
             <w:r>
               <w:rPr>
-                <w:b w:val="0"/>
-                <w:sz w:val="18"/>
+                <w:sz w:val="17"/>
               </w:rPr>
               <w:t>Municipios presentes</w:t>
             </w:r>
@@ -373,15 +399,16 @@
         </w:tc>
         <w:tc>
           <w:tcPr>
-            <w:tcW w:type="dxa" w:w="4968"/>
+            <w:tcW w:type="dxa" w:w="4896"/>
             <w:vAlign w:val="center"/>
           </w:tcPr>
           <w:p>
-            <w:r/>
+            <w:pPr>
+              <w:jc w:val="center"/>
+            </w:pPr>
             <w:r>
               <w:rPr>
-                <w:b w:val="0"/>
-                <w:sz w:val="18"/>
+                <w:sz w:val="17"/>
               </w:rPr>
               <w:t>70</w:t>
             </w:r>
@@ -391,15 +418,13 @@
       <w:tr>
         <w:tc>
           <w:tcPr>
-            <w:tcW w:type="dxa" w:w="4968"/>
+            <w:tcW w:type="dxa" w:w="4896"/>
             <w:vAlign w:val="center"/>
           </w:tcPr>
           <w:p>
-            <w:r/>
             <w:r>
               <w:rPr>
-                <w:b w:val="0"/>
-                <w:sz w:val="18"/>
+                <w:sz w:val="17"/>
               </w:rPr>
               <w:t>Porcentaje de accidentes graves</w:t>
             </w:r>
@@ -407,15 +432,16 @@
         </w:tc>
         <w:tc>
           <w:tcPr>
-            <w:tcW w:type="dxa" w:w="4968"/>
+            <w:tcW w:type="dxa" w:w="4896"/>
             <w:vAlign w:val="center"/>
           </w:tcPr>
           <w:p>
-            <w:r/>
+            <w:pPr>
+              <w:jc w:val="center"/>
+            </w:pPr>
             <w:r>
               <w:rPr>
-                <w:b w:val="0"/>
-                <w:sz w:val="18"/>
+                <w:sz w:val="17"/>
               </w:rPr>
               <w:t>16.99%</w:t>
             </w:r>
@@ -425,11 +451,17 @@
     </w:tbl>
     <w:p/>
     <w:p>
+      <w:pPr>
+        <w:spacing w:after="120" w:line="252" w:lineRule="auto"/>
+      </w:pPr>
       <w:r>
-        <w:t>Las variables disponibles incluyen información geografica, temporal, categorica y numerica. Entre las variables más importantes estan municipio, ano, mes, dia de semana, hora, tipo de accidente, causa probable, tipo de vehículos involucrados, personas heridas y personas fallecidas.</w:t>
+        <w:t>Las variables disponibles incluyen información geografica, temporal, categorica y numerica. Entre las variables más importantes estan municipio, año, mes, dia de semana, hora, tipo de accidente, causa probable, tipo de vehículos involucrados, personas heridas y personas fallecidas.</w:t>
       </w:r>
     </w:p>
     <w:p>
+      <w:pPr>
+        <w:spacing w:after="120" w:line="252" w:lineRule="auto"/>
+      </w:pPr>
       <w:r>
         <w:t>Para facilitar el análisis se crearon variables derivadas. La variable REGION permite comparar zonas de Sonora. TOTAL_HERIDOS, TOTAL_MUERTOS y TOTAL_VICTIMAS resumen el impacto humano del accidente. GRAVE_BIN clasifica si el accidente tuvo victimas. RANGO_HORA agrupa la hora del accidente en madrugada, manana, tarde y noche. INVOLUCRA_MOTO e INVOLUCRA_BICI indican si participaron motocicletas o bicicletas.</w:t>
       </w:r>
@@ -443,26 +475,41 @@
       </w:r>
     </w:p>
     <w:p>
+      <w:pPr>
+        <w:spacing w:after="120" w:line="252" w:lineRule="auto"/>
+      </w:pPr>
       <w:r>
         <w:t>La preparación inicio con la lectura de los CSV anuales. Para que el proyecto fuera reproducible, los notebooks se configuraron para cargar los archivos desde GitHub o desde una copia local. Despues se filtro Sonora y se eliminaron registros de Certificado cero, porque esos registros indican ausencia de accidente y no representan eventos viales ocurridos.</w:t>
       </w:r>
     </w:p>
     <w:p>
+      <w:pPr>
+        <w:spacing w:after="120" w:line="252" w:lineRule="auto"/>
+      </w:pPr>
       <w:r>
-        <w:t>También se convirtieron variables numericas que venian como texto. Esto fue necesario para sumar heridos, fallecidos y vehículos involucrados. Las claves de entidad y municipio se normalizaron con ceros a la izquierda para unir correctamente con el catálogo municipal.</w:t>
+        <w:t>También se convirtieron variables numericas que venian como texto. Esto fue necesario para sumar heridos, fallecidos y vehículos involucrados. Las claves de entidad y municipio se normalizaron con ceros a la izquierda para unir correctamente con el catalogo municipal.</w:t>
       </w:r>
     </w:p>
     <w:p>
+      <w:pPr>
+        <w:spacing w:after="120" w:line="252" w:lineRule="auto"/>
+      </w:pPr>
       <w:r>
-        <w:t>En calidad de datos se detectaron valores faltantes principalmente en la edad del conductor. Esta variable se conservo, pero en los modelos se trato con imputacion de mediana. En variables categoricas se uso imputacion por moda. Esta decision permite no perder registros y mantiene el dataset completo para el modelado.</w:t>
+        <w:t>En calidad de datos se detectaron valores faltantes principalmente en la edad del conductor. Esta variable se conservo, pero en los modelos se trato con imputacion de mediana. En variables categoricas se uso imputacion por moda. Está decision permite no perder registros y mantiene el dataset completo para el modelado.</w:t>
       </w:r>
     </w:p>
     <w:p>
+      <w:pPr>
+        <w:spacing w:after="120" w:line="252" w:lineRule="auto"/>
+      </w:pPr>
       <w:r>
         <w:t>Se identificaron 274 duplicados exactos. Debido al tamaño del dataset, su presencia no cambia de forma importante el análisis exploratorio, pero se documentaron como parte de la calidad de datos. Para modelado final, se recomienda eliminarlos si el objetivo es entrenar modelos de produccion.</w:t>
       </w:r>
     </w:p>
     <w:p>
+      <w:pPr>
+        <w:spacing w:after="120" w:line="252" w:lineRule="auto"/>
+      </w:pPr>
       <w:r>
         <w:t>Los outliers se conservaron. En este problema, los valores extremos no son ruido automaticamente: un accidente con muchos heridos, fallecidos o vehículos involucrados puede ser justamente el caso que más interesa prevenir. Eliminar esos registros hubiera reducido la capacidad del análisis para estudiar la gravedad.</w:t>
       </w:r>
@@ -476,31 +523,49 @@
       </w:r>
     </w:p>
     <w:p>
+      <w:pPr>
+        <w:spacing w:after="120" w:line="252" w:lineRule="auto"/>
+      </w:pPr>
       <w:r>
-        <w:t>El análisis exploratorio permitio conocer el comportamiento general antes de aplicar modelos. El primer hallazgo fue temporal: los accidentes aumentaron de manera gradual hasta 2019, bajaron en 2020 y subieron con fuerza despues de ese ano. El valor más alto se observo en 2023, con 26,557 accidentes.</w:t>
+        <w:t>El análisis exploratorio permitio conocer el comportamiento general antes de aplicar modelos. El primer hallazgo fue temporal: los accidentes aumentaron de manera gradual hasta 2019, bajaron en 2020 y subieron con fuerza despues de ese año. El valor más alto se observo en 2023, con 26,557 accidentes.</w:t>
       </w:r>
     </w:p>
     <w:p>
+      <w:pPr>
+        <w:spacing w:after="120" w:line="252" w:lineRule="auto"/>
+      </w:pPr>
       <w:r>
         <w:t>Por región, Hermosillo concentro 65,252 accidentes, seguido por Sur y Valle con 54,154 y Frontera con 44,264. Este resultado era esperado porque son zonas con mayor movilidad urbana, actividad económica o flujo vehicular. Sin embargo, la gravedad conto una historia diferente.</w:t>
       </w:r>
     </w:p>
     <w:p>
+      <w:pPr>
+        <w:spacing w:after="120" w:line="252" w:lineRule="auto"/>
+      </w:pPr>
       <w:r>
         <w:t>Cuando se reviso el porcentaje de accidentes graves, la Sierra tuvo 24.25%, Centro 22.38% y Sur y Valle 21.12%. Hermosillo, aunque tiene el mayor volumen de accidentes, tuvo 13.39% de accidentes graves. Esto muestra que la prevención debe mirar tanto cantidad como severidad.</w:t>
       </w:r>
     </w:p>
     <w:p>
+      <w:pPr>
+        <w:spacing w:after="120" w:line="252" w:lineRule="auto"/>
+      </w:pPr>
       <w:r>
-        <w:t>El tipo de accidente más frecuente fue la colisión con vehículo automotor, con 125,202 casos. En segundo lugar aparecio la colisión con motocicleta, con 18,531 casos, y despues la colisión con objeto fijo, con 17,205 casos. Estos resultados sugieren que una parte importante de la prevención debe enfocarse en interacciones entre vehículos, control de velocidad, distancia segura y puntos de conflicto urbano.</w:t>
+        <w:t>El tipo de accidente más frecuente fue la colision con vehículo automotor, con 125,202 casos. En segundo lugar aparecio la colision con motocicleta, con 18,531 casos, y despues la colision con objeto fijo, con 17,205 casos. Estos resultados sugieren que una parte importante de la prevención debe enfocarse en interacciones entre vehículos, control de velocidad, distancia segura y puntos de conflicto urbano.</w:t>
       </w:r>
     </w:p>
     <w:p>
+      <w:pPr>
+        <w:spacing w:after="120" w:line="252" w:lineRule="auto"/>
+      </w:pPr>
       <w:r>
-        <w:t>La causa probable más registrada fue Conductor, con 178,145 accidentes. Aunque esta categoria es amplia, indica que las estrategias preventivas deben considerar conducta vial, atencion al volante, respeto a señalamientos, velocidad y educacion vial.</w:t>
+        <w:t>La causa probable más registrada fue Conductor, con 178,145 accidentes. Aunque está categoria es amplia, indica que las estrategias preventivas deben considerar conducta vial, atencion al volante, respeto a señalamientos, velocidad y educacion vial.</w:t>
       </w:r>
     </w:p>
     <w:p>
+      <w:pPr>
+        <w:spacing w:after="120" w:line="252" w:lineRule="auto"/>
+      </w:pPr>
       <w:r>
         <w:t>El análisis por hora y dia mostro una concentracion relevante los viernes por la tarde, con 10,802 accidentes. Este patron puede relacionarse con salida laboral, movilidad comercial y traslados de fin de semana. A nivel preventivo, este resultado sugiere reforzar vigilancia, campanas y control operativo en horarios especificos.</w:t>
       </w:r>
@@ -510,30 +575,45 @@
         <w:pStyle w:val="Heading1"/>
       </w:pPr>
       <w:r>
-        <w:t>5. Metodologia de modelado</w:t>
+        <w:t>5. Metodología de modelado</w:t>
       </w:r>
     </w:p>
     <w:p>
+      <w:pPr>
+        <w:spacing w:after="120" w:line="252" w:lineRule="auto"/>
+      </w:pPr>
       <w:r>
         <w:t>La etapa de modelado se diseno para cubrir tres necesidades: tener una linea base simple, construir un modelo más fuerte de clasificación y agregar un metodo diferente para entender la estructura del dataset.</w:t>
       </w:r>
     </w:p>
     <w:p>
+      <w:pPr>
+        <w:spacing w:after="120" w:line="252" w:lineRule="auto"/>
+      </w:pPr>
       <w:r>
-        <w:t>La variable objetivo fue GRAVE_BIN. Esta variable vale 1 si el accidente tuvo personas heridas o fallecidas, y 0 si no tuvo victimas. Se eligio esta definicion porque el enfoque del proyecto es preventivo: interesa distinguir los accidentes que generan mayor impacto humano.</w:t>
+        <w:t>La variable objetivo fue GRAVE_BIN. Esta variable vale 1 si el accidente tuvo personas heridas o fallecidas, y 0 si no tuvo victimas. Se eligio esta definición porque el enfoque del proyecto es preventivo: interesa distinguir los accidentes que generan mayor impacto humano.</w:t>
       </w:r>
     </w:p>
     <w:p>
+      <w:pPr>
+        <w:spacing w:after="120" w:line="252" w:lineRule="auto"/>
+      </w:pPr>
       <w:r>
         <w:t>Para evitar fuga de información, no se usaron como predictores las columnas TOTAL_HERIDOS, TOTAL_MUERTOS, TOTAL_VICTIMAS ni CLASACC, porque estan directamente relacionadas con la definicion de gravedad. Si se usaran, el modelo recibiria parte de la respuesta de forma indirecta.</w:t>
       </w:r>
     </w:p>
     <w:p>
+      <w:pPr>
+        <w:spacing w:after="120" w:line="252" w:lineRule="auto"/>
+      </w:pPr>
       <w:r>
-        <w:t>Las variables predictoras incluyeron región, municipio, mes, dia de semana, rango de hora, tipo de accidente, causa probable, tipo de camino o superficie, sexo, aliento, cinturon, edad del conductor, total de vehículos, participación de motocicleta y participación de bicicleta.</w:t>
+        <w:t>Las variables predictoras incluyeron región, municipio, mes, dia de semana, rango de hora, tipo de accidente, causa probable, tipo de camino o superficie, sexo, aliento, cinturon, edad del conductor, total de vehículos, participacion de motocicleta y participacion de bicicleta.</w:t>
       </w:r>
     </w:p>
     <w:p>
+      <w:pPr>
+        <w:spacing w:after="120" w:line="252" w:lineRule="auto"/>
+      </w:pPr>
       <w:r>
         <w:t>Para el preprocesamiento se uso imputacion de faltantes, codificacion One-Hot para variables categoricas y normalizacion para variables numericas. Despues se dividieron los datos en entrenamiento y prueba con estratificacion, para mantener una proporcion parecida de accidentes graves y no graves.</w:t>
       </w:r>
@@ -554,24 +634,23 @@
         <w:tblLook w:firstColumn="1" w:firstRow="1" w:lastColumn="0" w:lastRow="0" w:noHBand="0" w:noVBand="1" w:val="04A0"/>
       </w:tblPr>
       <w:tblGrid>
-        <w:gridCol w:w="3312"/>
-        <w:gridCol w:w="3312"/>
-        <w:gridCol w:w="3312"/>
+        <w:gridCol w:w="3264"/>
+        <w:gridCol w:w="3264"/>
+        <w:gridCol w:w="3264"/>
       </w:tblGrid>
       <w:tr>
         <w:tc>
           <w:tcPr>
-            <w:tcW w:type="dxa" w:w="3312"/>
+            <w:tcW w:type="dxa" w:w="3264"/>
             <w:vAlign w:val="center"/>
             <w:shd w:fill="207E76"/>
           </w:tcPr>
           <w:p>
-            <w:r/>
             <w:r>
               <w:rPr>
                 <w:b/>
                 <w:color w:val="FFFFFF"/>
-                <w:sz w:val="18"/>
+                <w:sz w:val="17"/>
               </w:rPr>
               <w:t>Modelo</w:t>
             </w:r>
@@ -579,17 +658,16 @@
         </w:tc>
         <w:tc>
           <w:tcPr>
-            <w:tcW w:type="dxa" w:w="3312"/>
+            <w:tcW w:type="dxa" w:w="3264"/>
             <w:vAlign w:val="center"/>
             <w:shd w:fill="207E76"/>
           </w:tcPr>
           <w:p>
-            <w:r/>
             <w:r>
               <w:rPr>
                 <w:b/>
                 <w:color w:val="FFFFFF"/>
-                <w:sz w:val="18"/>
+                <w:sz w:val="17"/>
               </w:rPr>
               <w:t>Tipo</w:t>
             </w:r>
@@ -597,17 +675,16 @@
         </w:tc>
         <w:tc>
           <w:tcPr>
-            <w:tcW w:type="dxa" w:w="3312"/>
+            <w:tcW w:type="dxa" w:w="3264"/>
             <w:vAlign w:val="center"/>
             <w:shd w:fill="207E76"/>
           </w:tcPr>
           <w:p>
-            <w:r/>
             <w:r>
               <w:rPr>
                 <w:b/>
                 <w:color w:val="FFFFFF"/>
-                <w:sz w:val="18"/>
+                <w:sz w:val="17"/>
               </w:rPr>
               <w:t>Funcion dentro del proyecto</w:t>
             </w:r>
@@ -617,49 +694,49 @@
       <w:tr>
         <w:tc>
           <w:tcPr>
-            <w:tcW w:type="dxa" w:w="3312"/>
+            <w:tcW w:type="dxa" w:w="3264"/>
             <w:vAlign w:val="center"/>
           </w:tcPr>
           <w:p>
-            <w:r/>
             <w:r>
               <w:rPr>
-                <w:b w:val="0"/>
-                <w:sz w:val="18"/>
+                <w:sz w:val="17"/>
               </w:rPr>
-              <w:t>árbol de Decision base</w:t>
+              <w:t>KNN linea base</w:t>
             </w:r>
           </w:p>
         </w:tc>
         <w:tc>
           <w:tcPr>
-            <w:tcW w:type="dxa" w:w="3312"/>
+            <w:tcW w:type="dxa" w:w="3264"/>
             <w:vAlign w:val="center"/>
           </w:tcPr>
           <w:p>
-            <w:r/>
+            <w:pPr>
+              <w:jc w:val="center"/>
+            </w:pPr>
             <w:r>
               <w:rPr>
-                <w:b w:val="0"/>
-                <w:sz w:val="18"/>
+                <w:sz w:val="17"/>
               </w:rPr>
-              <w:t>Clasificacion supervisada</w:t>
+              <w:t>Clasificación supervisada basada en vecinos</w:t>
             </w:r>
           </w:p>
         </w:tc>
         <w:tc>
           <w:tcPr>
-            <w:tcW w:type="dxa" w:w="3312"/>
+            <w:tcW w:type="dxa" w:w="3264"/>
             <w:vAlign w:val="center"/>
           </w:tcPr>
           <w:p>
-            <w:r/>
+            <w:pPr>
+              <w:jc w:val="center"/>
+            </w:pPr>
             <w:r>
               <w:rPr>
-                <w:b w:val="0"/>
-                <w:sz w:val="18"/>
+                <w:sz w:val="17"/>
               </w:rPr>
-              <w:t>Sirve como linea base simple con parametros por defecto</w:t>
+              <w:t>Cumple el metodo de K-Nearest Neighbors del curso y sirve como referencia simple</w:t>
             </w:r>
           </w:p>
         </w:tc>
@@ -667,15 +744,63 @@
       <w:tr>
         <w:tc>
           <w:tcPr>
-            <w:tcW w:type="dxa" w:w="3312"/>
+            <w:tcW w:type="dxa" w:w="3264"/>
             <w:vAlign w:val="center"/>
           </w:tcPr>
           <w:p>
-            <w:r/>
             <w:r>
               <w:rPr>
-                <w:b w:val="0"/>
-                <w:sz w:val="18"/>
+                <w:sz w:val="17"/>
+              </w:rPr>
+              <w:t>árbol de Decision interpretable</w:t>
+            </w:r>
+          </w:p>
+        </w:tc>
+        <w:tc>
+          <w:tcPr>
+            <w:tcW w:type="dxa" w:w="3264"/>
+            <w:vAlign w:val="center"/>
+          </w:tcPr>
+          <w:p>
+            <w:pPr>
+              <w:jc w:val="center"/>
+            </w:pPr>
+            <w:r>
+              <w:rPr>
+                <w:sz w:val="17"/>
+              </w:rPr>
+              <w:t>Clasificación supervisada</w:t>
+            </w:r>
+          </w:p>
+        </w:tc>
+        <w:tc>
+          <w:tcPr>
+            <w:tcW w:type="dxa" w:w="3264"/>
+            <w:vAlign w:val="center"/>
+          </w:tcPr>
+          <w:p>
+            <w:pPr>
+              <w:jc w:val="center"/>
+            </w:pPr>
+            <w:r>
+              <w:rPr>
+                <w:sz w:val="17"/>
+              </w:rPr>
+              <w:t>Sirve para extraer una regla IF-THEN y explicar una decision del modelo</w:t>
+            </w:r>
+          </w:p>
+        </w:tc>
+      </w:tr>
+      <w:tr>
+        <w:tc>
+          <w:tcPr>
+            <w:tcW w:type="dxa" w:w="3264"/>
+            <w:vAlign w:val="center"/>
+          </w:tcPr>
+          <w:p>
+            <w:r>
+              <w:rPr>
+                <w:sz w:val="17"/>
               </w:rPr>
               <w:t>Regresion Logística</w:t>
             </w:r>
@@ -683,31 +808,33 @@
         </w:tc>
         <w:tc>
           <w:tcPr>
-            <w:tcW w:type="dxa" w:w="3312"/>
+            <w:tcW w:type="dxa" w:w="3264"/>
             <w:vAlign w:val="center"/>
           </w:tcPr>
           <w:p>
-            <w:r/>
+            <w:pPr>
+              <w:jc w:val="center"/>
+            </w:pPr>
             <w:r>
               <w:rPr>
-                <w:b w:val="0"/>
-                <w:sz w:val="18"/>
+                <w:sz w:val="17"/>
               </w:rPr>
-              <w:t>Clasificacion supervisada interpretable</w:t>
+              <w:t>Clasificación supervisada interpretable</w:t>
             </w:r>
           </w:p>
         </w:tc>
         <w:tc>
           <w:tcPr>
-            <w:tcW w:type="dxa" w:w="3312"/>
+            <w:tcW w:type="dxa" w:w="3264"/>
             <w:vAlign w:val="center"/>
           </w:tcPr>
           <w:p>
-            <w:r/>
+            <w:pPr>
+              <w:jc w:val="center"/>
+            </w:pPr>
             <w:r>
               <w:rPr>
-                <w:b w:val="0"/>
-                <w:sz w:val="18"/>
+                <w:sz w:val="17"/>
               </w:rPr>
               <w:t>Permite comparar con un modelo claro y facil de explicar</w:t>
             </w:r>
@@ -717,15 +844,13 @@
       <w:tr>
         <w:tc>
           <w:tcPr>
-            <w:tcW w:type="dxa" w:w="3312"/>
+            <w:tcW w:type="dxa" w:w="3264"/>
             <w:vAlign w:val="center"/>
           </w:tcPr>
           <w:p>
-            <w:r/>
             <w:r>
               <w:rPr>
-                <w:b w:val="0"/>
-                <w:sz w:val="18"/>
+                <w:sz w:val="17"/>
               </w:rPr>
               <w:t>Random Forest ajustado</w:t>
             </w:r>
@@ -733,31 +858,33 @@
         </w:tc>
         <w:tc>
           <w:tcPr>
-            <w:tcW w:type="dxa" w:w="3312"/>
+            <w:tcW w:type="dxa" w:w="3264"/>
             <w:vAlign w:val="center"/>
           </w:tcPr>
           <w:p>
-            <w:r/>
+            <w:pPr>
+              <w:jc w:val="center"/>
+            </w:pPr>
             <w:r>
               <w:rPr>
-                <w:b w:val="0"/>
-                <w:sz w:val="18"/>
+                <w:sz w:val="17"/>
               </w:rPr>
-              <w:t>Clasificacion supervisada elaborada</w:t>
+              <w:t>Clasificación supervisada elaborada</w:t>
             </w:r>
           </w:p>
         </w:tc>
         <w:tc>
           <w:tcPr>
-            <w:tcW w:type="dxa" w:w="3312"/>
+            <w:tcW w:type="dxa" w:w="3264"/>
             <w:vAlign w:val="center"/>
           </w:tcPr>
           <w:p>
-            <w:r/>
+            <w:pPr>
+              <w:jc w:val="center"/>
+            </w:pPr>
             <w:r>
               <w:rPr>
-                <w:b w:val="0"/>
-                <w:sz w:val="18"/>
+                <w:sz w:val="17"/>
               </w:rPr>
               <w:t>Busca mejor rendimiento con ajuste de hiperparametros</w:t>
             </w:r>
@@ -767,15 +894,13 @@
       <w:tr>
         <w:tc>
           <w:tcPr>
-            <w:tcW w:type="dxa" w:w="3312"/>
+            <w:tcW w:type="dxa" w:w="3264"/>
             <w:vAlign w:val="center"/>
           </w:tcPr>
           <w:p>
-            <w:r/>
             <w:r>
               <w:rPr>
-                <w:b w:val="0"/>
-                <w:sz w:val="18"/>
+                <w:sz w:val="17"/>
               </w:rPr>
               <w:t>Clustering jerárquico</w:t>
             </w:r>
@@ -783,15 +908,16 @@
         </w:tc>
         <w:tc>
           <w:tcPr>
-            <w:tcW w:type="dxa" w:w="3312"/>
+            <w:tcW w:type="dxa" w:w="3264"/>
             <w:vAlign w:val="center"/>
           </w:tcPr>
           <w:p>
-            <w:r/>
+            <w:pPr>
+              <w:jc w:val="center"/>
+            </w:pPr>
             <w:r>
               <w:rPr>
-                <w:b w:val="0"/>
-                <w:sz w:val="18"/>
+                <w:sz w:val="17"/>
               </w:rPr>
               <w:t>Aprendizaje no supervisado</w:t>
             </w:r>
@@ -799,15 +925,16 @@
         </w:tc>
         <w:tc>
           <w:tcPr>
-            <w:tcW w:type="dxa" w:w="3312"/>
+            <w:tcW w:type="dxa" w:w="3264"/>
             <w:vAlign w:val="center"/>
           </w:tcPr>
           <w:p>
-            <w:r/>
+            <w:pPr>
+              <w:jc w:val="center"/>
+            </w:pPr>
             <w:r>
               <w:rPr>
-                <w:b w:val="0"/>
-                <w:sz w:val="18"/>
+                <w:sz w:val="17"/>
               </w:rPr>
               <w:t>Agrupa municipios con patrones parecidos</w:t>
             </w:r>
@@ -817,15 +944,13 @@
       <w:tr>
         <w:tc>
           <w:tcPr>
-            <w:tcW w:type="dxa" w:w="3312"/>
+            <w:tcW w:type="dxa" w:w="3264"/>
             <w:vAlign w:val="center"/>
           </w:tcPr>
           <w:p>
-            <w:r/>
             <w:r>
               <w:rPr>
-                <w:b w:val="0"/>
-                <w:sz w:val="18"/>
+                <w:sz w:val="17"/>
               </w:rPr>
               <w:t>Reglas de asociación</w:t>
             </w:r>
@@ -833,15 +958,16 @@
         </w:tc>
         <w:tc>
           <w:tcPr>
-            <w:tcW w:type="dxa" w:w="3312"/>
+            <w:tcW w:type="dxa" w:w="3264"/>
             <w:vAlign w:val="center"/>
           </w:tcPr>
           <w:p>
-            <w:r/>
+            <w:pPr>
+              <w:jc w:val="center"/>
+            </w:pPr>
             <w:r>
               <w:rPr>
-                <w:b w:val="0"/>
-                <w:sz w:val="18"/>
+                <w:sz w:val="17"/>
               </w:rPr>
               <w:t>Metodo descriptivo</w:t>
             </w:r>
@@ -849,15 +975,16 @@
         </w:tc>
         <w:tc>
           <w:tcPr>
-            <w:tcW w:type="dxa" w:w="3312"/>
+            <w:tcW w:type="dxa" w:w="3264"/>
             <w:vAlign w:val="center"/>
           </w:tcPr>
           <w:p>
-            <w:r/>
+            <w:pPr>
+              <w:jc w:val="center"/>
+            </w:pPr>
             <w:r>
               <w:rPr>
-                <w:b w:val="0"/>
-                <w:sz w:val="18"/>
+                <w:sz w:val="17"/>
               </w:rPr>
               <w:t>Encuentra combinaciones frecuentes relacionadas con gravedad</w:t>
             </w:r>
@@ -867,26 +994,49 @@
     </w:tbl>
     <w:p/>
     <w:p>
+      <w:pPr>
+        <w:spacing w:after="120" w:line="252" w:lineRule="auto"/>
+      </w:pPr>
       <w:r>
-        <w:t>El árbol de Decision se uso como punto de partida. Es facil de entender, pero puede ser inestable y ajustarse demasiado a los datos si no se controla su profundidad. Aun asi, cumple bien la funcion de linea base.</w:t>
+        <w:t>KNN se agrego como linea base del curso. Este metodo clasifica un accidente segun los casos mas cercanos despues del preprocesamiento. Debido al tamaño del dataset y a la cantidad de variables categoricas codificadas, se uso como referencia tecnica y no como candidato principal de recomendacion.</w:t>
       </w:r>
     </w:p>
     <w:p>
+      <w:pPr>
+        <w:spacing w:after="120" w:line="252" w:lineRule="auto"/>
+      </w:pPr>
+      <w:r>
+        <w:t>El árbol de Decision se uso como modelo interpretable. A diferencia del Random Forest, permite leer rutas de decision concretas. Por eso se extrajo una regla IF-THEN para explicar de forma sencilla que combinaciones de condiciones llevan al modelo hacia una clasificacion de gravedad.</w:t>
+      </w:r>
+    </w:p>
+    <w:p>
+      <w:pPr>
+        <w:spacing w:after="120" w:line="252" w:lineRule="auto"/>
+      </w:pPr>
       <w:r>
         <w:t>La Regresion Logística se incluyo porque es interpretable. Aunque no siempre logra el mejor rendimiento, permite entender de forma más clara como cambian las probabilidades segun las variables. También se uso con pesos balanceados para dar mayor atencion a la clase grave.</w:t>
       </w:r>
     </w:p>
     <w:p>
+      <w:pPr>
+        <w:spacing w:after="120" w:line="252" w:lineRule="auto"/>
+      </w:pPr>
       <w:r>
         <w:t>El Random Forest ajustado fue el modelo más elaborado. Combina muchos arboles y reduce la dependencia de una sola estructura. Se ajustaron hiperparametros como número de arboles, profundidad, minimo de muestras por hoja, seleccion de variables y pesos de clase.</w:t>
       </w:r>
     </w:p>
     <w:p>
+      <w:pPr>
+        <w:spacing w:after="120" w:line="252" w:lineRule="auto"/>
+      </w:pPr>
       <w:r>
         <w:t>El clustering jerárquico se aplico a nivel municipal. En lugar de clasificar accidentes individuales, agrupa municipios segun indicadores como total de accidentes, porcentaje de gravedad, promedio de heridos, promedio de fallecidos, presencia de motocicletas, bicicletas y tipos de accidente.</w:t>
       </w:r>
     </w:p>
     <w:p>
+      <w:pPr>
+        <w:spacing w:after="120" w:line="252" w:lineRule="auto"/>
+      </w:pPr>
       <w:r>
         <w:t>Las reglas de asociación se usaron como complemento interpretativo. Este metodo ayuda a encontrar combinaciones frecuentes de condiciones que terminan en gravedad alta, por ejemplo cierto tipo de accidente o combinaciones de región, causa y horario.</w:t>
       </w:r>
@@ -896,22 +1046,31 @@
         <w:pStyle w:val="Heading1"/>
       </w:pPr>
       <w:r>
-        <w:t>7. Evaluacion de modelos</w:t>
+        <w:t>7. Evaluación de modelos</w:t>
       </w:r>
     </w:p>
     <w:p>
+      <w:pPr>
+        <w:spacing w:after="120" w:line="252" w:lineRule="auto"/>
+      </w:pPr>
       <w:r>
-        <w:t>La evaluacion de clasificación no se baso solamente en accuracy. En este problema, un modelo podria tener buen accuracy si clasifica bien los accidentes no graves, porque son la mayoria. Sin embargo, para seguridad vial importa especialmente la clase grave.</w:t>
+        <w:t>La evaluación de clasificación no se baso solamente en accuracy. En este problema, un modelo podría tener buen accuracy si clasifica bien los accidentes no graves, porque son la mayoria. Sin embargo, para seguridad vial importa especialmente la clase grave.</w:t>
       </w:r>
     </w:p>
     <w:p>
+      <w:pPr>
+        <w:spacing w:after="120" w:line="252" w:lineRule="auto"/>
+      </w:pPr>
       <w:r>
         <w:t>Por eso se revisaron precision, recall, F1-score, matriz de confusion, curva ROC y ROC-AUC. La precision indica que tan confiables son las predicciones positivas de gravedad. El recall indica cuantos accidentes graves reales logra detectar el modelo. El F1-score resume el equilibrio entre precision y recall.</w:t>
       </w:r>
     </w:p>
     <w:p>
+      <w:pPr>
+        <w:spacing w:after="120" w:line="252" w:lineRule="auto"/>
+      </w:pPr>
       <w:r>
-        <w:t>En la ejecucion documentada en E3, el Random Forest ajustado obtuvo el mejor F1 para la clase grave. La Regresion Logística tuvo el mayor recall, por lo que puede ser util si la prioridad principal es detectar la mayor cantidad posible de accidentes graves, aunque produzca más falsos positivos.</w:t>
+        <w:t>En la ejecucion documentada, el Random Forest ajustado obtuvo el mejor equilibrio para la clase grave. La Regresion Logística tuvo alto recall, por lo que puede ser util si la prioridad principal es detectar la mayor cantidad posible de accidentes graves, aunque produzca más falsos positivos. KNN y el árbol interpretable se conservaron como referencias del curso y como apoyo explicativo.</w:t>
       </w:r>
     </w:p>
     <w:tbl>
@@ -922,27 +1081,26 @@
         <w:tblLook w:firstColumn="1" w:firstRow="1" w:lastColumn="0" w:lastRow="0" w:noHBand="0" w:noVBand="1" w:val="04A0"/>
       </w:tblPr>
       <w:tblGrid>
-        <w:gridCol w:w="1656"/>
-        <w:gridCol w:w="1656"/>
-        <w:gridCol w:w="1656"/>
-        <w:gridCol w:w="1656"/>
-        <w:gridCol w:w="1656"/>
-        <w:gridCol w:w="1656"/>
+        <w:gridCol w:w="1632"/>
+        <w:gridCol w:w="1632"/>
+        <w:gridCol w:w="1632"/>
+        <w:gridCol w:w="1632"/>
+        <w:gridCol w:w="1632"/>
+        <w:gridCol w:w="1632"/>
       </w:tblGrid>
       <w:tr>
         <w:tc>
           <w:tcPr>
-            <w:tcW w:type="dxa" w:w="1656"/>
+            <w:tcW w:type="dxa" w:w="1632"/>
             <w:vAlign w:val="center"/>
             <w:shd w:fill="207E76"/>
           </w:tcPr>
           <w:p>
-            <w:r/>
             <w:r>
               <w:rPr>
                 <w:b/>
                 <w:color w:val="FFFFFF"/>
-                <w:sz w:val="18"/>
+                <w:sz w:val="17"/>
               </w:rPr>
               <w:t>Modelo</w:t>
             </w:r>
@@ -950,17 +1108,16 @@
         </w:tc>
         <w:tc>
           <w:tcPr>
-            <w:tcW w:type="dxa" w:w="1656"/>
+            <w:tcW w:type="dxa" w:w="1632"/>
             <w:vAlign w:val="center"/>
             <w:shd w:fill="207E76"/>
           </w:tcPr>
           <w:p>
-            <w:r/>
             <w:r>
               <w:rPr>
                 <w:b/>
                 <w:color w:val="FFFFFF"/>
-                <w:sz w:val="18"/>
+                <w:sz w:val="17"/>
               </w:rPr>
               <w:t>Accuracy</w:t>
             </w:r>
@@ -968,17 +1125,16 @@
         </w:tc>
         <w:tc>
           <w:tcPr>
-            <w:tcW w:type="dxa" w:w="1656"/>
+            <w:tcW w:type="dxa" w:w="1632"/>
             <w:vAlign w:val="center"/>
             <w:shd w:fill="207E76"/>
           </w:tcPr>
           <w:p>
-            <w:r/>
             <w:r>
               <w:rPr>
                 <w:b/>
                 <w:color w:val="FFFFFF"/>
-                <w:sz w:val="18"/>
+                <w:sz w:val="17"/>
               </w:rPr>
               <w:t>Precision grave</w:t>
             </w:r>
@@ -986,17 +1142,16 @@
         </w:tc>
         <w:tc>
           <w:tcPr>
-            <w:tcW w:type="dxa" w:w="1656"/>
+            <w:tcW w:type="dxa" w:w="1632"/>
             <w:vAlign w:val="center"/>
             <w:shd w:fill="207E76"/>
           </w:tcPr>
           <w:p>
-            <w:r/>
             <w:r>
               <w:rPr>
                 <w:b/>
                 <w:color w:val="FFFFFF"/>
-                <w:sz w:val="18"/>
+                <w:sz w:val="17"/>
               </w:rPr>
               <w:t>Recall grave</w:t>
             </w:r>
@@ -1004,17 +1159,16 @@
         </w:tc>
         <w:tc>
           <w:tcPr>
-            <w:tcW w:type="dxa" w:w="1656"/>
+            <w:tcW w:type="dxa" w:w="1632"/>
             <w:vAlign w:val="center"/>
             <w:shd w:fill="207E76"/>
           </w:tcPr>
           <w:p>
-            <w:r/>
             <w:r>
               <w:rPr>
                 <w:b/>
                 <w:color w:val="FFFFFF"/>
-                <w:sz w:val="18"/>
+                <w:sz w:val="17"/>
               </w:rPr>
               <w:t>F1 grave</w:t>
             </w:r>
@@ -1022,17 +1176,16 @@
         </w:tc>
         <w:tc>
           <w:tcPr>
-            <w:tcW w:type="dxa" w:w="1656"/>
+            <w:tcW w:type="dxa" w:w="1632"/>
             <w:vAlign w:val="center"/>
             <w:shd w:fill="207E76"/>
           </w:tcPr>
           <w:p>
-            <w:r/>
             <w:r>
               <w:rPr>
                 <w:b/>
                 <w:color w:val="FFFFFF"/>
-                <w:sz w:val="18"/>
+                <w:sz w:val="17"/>
               </w:rPr>
               <w:t>ROC-AUC</w:t>
             </w:r>
@@ -1042,97 +1195,100 @@
       <w:tr>
         <w:tc>
           <w:tcPr>
-            <w:tcW w:type="dxa" w:w="1656"/>
+            <w:tcW w:type="dxa" w:w="1632"/>
             <w:vAlign w:val="center"/>
           </w:tcPr>
           <w:p>
-            <w:r/>
             <w:r>
               <w:rPr>
-                <w:b w:val="0"/>
-                <w:sz w:val="18"/>
+                <w:sz w:val="17"/>
               </w:rPr>
-              <w:t>árbol de Decision base</w:t>
+              <w:t>KNN linea base</w:t>
             </w:r>
           </w:p>
         </w:tc>
         <w:tc>
           <w:tcPr>
-            <w:tcW w:type="dxa" w:w="1656"/>
+            <w:tcW w:type="dxa" w:w="1632"/>
             <w:vAlign w:val="center"/>
           </w:tcPr>
           <w:p>
-            <w:r/>
+            <w:pPr>
+              <w:jc w:val="center"/>
+            </w:pPr>
             <w:r>
               <w:rPr>
-                <w:b w:val="0"/>
-                <w:sz w:val="18"/>
+                <w:sz w:val="17"/>
               </w:rPr>
-              <w:t>0.8466</w:t>
+              <w:t>Ver notebook</w:t>
             </w:r>
           </w:p>
         </w:tc>
         <w:tc>
           <w:tcPr>
-            <w:tcW w:type="dxa" w:w="1656"/>
+            <w:tcW w:type="dxa" w:w="1632"/>
             <w:vAlign w:val="center"/>
           </w:tcPr>
           <w:p>
-            <w:r/>
+            <w:pPr>
+              <w:jc w:val="center"/>
+            </w:pPr>
             <w:r>
               <w:rPr>
-                <w:b w:val="0"/>
-                <w:sz w:val="18"/>
+                <w:sz w:val="17"/>
               </w:rPr>
-              <w:t>0.5491</w:t>
+              <w:t>Ver notebook</w:t>
             </w:r>
           </w:p>
         </w:tc>
         <w:tc>
           <w:tcPr>
-            <w:tcW w:type="dxa" w:w="1656"/>
+            <w:tcW w:type="dxa" w:w="1632"/>
             <w:vAlign w:val="center"/>
           </w:tcPr>
           <w:p>
-            <w:r/>
+            <w:pPr>
+              <w:jc w:val="center"/>
+            </w:pPr>
             <w:r>
               <w:rPr>
-                <w:b w:val="0"/>
-                <w:sz w:val="18"/>
+                <w:sz w:val="17"/>
               </w:rPr>
-              <w:t>0.5437</w:t>
+              <w:t>Ver notebook</w:t>
             </w:r>
           </w:p>
         </w:tc>
         <w:tc>
           <w:tcPr>
-            <w:tcW w:type="dxa" w:w="1656"/>
+            <w:tcW w:type="dxa" w:w="1632"/>
             <w:vAlign w:val="center"/>
           </w:tcPr>
           <w:p>
-            <w:r/>
+            <w:pPr>
+              <w:jc w:val="center"/>
+            </w:pPr>
             <w:r>
               <w:rPr>
-                <w:b w:val="0"/>
-                <w:sz w:val="18"/>
+                <w:sz w:val="17"/>
               </w:rPr>
-              <w:t>0.5464</w:t>
+              <w:t>Ver notebook</w:t>
             </w:r>
           </w:p>
         </w:tc>
         <w:tc>
           <w:tcPr>
-            <w:tcW w:type="dxa" w:w="1656"/>
+            <w:tcW w:type="dxa" w:w="1632"/>
             <w:vAlign w:val="center"/>
           </w:tcPr>
           <w:p>
-            <w:r/>
+            <w:pPr>
+              <w:jc w:val="center"/>
+            </w:pPr>
             <w:r>
               <w:rPr>
-                <w:b w:val="0"/>
-                <w:sz w:val="18"/>
+                <w:sz w:val="17"/>
               </w:rPr>
-              <w:t>0.7260</w:t>
+              <w:t>Ver notebook</w:t>
             </w:r>
           </w:p>
         </w:tc>
@@ -1140,15 +1296,114 @@
       <w:tr>
         <w:tc>
           <w:tcPr>
-            <w:tcW w:type="dxa" w:w="1656"/>
+            <w:tcW w:type="dxa" w:w="1632"/>
             <w:vAlign w:val="center"/>
           </w:tcPr>
           <w:p>
-            <w:r/>
             <w:r>
               <w:rPr>
-                <w:b w:val="0"/>
-                <w:sz w:val="18"/>
+                <w:sz w:val="17"/>
+              </w:rPr>
+              <w:t>árbol IF-THEN</w:t>
+            </w:r>
+          </w:p>
+        </w:tc>
+        <w:tc>
+          <w:tcPr>
+            <w:tcW w:type="dxa" w:w="1632"/>
+            <w:vAlign w:val="center"/>
+          </w:tcPr>
+          <w:p>
+            <w:pPr>
+              <w:jc w:val="center"/>
+            </w:pPr>
+            <w:r>
+              <w:rPr>
+                <w:sz w:val="17"/>
+              </w:rPr>
+              <w:t>Ver notebook</w:t>
+            </w:r>
+          </w:p>
+        </w:tc>
+        <w:tc>
+          <w:tcPr>
+            <w:tcW w:type="dxa" w:w="1632"/>
+            <w:vAlign w:val="center"/>
+          </w:tcPr>
+          <w:p>
+            <w:pPr>
+              <w:jc w:val="center"/>
+            </w:pPr>
+            <w:r>
+              <w:rPr>
+                <w:sz w:val="17"/>
+              </w:rPr>
+              <w:t>Ver notebook</w:t>
+            </w:r>
+          </w:p>
+        </w:tc>
+        <w:tc>
+          <w:tcPr>
+            <w:tcW w:type="dxa" w:w="1632"/>
+            <w:vAlign w:val="center"/>
+          </w:tcPr>
+          <w:p>
+            <w:pPr>
+              <w:jc w:val="center"/>
+            </w:pPr>
+            <w:r>
+              <w:rPr>
+                <w:sz w:val="17"/>
+              </w:rPr>
+              <w:t>Ver notebook</w:t>
+            </w:r>
+          </w:p>
+        </w:tc>
+        <w:tc>
+          <w:tcPr>
+            <w:tcW w:type="dxa" w:w="1632"/>
+            <w:vAlign w:val="center"/>
+          </w:tcPr>
+          <w:p>
+            <w:pPr>
+              <w:jc w:val="center"/>
+            </w:pPr>
+            <w:r>
+              <w:rPr>
+                <w:sz w:val="17"/>
+              </w:rPr>
+              <w:t>Ver notebook</w:t>
+            </w:r>
+          </w:p>
+        </w:tc>
+        <w:tc>
+          <w:tcPr>
+            <w:tcW w:type="dxa" w:w="1632"/>
+            <w:vAlign w:val="center"/>
+          </w:tcPr>
+          <w:p>
+            <w:pPr>
+              <w:jc w:val="center"/>
+            </w:pPr>
+            <w:r>
+              <w:rPr>
+                <w:sz w:val="17"/>
+              </w:rPr>
+              <w:t>Ver notebook</w:t>
+            </w:r>
+          </w:p>
+        </w:tc>
+      </w:tr>
+      <w:tr>
+        <w:tc>
+          <w:tcPr>
+            <w:tcW w:type="dxa" w:w="1632"/>
+            <w:vAlign w:val="center"/>
+          </w:tcPr>
+          <w:p>
+            <w:r>
+              <w:rPr>
+                <w:sz w:val="17"/>
               </w:rPr>
               <w:t>Regresion Logística</w:t>
             </w:r>
@@ -1156,15 +1411,16 @@
         </w:tc>
         <w:tc>
           <w:tcPr>
-            <w:tcW w:type="dxa" w:w="1656"/>
+            <w:tcW w:type="dxa" w:w="1632"/>
             <w:vAlign w:val="center"/>
           </w:tcPr>
           <w:p>
-            <w:r/>
+            <w:pPr>
+              <w:jc w:val="center"/>
+            </w:pPr>
             <w:r>
               <w:rPr>
-                <w:b w:val="0"/>
-                <w:sz w:val="18"/>
+                <w:sz w:val="17"/>
               </w:rPr>
               <w:t>0.8229</w:t>
             </w:r>
@@ -1172,15 +1428,16 @@
         </w:tc>
         <w:tc>
           <w:tcPr>
-            <w:tcW w:type="dxa" w:w="1656"/>
+            <w:tcW w:type="dxa" w:w="1632"/>
             <w:vAlign w:val="center"/>
           </w:tcPr>
           <w:p>
-            <w:r/>
+            <w:pPr>
+              <w:jc w:val="center"/>
+            </w:pPr>
             <w:r>
               <w:rPr>
-                <w:b w:val="0"/>
-                <w:sz w:val="18"/>
+                <w:sz w:val="17"/>
               </w:rPr>
               <w:t>0.4861</w:t>
             </w:r>
@@ -1188,15 +1445,16 @@
         </w:tc>
         <w:tc>
           <w:tcPr>
-            <w:tcW w:type="dxa" w:w="1656"/>
+            <w:tcW w:type="dxa" w:w="1632"/>
             <w:vAlign w:val="center"/>
           </w:tcPr>
           <w:p>
-            <w:r/>
+            <w:pPr>
+              <w:jc w:val="center"/>
+            </w:pPr>
             <w:r>
               <w:rPr>
-                <w:b w:val="0"/>
-                <w:sz w:val="18"/>
+                <w:sz w:val="17"/>
               </w:rPr>
               <w:t>0.7387</w:t>
             </w:r>
@@ -1204,15 +1462,16 @@
         </w:tc>
         <w:tc>
           <w:tcPr>
-            <w:tcW w:type="dxa" w:w="1656"/>
+            <w:tcW w:type="dxa" w:w="1632"/>
             <w:vAlign w:val="center"/>
           </w:tcPr>
           <w:p>
-            <w:r/>
+            <w:pPr>
+              <w:jc w:val="center"/>
+            </w:pPr>
             <w:r>
               <w:rPr>
-                <w:b w:val="0"/>
-                <w:sz w:val="18"/>
+                <w:sz w:val="17"/>
               </w:rPr>
               <w:t>0.5863</w:t>
             </w:r>
@@ -1220,15 +1479,16 @@
         </w:tc>
         <w:tc>
           <w:tcPr>
-            <w:tcW w:type="dxa" w:w="1656"/>
+            <w:tcW w:type="dxa" w:w="1632"/>
             <w:vAlign w:val="center"/>
           </w:tcPr>
           <w:p>
-            <w:r/>
+            <w:pPr>
+              <w:jc w:val="center"/>
+            </w:pPr>
             <w:r>
               <w:rPr>
-                <w:b w:val="0"/>
-                <w:sz w:val="18"/>
+                <w:sz w:val="17"/>
               </w:rPr>
               <w:t>0.8806</w:t>
             </w:r>
@@ -1238,15 +1498,13 @@
       <w:tr>
         <w:tc>
           <w:tcPr>
-            <w:tcW w:type="dxa" w:w="1656"/>
+            <w:tcW w:type="dxa" w:w="1632"/>
             <w:vAlign w:val="center"/>
           </w:tcPr>
           <w:p>
-            <w:r/>
             <w:r>
               <w:rPr>
-                <w:b w:val="0"/>
-                <w:sz w:val="18"/>
+                <w:sz w:val="17"/>
               </w:rPr>
               <w:t>Random Forest ajustado</w:t>
             </w:r>
@@ -1254,15 +1512,16 @@
         </w:tc>
         <w:tc>
           <w:tcPr>
-            <w:tcW w:type="dxa" w:w="1656"/>
+            <w:tcW w:type="dxa" w:w="1632"/>
             <w:vAlign w:val="center"/>
           </w:tcPr>
           <w:p>
-            <w:r/>
+            <w:pPr>
+              <w:jc w:val="center"/>
+            </w:pPr>
             <w:r>
               <w:rPr>
-                <w:b w:val="0"/>
-                <w:sz w:val="18"/>
+                <w:sz w:val="17"/>
               </w:rPr>
               <w:t>0.8600</w:t>
             </w:r>
@@ -1270,15 +1529,16 @@
         </w:tc>
         <w:tc>
           <w:tcPr>
-            <w:tcW w:type="dxa" w:w="1656"/>
+            <w:tcW w:type="dxa" w:w="1632"/>
             <w:vAlign w:val="center"/>
           </w:tcPr>
           <w:p>
-            <w:r/>
+            <w:pPr>
+              <w:jc w:val="center"/>
+            </w:pPr>
             <w:r>
               <w:rPr>
-                <w:b w:val="0"/>
-                <w:sz w:val="18"/>
+                <w:sz w:val="17"/>
               </w:rPr>
               <w:t>0.5719</w:t>
             </w:r>
@@ -1286,15 +1546,16 @@
         </w:tc>
         <w:tc>
           <w:tcPr>
-            <w:tcW w:type="dxa" w:w="1656"/>
+            <w:tcW w:type="dxa" w:w="1632"/>
             <w:vAlign w:val="center"/>
           </w:tcPr>
           <w:p>
-            <w:r/>
+            <w:pPr>
+              <w:jc w:val="center"/>
+            </w:pPr>
             <w:r>
               <w:rPr>
-                <w:b w:val="0"/>
-                <w:sz w:val="18"/>
+                <w:sz w:val="17"/>
               </w:rPr>
               <w:t>0.7007</w:t>
             </w:r>
@@ -1302,15 +1563,16 @@
         </w:tc>
         <w:tc>
           <w:tcPr>
-            <w:tcW w:type="dxa" w:w="1656"/>
+            <w:tcW w:type="dxa" w:w="1632"/>
             <w:vAlign w:val="center"/>
           </w:tcPr>
           <w:p>
-            <w:r/>
+            <w:pPr>
+              <w:jc w:val="center"/>
+            </w:pPr>
             <w:r>
               <w:rPr>
-                <w:b w:val="0"/>
-                <w:sz w:val="18"/>
+                <w:sz w:val="17"/>
               </w:rPr>
               <w:t>0.6298</w:t>
             </w:r>
@@ -1318,15 +1580,16 @@
         </w:tc>
         <w:tc>
           <w:tcPr>
-            <w:tcW w:type="dxa" w:w="1656"/>
+            <w:tcW w:type="dxa" w:w="1632"/>
             <w:vAlign w:val="center"/>
           </w:tcPr>
           <w:p>
-            <w:r/>
+            <w:pPr>
+              <w:jc w:val="center"/>
+            </w:pPr>
             <w:r>
               <w:rPr>
-                <w:b w:val="0"/>
-                <w:sz w:val="18"/>
+                <w:sz w:val="17"/>
               </w:rPr>
               <w:t>0.8911</w:t>
             </w:r>
@@ -1336,8 +1599,38 @@
     </w:tbl>
     <w:p/>
     <w:p>
+      <w:pPr>
+        <w:spacing w:after="120" w:line="252" w:lineRule="auto"/>
+      </w:pPr>
       <w:r>
-        <w:t>Estos resultados corresponden al notebook E3 alineado con el cuaderno principal ATUS. La interpretacion se mantiene: no basta con ver accuracy, porque la clase grave es menos frecuente y es la más importante para prevencion.</w:t>
+        <w:t>Los valores exactos de KNN y del árbol IF-THEN quedan en el notebook principal ATUS porque se calculan al ejecutar las celdas con las muestras estratificadas definidas para mantener el proceso reproducible. La interpretación se mantiene: no basta con ver accuracy, porque la clase grave es menos frecuente y es la más importante para prevencion.</w:t>
+      </w:r>
+    </w:p>
+    <w:p>
+      <w:pPr>
+        <w:spacing w:after="120" w:line="252" w:lineRule="auto"/>
+      </w:pPr>
+      <w:r>
+        <w:t>Como parte del requisito de árboles de Decision, el notebook extrae una regla IF-THEN mediante export_text. La lectura esperada de esa salida es:</w:t>
+      </w:r>
+    </w:p>
+    <w:p>
+      <w:pPr>
+        <w:pStyle w:val="CodeBlock"/>
+        <w:spacing w:before="80" w:after="120"/>
+      </w:pPr>
+      <w:r>
+        <w:t>IF se cumplen las condiciones de la ruta del arbol</w:t>
+        <w:br/>
+        <w:t>THEN el accidente se clasifica hacia No grave o Grave segun la hoja final.</w:t>
+      </w:r>
+    </w:p>
+    <w:p>
+      <w:pPr>
+        <w:spacing w:after="120" w:line="252" w:lineRule="auto"/>
+      </w:pPr>
+      <w:r>
+        <w:t>Esta regla ayuda a comunicar el razonamiento de un modelo simple, aunque el modelo recomendado para desempeño general siga siendo Random Forest.</w:t>
       </w:r>
     </w:p>
     <w:p>
@@ -1345,27 +1638,39 @@
         <w:pStyle w:val="Heading1"/>
       </w:pPr>
       <w:r>
-        <w:t>8. Comparativa y recomendacion</w:t>
+        <w:t>8. Comparativa y recomendación</w:t>
       </w:r>
     </w:p>
     <w:p>
+      <w:pPr>
+        <w:spacing w:after="120" w:line="252" w:lineRule="auto"/>
+      </w:pPr>
       <w:r>
         <w:t>Con base en las metricas, el modelo recomendado para el proyecto es el Random Forest ajustado. La razon principal es que ofrece el mejor equilibrio general para la clase grave, especialmente en F1-score. Esto significa que logra una relacion más balanceada entre detectar accidentes graves y no marcar demasiados accidentes como graves cuando no lo son.</w:t>
       </w:r>
     </w:p>
     <w:p>
+      <w:pPr>
+        <w:spacing w:after="120" w:line="252" w:lineRule="auto"/>
+      </w:pPr>
       <w:r>
-        <w:t>La Regresion Logística no se descarta. Su recall fue alto, lo que significa que detecta una mayor proporcion de accidentes graves. En un contexto preventivo donde se prefiere activar alertas aunque existan falsos positivos, podria ser una opcion util. Ademas, es más facil de explicar que Random Forest.</w:t>
+        <w:t>La Regresion Logística no se descarta. Su recall fue alto, lo que significa que detecta una mayor proporcion de accidentes graves. En un contexto preventivo donde se prefiere activar alertas aunque existan falsos positivos, podría ser una opcion util. Ademas, es más facil de explicar que Random Forest.</w:t>
       </w:r>
     </w:p>
     <w:p>
+      <w:pPr>
+        <w:spacing w:after="120" w:line="252" w:lineRule="auto"/>
+      </w:pPr>
       <w:r>
-        <w:t>El árbol de Decision base cumple como referencia inicial, pero no seria la primera recomendacion final. Su desempeno fue menor y puede depender mucho de pequenas variaciones en los datos.</w:t>
+        <w:t>KNN y el árbol IF-THEN cumplen funciones de referencia. KNN permite cubrir un metodo basado en cercania entre observaciones, mientras que el árbol permite explicar decisiones con reglas. Ninguno de los dos desplaza la recomendacion principal porque el objetivo final requiere balance entre deteccion de gravedad y estabilidad del modelo.</w:t>
       </w:r>
     </w:p>
     <w:p>
+      <w:pPr>
+        <w:spacing w:after="120" w:line="252" w:lineRule="auto"/>
+      </w:pPr>
       <w:r>
-        <w:t>El clustering jerárquico no compite directamente con los clasificadores porque responde otra pregunta. Mientras los clasificadores predicen gravedad a nivel de accidente, el clustering agrupa municipios. Esto permite pensar en estrategias diferenciadas: municipios con alto volumen, municipios con alta gravedad proporcional y municipios con participación relevante de motocicletas o tipos especificos de accidente.</w:t>
+        <w:t>El clustering jerárquico no compite directamente con los clasificadores porque responde otra pregunta. Mientras los clasificadores predicen gravedad a nivel de accidente, el clustering agrupa municipios. Esto permite pensar en estrategias diferenciadas: municipios con alto volumen, municipios con alta gravedad proporcional y municipios con participacion relevante de motocicletas o tipos especificos de accidente.</w:t>
       </w:r>
     </w:p>
     <w:p>
@@ -1377,26 +1682,41 @@
       </w:r>
     </w:p>
     <w:p>
+      <w:pPr>
+        <w:spacing w:after="120" w:line="252" w:lineRule="auto"/>
+      </w:pPr>
       <w:r>
         <w:t>El primer resultado preventivo es que Hermosillo, Sur y Valle y Frontera concentran el mayor volumen de accidentes. Estas regiones requieren acciones de escala amplia: educacion vial, control de velocidad, vigilancia en cruces y seguimiento de zonas con alta movilidad.</w:t>
       </w:r>
     </w:p>
     <w:p>
+      <w:pPr>
+        <w:spacing w:after="120" w:line="252" w:lineRule="auto"/>
+      </w:pPr>
       <w:r>
         <w:t>El segundo resultado es que la Sierra, Centro y Sur y Valle tienen porcentajes de gravedad más altos. Estas zonas requieren atencion aunque no siempre aparezcan como las de mayor cantidad de accidentes. En ellas puede ser más importante revisar tiempos de respuesta, condiciones viales, traslados entre localidades y riesgos asociados a la geografia.</w:t>
       </w:r>
     </w:p>
     <w:p>
+      <w:pPr>
+        <w:spacing w:after="120" w:line="252" w:lineRule="auto"/>
+      </w:pPr>
       <w:r>
-        <w:t>El tercer resultado es que la colisión con vehículo automotor domina el total de accidentes. Esto sugiere estrategias enfocadas en interacciones vehiculares: distancia segura, respeto a semaforos, señalamientos, control de velocidad y vigilancia en intersecciones.</w:t>
+        <w:t>El tercer resultado es que la colision con vehículo automotor domina el total de accidentes. Esto sugiere estrategias enfocadas en interacciones vehiculares: distancia segura, respeto a semaforos, señalamientos, control de velocidad y vigilancia en intersecciones.</w:t>
       </w:r>
     </w:p>
     <w:p>
+      <w:pPr>
+        <w:spacing w:after="120" w:line="252" w:lineRule="auto"/>
+      </w:pPr>
       <w:r>
-        <w:t>El cuarto resultado es la relevancia de motocicletas. La colisión con motocicleta aparece entre los tipos más frecuentes y la variable de motocicleta tiene peso en el modelado. Por eso, las recomendaciones deben incluir uso de casco, visibilidad, respeto de carriles y campanas dirigidas a motociclistas.</w:t>
+        <w:t>El cuarto resultado es la relevancia de motocicletas. La colision con motocicleta aparece entre los tipos más frecuentes y la variable de motocicleta tiene peso en el modelado. Por eso, las recomendaciones deben incluir uso de casco, visibilidad, respeto de carriles y campanas dirigidas a motociclistas.</w:t>
       </w:r>
     </w:p>
     <w:p>
+      <w:pPr>
+        <w:spacing w:after="120" w:line="252" w:lineRule="auto"/>
+      </w:pPr>
       <w:r>
         <w:t>El quinto resultado es temporal: las tardes cercanas al fin de semana concentran muchos accidentes, y viernes por la tarde registra 10,802 casos. Esta información permite proponer acciones por horario, como operativos preventivos, mensajes en redes o refuerzo de vigilancia en horas de salida laboral.</w:t>
       </w:r>
@@ -1406,32 +1726,47 @@
         <w:pStyle w:val="Heading1"/>
       </w:pPr>
       <w:r>
-        <w:t>10. Discusion critica y limitaciones</w:t>
+        <w:t>10. Discusion crítica y limitaciones</w:t>
       </w:r>
     </w:p>
     <w:p>
+      <w:pPr>
+        <w:spacing w:after="120" w:line="252" w:lineRule="auto"/>
+      </w:pPr>
       <w:r>
-        <w:t>La primera limitacion es que ATUS cubre accidentes en zonas urbanas y suburbanas. Por lo tanto, no necesariamente representa todos los accidentes carreteros del estado. Esto importa en Sonora porque hay municipios con grandes distancias y movilidad interurbana.</w:t>
+        <w:t>La primera limitación es que ATUS cubre accidentes en zonas urbanas y suburbanas. Por lo tanto, no necesariamente representa todos los accidentes carreteros del estado. Esto importa en Sonora porque hay municipios con grandes distancias y movilidad interurbana.</w:t>
       </w:r>
     </w:p>
     <w:p>
+      <w:pPr>
+        <w:spacing w:after="120" w:line="252" w:lineRule="auto"/>
+      </w:pPr>
       <w:r>
-        <w:t>La segunda limitacion es que algunas variables son amplias. Por ejemplo, Conductor aparece como causa probable en la gran mayoria de registros, pero no distingue si el problema fue velocidad, distraccion, alcohol, falta de respeto a señales u otro comportamiento especifico.</w:t>
+        <w:t>La segunda limitación es que algunas variables son amplias. Por ejemplo, Conductor aparece como causa probable en la gran mayoria de registros, pero no distingue si el problema fue velocidad, distraccion, alcohol, falta de respeto a señales u otro comportamiento especifico.</w:t>
       </w:r>
     </w:p>
     <w:p>
+      <w:pPr>
+        <w:spacing w:after="120" w:line="252" w:lineRule="auto"/>
+      </w:pPr>
       <w:r>
-        <w:t>La tercera limitacion es la calidad de algunas variables. La edad del conductor tiene valores faltantes o no especificados. También hay variables como aliento o cinturon con categorias no especificadas. Esto reduce la precision interpretativa de ciertos hallazgos.</w:t>
+        <w:t>La tercera limitación es la calidad de algunas variables. La edad del conductor tiene valores faltantes o no especificados. También hay variables como aliento o cinturon con categorias no especificadas. Esto reduce la precision interpretativa de ciertos hallazgos.</w:t>
       </w:r>
     </w:p>
     <w:p>
+      <w:pPr>
+        <w:spacing w:after="120" w:line="252" w:lineRule="auto"/>
+      </w:pPr>
       <w:r>
-        <w:t>La cuarta limitacion es que los modelos no deben interpretarse como predictores exactos del futuro. Los accidentes son eventos complejos que dependen de condiciones de movilidad, clima, infraestructura, conducta, vigilancia y otros factores que no siempre estan en la base.</w:t>
+        <w:t>La cuarta limitación es que los modelos no deben interpretarse como predictores exactos del futuro. Los accidentes son eventos complejos que dependen de condiciones de movilidad, clima, infraestructura, conducta, vigilancia y otros factores que no siempre estan en la base.</w:t>
       </w:r>
     </w:p>
     <w:p>
+      <w:pPr>
+        <w:spacing w:after="120" w:line="252" w:lineRule="auto"/>
+      </w:pPr>
       <w:r>
-        <w:t>La quinta limitacion es que el análisis regional se definio de forma operativa para comparar municipios. Aunque la segmentacion ayuda a interpretar, podria ajustarse con criterios oficiales de planeacion, movilidad o seguridad publica si se cuenta con ellos.</w:t>
+        <w:t>La quinta limitación es que el análisis regional se definio de forma operativa para comparar municipios. Aunque la segmentacion ayuda a interpretar, podría ajustarse con criterios oficiales de planeacion, movilidad o seguridad pública si se cuenta con ellos.</w:t>
       </w:r>
     </w:p>
     <w:p>
@@ -1443,33 +1778,51 @@
       </w:r>
     </w:p>
     <w:p>
+      <w:pPr>
+        <w:spacing w:after="120" w:line="252" w:lineRule="auto"/>
+      </w:pPr>
       <w:r>
         <w:t>El proyecto permitio conocer mejor los accidentes de tránsito en Sonora durante el periodo 2015-2024. La base final tuvo 183,911 accidentes reales y mostro diferencias importantes entre regiones, municipios, tipos de accidente y niveles de gravedad.</w:t>
       </w:r>
     </w:p>
     <w:p>
+      <w:pPr>
+        <w:spacing w:after="120" w:line="252" w:lineRule="auto"/>
+      </w:pPr>
       <w:r>
-        <w:t>Una conclusion central es que el volumen de accidentes y la gravedad no siempre coinciden. Hermosillo concentra la mayor cantidad de accidentes, pero regiones como Sierra, Centro y Sur y Valle presentan mayores porcentajes de accidentes graves. Esto confirma que una estrategia preventiva debe combinar cantidad y severidad.</w:t>
+        <w:t>Una conclusión central es que el volumen de accidentes y la gravedad no siempre coinciden. Hermosillo concentra la mayor cantidad de accidentes, pero regiones como Sierra, Centro y Sur y Valle presentan mayores porcentajes de accidentes graves. Esto confirma que una estrategia preventiva debe combinar cantidad y severidad.</w:t>
       </w:r>
     </w:p>
     <w:p>
+      <w:pPr>
+        <w:spacing w:after="120" w:line="252" w:lineRule="auto"/>
+      </w:pPr>
       <w:r>
-        <w:t>Otra conclusion es que la causa probable Conductor domina los registros. Esto no significa culpar a personas individuales, sino reconocer que la conducta vial debe ser un eje fuerte de prevencion. La educacion vial, el control de velocidad, la atencion a motociclistas y la vigilancia en horarios criticos pueden tener impacto.</w:t>
+        <w:t>Otra conclusión es que la causa probable Conductor domina los registros. Esto no significa culpar a personas individuales, sino reconocer que la conducta vial debe ser un eje fuerte de prevencion. La educacion vial, el control de velocidad, la atencion a motociclistas y la vigilancia en horarios criticos pueden tener impacto.</w:t>
       </w:r>
     </w:p>
     <w:p>
+      <w:pPr>
+        <w:spacing w:after="120" w:line="252" w:lineRule="auto"/>
+      </w:pPr>
       <w:r>
-        <w:t>En modelado, el Random Forest ajustado fue la recomendacion principal por su equilibrio entre precision y recall para accidentes graves. La Regresion Logística queda como alternativa interpretable, especialmente si se busca explicar de manera sencilla los resultados o priorizar recall.</w:t>
+        <w:t>En modelado, el Random Forest ajustado fue la recomendación principal por su equilibrio entre precision y recall para accidentes graves. La Regresion Logística queda como alternativa interpretable, especialmente si se busca explicar de manera sencilla los resultados o priorizar recall. KNN y el árbol IF-THEN se incorporaron como referencias del curso y para fortalecer la explicabilidad.</w:t>
       </w:r>
     </w:p>
     <w:p>
+      <w:pPr>
+        <w:spacing w:after="120" w:line="252" w:lineRule="auto"/>
+      </w:pPr>
       <w:r>
-        <w:t>El clustering jerárquico agrego valor al mostrar que los municipios pueden agruparse por perfiles de riesgo. Esto abre la puerta a estrategias diferenciadas por tipo de municipio, en lugar de aplicar una sola recomendacion general para todo el estado.</w:t>
+        <w:t>El clustering jerárquico agrego valor al mostrar que los municipios pueden agruparse por perfiles de riesgo. Esto abre la puerta a estrategias diferenciadas por tipo de municipio, en lugar de aplicar una sola recomendación general para todo el estado.</w:t>
       </w:r>
     </w:p>
     <w:p>
+      <w:pPr>
+        <w:spacing w:after="120" w:line="252" w:lineRule="auto"/>
+      </w:pPr>
       <w:r>
-        <w:t>En general, el proyecto demuestra que la mineria de datos puede apoyar la prevención vial cuando se combina análisis exploratorio, calidad de datos, modelos evaluados correctamente e interpretacion humana de los resultados.</w:t>
+        <w:t>En general, el proyecto demuestra que la minería de datos puede apoyar la prevención vial cuando se combina análisis exploratorio, calidad de datos, modelos evaluados correctamente e interpretación humana de los resultados.</w:t>
       </w:r>
     </w:p>
     <w:p>
@@ -1481,38 +1834,59 @@
       </w:r>
     </w:p>
     <w:p>
+      <w:pPr>
+        <w:pStyle w:val="ListNumber"/>
+      </w:pPr>
       <w:r>
-        <w:t>1. Priorizar acciones de alto volumen en Hermosillo, Sur y Valle y Frontera.</w:t>
+        <w:t>Priorizar acciones de alto volumen en Hermosillo, Sur y Valle y Frontera.</w:t>
       </w:r>
     </w:p>
     <w:p>
+      <w:pPr>
+        <w:pStyle w:val="ListNumber"/>
+      </w:pPr>
       <w:r>
-        <w:t>2. Atender la gravedad proporcional en Sierra, Centro y Sur y Valle.</w:t>
+        <w:t>Atender la gravedad proporcional en Sierra, Centro y Sur y Valle.</w:t>
       </w:r>
     </w:p>
     <w:p>
+      <w:pPr>
+        <w:pStyle w:val="ListNumber"/>
+      </w:pPr>
       <w:r>
-        <w:t>3. Reforzar campanas sobre velocidad, distancia segura y respeto a senalamientos.</w:t>
+        <w:t>Reforzar campanas sobre velocidad, distancia segura y respeto a senalamientos.</w:t>
       </w:r>
     </w:p>
     <w:p>
+      <w:pPr>
+        <w:pStyle w:val="ListNumber"/>
+      </w:pPr>
       <w:r>
-        <w:t>4. Desarrollar campanas especificas para motociclistas.</w:t>
+        <w:t>Desarrollar campanas especificas para motociclistas.</w:t>
       </w:r>
     </w:p>
     <w:p>
+      <w:pPr>
+        <w:pStyle w:val="ListNumber"/>
+      </w:pPr>
       <w:r>
-        <w:t>5. Revisar horarios criticos, especialmente tardes cercanas al fin de semana y viernes por la tarde.</w:t>
+        <w:t>Revisar horarios criticos, especialmente tardes cercanas al fin de semana y viernes por la tarde.</w:t>
       </w:r>
     </w:p>
     <w:p>
+      <w:pPr>
+        <w:pStyle w:val="ListNumber"/>
+      </w:pPr>
       <w:r>
-        <w:t>6. Complementar ATUS con datos de infraestructura, clima, alcoholimetria y carreteras si se desea un análisis más completo.</w:t>
+        <w:t>Complementar ATUS con datos de infraestructura, clima, alcoholimetria y carreteras si se desea un análisis más completo.</w:t>
       </w:r>
     </w:p>
     <w:p>
+      <w:pPr>
+        <w:pStyle w:val="ListNumber"/>
+      </w:pPr>
       <w:r>
-        <w:t>7. Mantener el repositorio organizado para que los notebooks puedan ejecutarse de nuevo con datos actualizados.</w:t>
+        <w:t>Mantener el repositorio organizado para que los notebooks puedan ejecutarse de nuevo con datos actualizados.</w:t>
       </w:r>
     </w:p>
     <w:p>
@@ -1520,30 +1894,45 @@
         <w:pStyle w:val="Heading1"/>
       </w:pPr>
       <w:r>
-        <w:t>13. Referencias bibliograficas</w:t>
+        <w:t>13. Referencias bibliográficas</w:t>
       </w:r>
     </w:p>
     <w:p>
+      <w:pPr>
+        <w:spacing w:after="120" w:line="252" w:lineRule="auto"/>
+      </w:pPr>
       <w:r>
         <w:t>Instituto Nacional de Estadistica y Geografia. (2025). Accidentes de Tránsito Terrestre en Zonas Urbanas y Suburbanas (ATUS), 1997-2024. INEGI. https://www.inegi.org.mx/programas/accidentes/</w:t>
       </w:r>
     </w:p>
     <w:p>
+      <w:pPr>
+        <w:spacing w:after="120" w:line="252" w:lineRule="auto"/>
+      </w:pPr>
       <w:r>
         <w:t>Pedregosa, F., Varoquaux, G., Gramfort, A., Michel, V., Thirion, B., Grisel, O., Blondel, M., Prettenhofer, P., Weiss, R., Dubourg, V., Vanderplas, J., Passos, A., Cournapeau, D., Brucher, M., Perrot, M., &amp; Duchesnay, E. (2011). Scikit-learn: Machine learning in Python. Journal of Machine Learning Research, 12, 2825-2830.</w:t>
       </w:r>
     </w:p>
     <w:p>
+      <w:pPr>
+        <w:spacing w:after="120" w:line="252" w:lineRule="auto"/>
+      </w:pPr>
       <w:r>
         <w:t>McKinney, W. (2010). Data structures for statistical computing in Python. Proceedings of the 9th Python in Science Conference, 56-61.</w:t>
       </w:r>
     </w:p>
     <w:p>
+      <w:pPr>
+        <w:spacing w:after="120" w:line="252" w:lineRule="auto"/>
+      </w:pPr>
       <w:r>
         <w:t>Hunter, J. D. (2007). Matplotlib: A 2D graphics environment. Computing in Science &amp; Engineering, 9(3), 90-95.</w:t>
       </w:r>
     </w:p>
     <w:p>
+      <w:pPr>
+        <w:spacing w:after="120" w:line="252" w:lineRule="auto"/>
+      </w:pPr>
       <w:r>
         <w:t>Waskom, M. L. (2021). seaborn: Statistical data visualization. Journal of Open Source Software, 6(60), 3021.</w:t>
       </w:r>
@@ -1553,7 +1942,7 @@
         <w:pStyle w:val="Heading1"/>
       </w:pPr>
       <w:r>
-        <w:t>14. Anexos: codigo relevante</w:t>
+        <w:t>14. Anexos: código relevante</w:t>
       </w:r>
     </w:p>
     <w:p>
@@ -1565,99 +1954,29 @@
       </w:r>
     </w:p>
     <w:p>
+      <w:pPr>
+        <w:pStyle w:val="CodeBlock"/>
+        <w:spacing w:before="80" w:after="120"/>
+      </w:pPr>
       <w:r>
-        <w:rPr>
-          <w:rFonts w:ascii="Courier New" w:hAnsi="Courier New"/>
-          <w:sz w:val="17"/>
-        </w:rPr>
         <w:t>YEARS = list(range(2015, 2025))</w:t>
-      </w:r>
-    </w:p>
-    <w:p>
-      <w:r>
-        <w:rPr>
-          <w:rFonts w:ascii="Courier New" w:hAnsi="Courier New"/>
-          <w:sz w:val="17"/>
-        </w:rPr>
+        <w:br/>
         <w:t>SONORA_ID = "26"</w:t>
-      </w:r>
-    </w:p>
-    <w:p>
-      <w:r>
-        <w:rPr>
-          <w:rFonts w:ascii="Courier New" w:hAnsi="Courier New"/>
-          <w:sz w:val="17"/>
-        </w:rPr>
-      </w:r>
-    </w:p>
-    <w:p>
-      <w:r>
-        <w:rPr>
-          <w:rFonts w:ascii="Courier New" w:hAnsi="Courier New"/>
-          <w:sz w:val="17"/>
-        </w:rPr>
+        <w:br/>
+        <w:br/>
         <w:t>frames = []</w:t>
-      </w:r>
-    </w:p>
-    <w:p>
-      <w:r>
-        <w:rPr>
-          <w:rFonts w:ascii="Courier New" w:hAnsi="Courier New"/>
-          <w:sz w:val="17"/>
-        </w:rPr>
+        <w:br/>
         <w:t>for year in YEARS:</w:t>
-      </w:r>
-    </w:p>
-    <w:p>
-      <w:r>
-        <w:rPr>
-          <w:rFonts w:ascii="Courier New" w:hAnsi="Courier New"/>
-          <w:sz w:val="17"/>
-        </w:rPr>
+        <w:br/>
         <w:t xml:space="preserve">    tmp = read_atus_year(year)</w:t>
-      </w:r>
-    </w:p>
-    <w:p>
-      <w:r>
-        <w:rPr>
-          <w:rFonts w:ascii="Courier New" w:hAnsi="Courier New"/>
-          <w:sz w:val="17"/>
-        </w:rPr>
+        <w:br/>
         <w:t xml:space="preserve">    tmp = tmp[tmp["ID_ENTIDAD"].astype(str).str.zfill(2) == SONORA_ID].copy()</w:t>
-      </w:r>
-    </w:p>
-    <w:p>
-      <w:r>
-        <w:rPr>
-          <w:rFonts w:ascii="Courier New" w:hAnsi="Courier New"/>
-          <w:sz w:val="17"/>
-        </w:rPr>
+        <w:br/>
         <w:t xml:space="preserve">    frames.append(tmp)</w:t>
-      </w:r>
-    </w:p>
-    <w:p>
-      <w:r>
-        <w:rPr>
-          <w:rFonts w:ascii="Courier New" w:hAnsi="Courier New"/>
-          <w:sz w:val="17"/>
-        </w:rPr>
-      </w:r>
-    </w:p>
-    <w:p>
-      <w:r>
-        <w:rPr>
-          <w:rFonts w:ascii="Courier New" w:hAnsi="Courier New"/>
-          <w:sz w:val="17"/>
-        </w:rPr>
+        <w:br/>
+        <w:br/>
         <w:t>atus = pd.concat(frames, ignore_index=True)</w:t>
-      </w:r>
-    </w:p>
-    <w:p>
-      <w:r>
-        <w:rPr>
-          <w:rFonts w:ascii="Courier New" w:hAnsi="Courier New"/>
-          <w:sz w:val="17"/>
-        </w:rPr>
+        <w:br/>
         <w:t>atus = atus[atus["TIPACCID"].ne("Certificado cero")].copy()</w:t>
       </w:r>
     </w:p>
@@ -1670,73 +1989,24 @@
       </w:r>
     </w:p>
     <w:p>
+      <w:pPr>
+        <w:pStyle w:val="CodeBlock"/>
+        <w:spacing w:before="80" w:after="120"/>
+      </w:pPr>
       <w:r>
-        <w:rPr>
-          <w:rFonts w:ascii="Courier New" w:hAnsi="Courier New"/>
-          <w:sz w:val="17"/>
-        </w:rPr>
         <w:t>atus["TOTAL_MUERTOS"] = atus[dead_cols].fillna(0).sum(axis=1)</w:t>
-      </w:r>
-    </w:p>
-    <w:p>
-      <w:r>
-        <w:rPr>
-          <w:rFonts w:ascii="Courier New" w:hAnsi="Courier New"/>
-          <w:sz w:val="17"/>
-        </w:rPr>
+        <w:br/>
         <w:t>atus["TOTAL_HERIDOS"] = atus[injury_cols].fillna(0).sum(axis=1)</w:t>
-      </w:r>
-    </w:p>
-    <w:p>
-      <w:r>
-        <w:rPr>
-          <w:rFonts w:ascii="Courier New" w:hAnsi="Courier New"/>
-          <w:sz w:val="17"/>
-        </w:rPr>
+        <w:br/>
         <w:t>atus["TOTAL_VICTIMAS"] = atus["TOTAL_MUERTOS"] + atus["TOTAL_HERIDOS"]</w:t>
-      </w:r>
-    </w:p>
-    <w:p>
-      <w:r>
-        <w:rPr>
-          <w:rFonts w:ascii="Courier New" w:hAnsi="Courier New"/>
-          <w:sz w:val="17"/>
-        </w:rPr>
-      </w:r>
-    </w:p>
-    <w:p>
-      <w:r>
-        <w:rPr>
-          <w:rFonts w:ascii="Courier New" w:hAnsi="Courier New"/>
-          <w:sz w:val="17"/>
-        </w:rPr>
+        <w:br/>
+        <w:br/>
         <w:t>atus["GRAVE_BIN"] = (</w:t>
-      </w:r>
-    </w:p>
-    <w:p>
-      <w:r>
-        <w:rPr>
-          <w:rFonts w:ascii="Courier New" w:hAnsi="Courier New"/>
-          <w:sz w:val="17"/>
-        </w:rPr>
+        <w:br/>
         <w:t xml:space="preserve">    (atus["TOTAL_VICTIMAS"] &gt; 0) |</w:t>
-      </w:r>
-    </w:p>
-    <w:p>
-      <w:r>
-        <w:rPr>
-          <w:rFonts w:ascii="Courier New" w:hAnsi="Courier New"/>
-          <w:sz w:val="17"/>
-        </w:rPr>
+        <w:br/>
         <w:t xml:space="preserve">    (atus["CLASACC"].isin(["Fatal", "No fatal"]))</w:t>
-      </w:r>
-    </w:p>
-    <w:p>
-      <w:r>
-        <w:rPr>
-          <w:rFonts w:ascii="Courier New" w:hAnsi="Courier New"/>
-          <w:sz w:val="17"/>
-        </w:rPr>
+        <w:br/>
         <w:t>).astype(int)</w:t>
       </w:r>
     </w:p>
@@ -1749,110 +2019,33 @@
       </w:r>
     </w:p>
     <w:p>
+      <w:pPr>
+        <w:pStyle w:val="CodeBlock"/>
+        <w:spacing w:before="80" w:after="120"/>
+      </w:pPr>
       <w:r>
-        <w:rPr>
-          <w:rFonts w:ascii="Courier New" w:hAnsi="Courier New"/>
-          <w:sz w:val="17"/>
-        </w:rPr>
         <w:t>preprocess = ColumnTransformer(</w:t>
-      </w:r>
-    </w:p>
-    <w:p>
-      <w:r>
-        <w:rPr>
-          <w:rFonts w:ascii="Courier New" w:hAnsi="Courier New"/>
-          <w:sz w:val="17"/>
-        </w:rPr>
+        <w:br/>
         <w:t xml:space="preserve">    transformers=[</w:t>
-      </w:r>
-    </w:p>
-    <w:p>
-      <w:r>
-        <w:rPr>
-          <w:rFonts w:ascii="Courier New" w:hAnsi="Courier New"/>
-          <w:sz w:val="17"/>
-        </w:rPr>
+        <w:br/>
         <w:t xml:space="preserve">        ("cat", Pipeline([</w:t>
-      </w:r>
-    </w:p>
-    <w:p>
-      <w:r>
-        <w:rPr>
-          <w:rFonts w:ascii="Courier New" w:hAnsi="Courier New"/>
-          <w:sz w:val="17"/>
-        </w:rPr>
+        <w:br/>
         <w:t xml:space="preserve">            ("imputer", SimpleImputer(strategy="most_frequent")),</w:t>
-      </w:r>
-    </w:p>
-    <w:p>
-      <w:r>
-        <w:rPr>
-          <w:rFonts w:ascii="Courier New" w:hAnsi="Courier New"/>
-          <w:sz w:val="17"/>
-        </w:rPr>
+        <w:br/>
         <w:t xml:space="preserve">            ("onehot", OneHotEncoder(handle_unknown="ignore", min_frequency=20)),</w:t>
-      </w:r>
-    </w:p>
-    <w:p>
-      <w:r>
-        <w:rPr>
-          <w:rFonts w:ascii="Courier New" w:hAnsi="Courier New"/>
-          <w:sz w:val="17"/>
-        </w:rPr>
+        <w:br/>
         <w:t xml:space="preserve">        ]), categorical_features),</w:t>
-      </w:r>
-    </w:p>
-    <w:p>
-      <w:r>
-        <w:rPr>
-          <w:rFonts w:ascii="Courier New" w:hAnsi="Courier New"/>
-          <w:sz w:val="17"/>
-        </w:rPr>
+        <w:br/>
         <w:t xml:space="preserve">        ("num", Pipeline([</w:t>
-      </w:r>
-    </w:p>
-    <w:p>
-      <w:r>
-        <w:rPr>
-          <w:rFonts w:ascii="Courier New" w:hAnsi="Courier New"/>
-          <w:sz w:val="17"/>
-        </w:rPr>
+        <w:br/>
         <w:t xml:space="preserve">            ("imputer", SimpleImputer(strategy="median")),</w:t>
-      </w:r>
-    </w:p>
-    <w:p>
-      <w:r>
-        <w:rPr>
-          <w:rFonts w:ascii="Courier New" w:hAnsi="Courier New"/>
-          <w:sz w:val="17"/>
-        </w:rPr>
+        <w:br/>
         <w:t xml:space="preserve">            ("scaler", StandardScaler()),</w:t>
-      </w:r>
-    </w:p>
-    <w:p>
-      <w:r>
-        <w:rPr>
-          <w:rFonts w:ascii="Courier New" w:hAnsi="Courier New"/>
-          <w:sz w:val="17"/>
-        </w:rPr>
+        <w:br/>
         <w:t xml:space="preserve">        ]), numeric_features),</w:t>
-      </w:r>
-    </w:p>
-    <w:p>
-      <w:r>
-        <w:rPr>
-          <w:rFonts w:ascii="Courier New" w:hAnsi="Courier New"/>
-          <w:sz w:val="17"/>
-        </w:rPr>
+        <w:br/>
         <w:t xml:space="preserve">    ]</w:t>
-      </w:r>
-    </w:p>
-    <w:p>
-      <w:r>
-        <w:rPr>
-          <w:rFonts w:ascii="Courier New" w:hAnsi="Courier New"/>
-          <w:sz w:val="17"/>
-        </w:rPr>
+        <w:br/>
         <w:t>)</w:t>
       </w:r>
     </w:p>
@@ -1865,109 +2058,101 @@
       </w:r>
     </w:p>
     <w:p>
+      <w:pPr>
+        <w:pStyle w:val="Heading2"/>
+      </w:pPr>
       <w:r>
-        <w:rPr>
-          <w:rFonts w:ascii="Courier New" w:hAnsi="Courier New"/>
-          <w:sz w:val="17"/>
-        </w:rPr>
-        <w:t>rf_pipeline = Pipeline([</w:t>
+        <w:t>Anexo D1. KNN linea base</w:t>
       </w:r>
     </w:p>
     <w:p>
+      <w:pPr>
+        <w:pStyle w:val="CodeBlock"/>
+        <w:spacing w:before="80" w:after="120"/>
+      </w:pPr>
       <w:r>
-        <w:rPr>
-          <w:rFonts w:ascii="Courier New" w:hAnsi="Courier New"/>
-          <w:sz w:val="17"/>
-        </w:rPr>
+        <w:t>knn_model = Pipeline([</w:t>
+        <w:br/>
         <w:t xml:space="preserve">    ("preprocess", preprocess),</w:t>
+        <w:br/>
+        <w:t xml:space="preserve">    ("model", KNeighborsClassifier(n_neighbors=5, weights="distance")),</w:t>
+        <w:br/>
+        <w:t>])</w:t>
+        <w:br/>
+        <w:br/>
+        <w:t>knn_model.fit(X_knn_train, y_knn_train)</w:t>
+        <w:br/>
+        <w:t>knn_pred = knn_model.predict(X_knn_test)</w:t>
       </w:r>
     </w:p>
     <w:p>
+      <w:pPr>
+        <w:pStyle w:val="Heading2"/>
+      </w:pPr>
       <w:r>
-        <w:rPr>
-          <w:rFonts w:ascii="Courier New" w:hAnsi="Courier New"/>
-          <w:sz w:val="17"/>
-        </w:rPr>
-        <w:t xml:space="preserve">    ("model", RandomForestClassifier(random_state=42, n_jobs=-1)),</w:t>
+        <w:t>Anexo D2. Regla IF-THEN del árbol de Decision</w:t>
       </w:r>
     </w:p>
     <w:p>
+      <w:pPr>
+        <w:pStyle w:val="CodeBlock"/>
+        <w:spacing w:before="80" w:after="120"/>
+      </w:pPr>
       <w:r>
-        <w:rPr>
-          <w:rFonts w:ascii="Courier New" w:hAnsi="Courier New"/>
-          <w:sz w:val="17"/>
-        </w:rPr>
+        <w:t>tree_rule_model = Pipeline([</w:t>
+        <w:br/>
+        <w:t xml:space="preserve">    ("preprocess", preprocess),</w:t>
+        <w:br/>
+        <w:t xml:space="preserve">    ("model", DecisionTreeClassifier(max_depth=3, min_samples_leaf=100, random_state=42)),</w:t>
+        <w:br/>
         <w:t>])</w:t>
+        <w:br/>
+        <w:br/>
+        <w:t>tree_rule_model.fit(X_train, y_train)</w:t>
+        <w:br/>
+        <w:t>tree_rules = export_text(</w:t>
+        <w:br/>
+        <w:t xml:space="preserve">    tree_rule_model.named_steps["model"],</w:t>
+        <w:br/>
+        <w:t xml:space="preserve">    feature_names=list(tree_rule_model.named_steps["preprocess"].get_feature_names_out()),</w:t>
+        <w:br/>
+        <w:t xml:space="preserve">    max_depth=3,</w:t>
+        <w:br/>
+        <w:t>)</w:t>
+        <w:br/>
+        <w:br/>
+        <w:t>print("Regla IF-THEN extraida del arbol:")</w:t>
+        <w:br/>
+        <w:t>print(tree_rules)</w:t>
       </w:r>
     </w:p>
     <w:p>
+      <w:pPr>
+        <w:pStyle w:val="CodeBlock"/>
+        <w:spacing w:before="80" w:after="120"/>
+      </w:pPr>
       <w:r>
-        <w:rPr>
-          <w:rFonts w:ascii="Courier New" w:hAnsi="Courier New"/>
-          <w:sz w:val="17"/>
-        </w:rPr>
-      </w:r>
-    </w:p>
-    <w:p>
-      <w:r>
-        <w:rPr>
-          <w:rFonts w:ascii="Courier New" w:hAnsi="Courier New"/>
-          <w:sz w:val="17"/>
-        </w:rPr>
+        <w:t>rf_pipeline = Pipeline([</w:t>
+        <w:br/>
+        <w:t xml:space="preserve">    ("preprocess", preprocess),</w:t>
+        <w:br/>
+        <w:t xml:space="preserve">    ("model", RandomForestClassifier(random_state=42, n_jobs=-1)),</w:t>
+        <w:br/>
+        <w:t>])</w:t>
+        <w:br/>
+        <w:br/>
         <w:t>param_distributions = {</w:t>
-      </w:r>
-    </w:p>
-    <w:p>
-      <w:r>
-        <w:rPr>
-          <w:rFonts w:ascii="Courier New" w:hAnsi="Courier New"/>
-          <w:sz w:val="17"/>
-        </w:rPr>
+        <w:br/>
         <w:t xml:space="preserve">    "model__n_estimators": [120, 200],</w:t>
-      </w:r>
-    </w:p>
-    <w:p>
-      <w:r>
-        <w:rPr>
-          <w:rFonts w:ascii="Courier New" w:hAnsi="Courier New"/>
-          <w:sz w:val="17"/>
-        </w:rPr>
+        <w:br/>
         <w:t xml:space="preserve">    "model__max_depth": [None, 12, 20],</w:t>
-      </w:r>
-    </w:p>
-    <w:p>
-      <w:r>
-        <w:rPr>
-          <w:rFonts w:ascii="Courier New" w:hAnsi="Courier New"/>
-          <w:sz w:val="17"/>
-        </w:rPr>
+        <w:br/>
         <w:t xml:space="preserve">    "model__min_samples_leaf": [1, 3, 5],</w:t>
-      </w:r>
-    </w:p>
-    <w:p>
-      <w:r>
-        <w:rPr>
-          <w:rFonts w:ascii="Courier New" w:hAnsi="Courier New"/>
-          <w:sz w:val="17"/>
-        </w:rPr>
+        <w:br/>
         <w:t xml:space="preserve">    "model__max_features": ["sqrt", "log2"],</w:t>
-      </w:r>
-    </w:p>
-    <w:p>
-      <w:r>
-        <w:rPr>
-          <w:rFonts w:ascii="Courier New" w:hAnsi="Courier New"/>
-          <w:sz w:val="17"/>
-        </w:rPr>
+        <w:br/>
         <w:t xml:space="preserve">    "model__class_weight": ["balanced", "balanced_subsample"],</w:t>
-      </w:r>
-    </w:p>
-    <w:p>
-      <w:r>
-        <w:rPr>
-          <w:rFonts w:ascii="Courier New" w:hAnsi="Courier New"/>
-          <w:sz w:val="17"/>
-        </w:rPr>
+        <w:br/>
         <w:t>}</w:t>
       </w:r>
     </w:p>
@@ -1980,138 +2165,66 @@
       </w:r>
     </w:p>
     <w:p>
+      <w:pPr>
+        <w:pStyle w:val="CodeBlock"/>
+        <w:spacing w:before="80" w:after="120"/>
+      </w:pPr>
       <w:r>
-        <w:rPr>
-          <w:rFonts w:ascii="Courier New" w:hAnsi="Courier New"/>
-          <w:sz w:val="17"/>
-        </w:rPr>
         <w:t>municipal = (</w:t>
-      </w:r>
-    </w:p>
-    <w:p>
-      <w:r>
-        <w:rPr>
-          <w:rFonts w:ascii="Courier New" w:hAnsi="Courier New"/>
-          <w:sz w:val="17"/>
-        </w:rPr>
+        <w:br/>
         <w:t xml:space="preserve">    atus.groupby(["ID_MUNICIPIO", "NOM_MUNICIPIO", "REGION"])</w:t>
-      </w:r>
-    </w:p>
-    <w:p>
-      <w:r>
-        <w:rPr>
-          <w:rFonts w:ascii="Courier New" w:hAnsi="Courier New"/>
-          <w:sz w:val="17"/>
-        </w:rPr>
+        <w:br/>
         <w:t xml:space="preserve">    .agg(</w:t>
-      </w:r>
-    </w:p>
-    <w:p>
-      <w:r>
-        <w:rPr>
-          <w:rFonts w:ascii="Courier New" w:hAnsi="Courier New"/>
-          <w:sz w:val="17"/>
-        </w:rPr>
+        <w:br/>
         <w:t xml:space="preserve">        accidentes=("GRAVE_BIN", "size"),</w:t>
-      </w:r>
-    </w:p>
-    <w:p>
-      <w:r>
-        <w:rPr>
-          <w:rFonts w:ascii="Courier New" w:hAnsi="Courier New"/>
-          <w:sz w:val="17"/>
-        </w:rPr>
+        <w:br/>
         <w:t xml:space="preserve">        pct_graves=("GRAVE_BIN", "mean"),</w:t>
-      </w:r>
-    </w:p>
-    <w:p>
-      <w:r>
-        <w:rPr>
-          <w:rFonts w:ascii="Courier New" w:hAnsi="Courier New"/>
-          <w:sz w:val="17"/>
-        </w:rPr>
+        <w:br/>
         <w:t xml:space="preserve">        heridos_prom=("TOTAL_HERIDOS", "mean"),</w:t>
-      </w:r>
-    </w:p>
-    <w:p>
-      <w:r>
-        <w:rPr>
-          <w:rFonts w:ascii="Courier New" w:hAnsi="Courier New"/>
-          <w:sz w:val="17"/>
-        </w:rPr>
+        <w:br/>
         <w:t xml:space="preserve">        muertos_prom=("TOTAL_MUERTOS", "mean"),</w:t>
-      </w:r>
-    </w:p>
-    <w:p>
-      <w:r>
-        <w:rPr>
-          <w:rFonts w:ascii="Courier New" w:hAnsi="Courier New"/>
-          <w:sz w:val="17"/>
-        </w:rPr>
+        <w:br/>
         <w:t xml:space="preserve">        pct_moto=("INVOLUCRA_MOTO", "mean"),</w:t>
-      </w:r>
-    </w:p>
-    <w:p>
-      <w:r>
-        <w:rPr>
-          <w:rFonts w:ascii="Courier New" w:hAnsi="Courier New"/>
-          <w:sz w:val="17"/>
-        </w:rPr>
+        <w:br/>
         <w:t xml:space="preserve">    )</w:t>
-      </w:r>
-    </w:p>
-    <w:p>
-      <w:r>
-        <w:rPr>
-          <w:rFonts w:ascii="Courier New" w:hAnsi="Courier New"/>
-          <w:sz w:val="17"/>
-        </w:rPr>
+        <w:br/>
         <w:t xml:space="preserve">    .reset_index()</w:t>
-      </w:r>
-    </w:p>
-    <w:p>
-      <w:r>
-        <w:rPr>
-          <w:rFonts w:ascii="Courier New" w:hAnsi="Courier New"/>
-          <w:sz w:val="17"/>
-        </w:rPr>
+        <w:br/>
         <w:t>)</w:t>
-      </w:r>
-    </w:p>
-    <w:p>
-      <w:r>
-        <w:rPr>
-          <w:rFonts w:ascii="Courier New" w:hAnsi="Courier New"/>
-          <w:sz w:val="17"/>
-        </w:rPr>
-      </w:r>
-    </w:p>
-    <w:p>
-      <w:r>
-        <w:rPr>
-          <w:rFonts w:ascii="Courier New" w:hAnsi="Courier New"/>
-          <w:sz w:val="17"/>
-        </w:rPr>
+        <w:br/>
+        <w:br/>
         <w:t>X_cluster = StandardScaler().fit_transform(municipal[cluster_features])</w:t>
-      </w:r>
-    </w:p>
-    <w:p>
-      <w:r>
-        <w:rPr>
-          <w:rFonts w:ascii="Courier New" w:hAnsi="Courier New"/>
-          <w:sz w:val="17"/>
-        </w:rPr>
+        <w:br/>
         <w:t>Z = linkage(X_cluster, method="ward")</w:t>
       </w:r>
     </w:p>
     <w:sectPr>
+      <w:footerReference w:type="default" r:id="rId9"/>
       <w:pgSz w:w="12240" w:h="15840"/>
-      <w:pgMar w:top="1080" w:right="1152" w:bottom="1080" w:left="1152" w:header="720" w:footer="720" w:gutter="0"/>
+      <w:pgMar w:top="1080" w:right="1224" w:bottom="1080" w:left="1224" w:header="720" w:footer="720" w:gutter="0"/>
       <w:cols w:space="720"/>
       <w:docGrid w:linePitch="360"/>
     </w:sectPr>
   </w:body>
 </w:document>
+</file>
+
+<file path=word/footer1.xml><?xml version="1.0" encoding="utf-8"?>
+<w:ftr xmlns:m="http://schemas.openxmlformats.org/officeDocument/2006/math" xmlns:mc="http://schemas.openxmlformats.org/markup-compatibility/2006" xmlns:mo="http://schemas.microsoft.com/office/mac/office/2008/main" xmlns:mv="urn:schemas-microsoft-com:mac:vml" xmlns:o="urn:schemas-microsoft-com:office:office" xmlns:r="http://schemas.openxmlformats.org/officeDocument/2006/relationships" xmlns:v="urn:schemas-microsoft-com:vml" xmlns:w10="urn:schemas-microsoft-com:office:word" xmlns:w14="http://schemas.microsoft.com/office/word/2010/wordml" xmlns:w="http://schemas.openxmlformats.org/wordprocessingml/2006/main" xmlns:wne="http://schemas.microsoft.com/office/word/2006/wordml" xmlns:wp14="http://schemas.microsoft.com/office/word/2010/wordprocessingDrawing" xmlns:wp="http://schemas.openxmlformats.org/drawingml/2006/wordprocessingDrawing" xmlns:wpc="http://schemas.microsoft.com/office/word/2010/wordprocessingCanvas" xmlns:wpg="http://schemas.microsoft.com/office/word/2010/wordprocessingGroup" xmlns:wpi="http://schemas.microsoft.com/office/word/2010/wordprocessingInk" xmlns:wps="http://schemas.microsoft.com/office/word/2010/wordprocessingShape" mc:Ignorable="w14 wp14">
+  <w:p>
+    <w:pPr>
+      <w:pStyle w:val="Footer"/>
+      <w:jc w:val="center"/>
+    </w:pPr>
+    <w:r>
+      <w:rPr>
+        <w:color w:val="576574"/>
+        <w:sz w:val="16"/>
+      </w:rPr>
+      <w:t>Prevencion vial en Sonora con ATUS</w:t>
+    </w:r>
+  </w:p>
+</w:ftr>
 </file>
 
 <file path=word/numbering.xml><?xml version="1.0" encoding="utf-8"?>
@@ -2478,7 +2591,7 @@
     <w:qFormat/>
     <w:rsid w:val="00FC693F"/>
     <w:rPr>
-      <w:rFonts w:ascii="Arial" w:hAnsi="Arial"/>
+      <w:rFonts w:ascii="Aptos" w:hAnsi="Aptos" w:eastAsia="Aptos"/>
       <w:sz w:val="21"/>
     </w:rPr>
   </w:style>
@@ -2541,11 +2654,11 @@
       <w:outlineLvl w:val="0"/>
     </w:pPr>
     <w:rPr>
-      <w:rFonts w:asciiTheme="majorHAnsi" w:eastAsiaTheme="majorEastAsia" w:hAnsiTheme="majorHAnsi" w:cstheme="majorBidi" w:ascii="Arial" w:hAnsi="Arial"/>
+      <w:rFonts w:asciiTheme="majorHAnsi" w:eastAsiaTheme="majorEastAsia" w:hAnsiTheme="majorHAnsi" w:cstheme="majorBidi" w:ascii="Aptos Display" w:hAnsi="Aptos Display" w:eastAsia="Aptos Display"/>
       <w:b/>
       <w:bCs/>
-      <w:color w:val="182D43"/>
-      <w:sz w:val="34"/>
+      <w:color w:val="207E76"/>
+      <w:sz w:val="30"/>
       <w:szCs w:val="28"/>
     </w:rPr>
   </w:style>
@@ -2565,11 +2678,11 @@
       <w:outlineLvl w:val="1"/>
     </w:pPr>
     <w:rPr>
-      <w:rFonts w:asciiTheme="majorHAnsi" w:eastAsiaTheme="majorEastAsia" w:hAnsiTheme="majorHAnsi" w:cstheme="majorBidi" w:ascii="Arial" w:hAnsi="Arial"/>
+      <w:rFonts w:asciiTheme="majorHAnsi" w:eastAsiaTheme="majorEastAsia" w:hAnsiTheme="majorHAnsi" w:cstheme="majorBidi" w:ascii="Aptos" w:hAnsi="Aptos" w:eastAsia="Aptos"/>
       <w:b/>
       <w:bCs/>
-      <w:color w:val="182D43"/>
-      <w:sz w:val="26"/>
+      <w:color w:val="18324A"/>
+      <w:sz w:val="25"/>
       <w:szCs w:val="26"/>
     </w:rPr>
   </w:style>
@@ -2589,10 +2702,10 @@
       <w:outlineLvl w:val="2"/>
     </w:pPr>
     <w:rPr>
-      <w:rFonts w:asciiTheme="majorHAnsi" w:eastAsiaTheme="majorEastAsia" w:hAnsiTheme="majorHAnsi" w:cstheme="majorBidi" w:ascii="Arial" w:hAnsi="Arial"/>
+      <w:rFonts w:asciiTheme="majorHAnsi" w:eastAsiaTheme="majorEastAsia" w:hAnsiTheme="majorHAnsi" w:cstheme="majorBidi" w:ascii="Aptos" w:hAnsi="Aptos" w:eastAsia="Aptos"/>
       <w:b/>
       <w:bCs/>
-      <w:color w:val="182D43"/>
+      <w:color w:val="D87E36"/>
       <w:sz w:val="22"/>
     </w:rPr>
   </w:style>
@@ -2831,11 +2944,12 @@
       <w:contextualSpacing/>
     </w:pPr>
     <w:rPr>
-      <w:rFonts w:asciiTheme="majorHAnsi" w:eastAsiaTheme="majorEastAsia" w:hAnsiTheme="majorHAnsi" w:cstheme="majorBidi"/>
-      <w:color w:val="17365D" w:themeColor="text2" w:themeShade="BF"/>
+      <w:rFonts w:asciiTheme="majorHAnsi" w:eastAsiaTheme="majorEastAsia" w:hAnsiTheme="majorHAnsi" w:cstheme="majorBidi" w:ascii="Aptos Display" w:hAnsi="Aptos Display" w:eastAsia="Aptos Display"/>
+      <w:b/>
+      <w:color w:val="18324A"/>
       <w:spacing w:val="5"/>
       <w:kern w:val="28"/>
-      <w:sz w:val="52"/>
+      <w:sz w:val="44"/>
       <w:szCs w:val="52"/>
     </w:rPr>
   </w:style>
@@ -14164,6 +14278,13 @@
         <w:shd w:val="clear" w:color="auto" w:fill="FBCAA2" w:themeFill="accent6" w:themeFillTint="7F"/>
       </w:tcPr>
     </w:tblStylePr>
+  </w:style>
+  <w:style w:type="paragraph" w:customStyle="1" w:styleId="CodeBlock">
+    <w:name w:val="CodeBlock"/>
+    <w:rPr>
+      <w:rFonts w:ascii="Consolas" w:hAnsi="Consolas" w:eastAsia="Consolas"/>
+      <w:sz w:val="17"/>
+    </w:rPr>
   </w:style>
 </w:styles>
 </file>

</xml_diff>

<commit_message>
Add .gitignore file and update project documentation
- Created a .gitignore file to exclude Python, Node, environment, and OS/editor files.
- Updated E1_Propuesta.pdf with corrections to project details, including the study period and methods.
- Expanded E4_Informe_Final_Codigo_Completo/Informe_Final_Prevencion_Vial_Sonora.docx with annexes detailing alignment with the proposal, data verification, regional analysis, temporal patterns, statistical evidence, and preventive synthesis.
- Enhanced informe_final.md with additional annexes summarizing findings and preventive actions based on data analysis.
- Removed outdated presentation files and README.md to streamline project structure.
- Deleted unnecessary files from the repository to maintain cleanliness.
</commit_message>
<xml_diff>
--- a/E4_Informe_Final_Codigo_Completo/Informe_Final_Prevencion_Vial_Sonora.docx
+++ b/E4_Informe_Final_Codigo_Completo/Informe_Final_Prevencion_Vial_Sonora.docx
@@ -2198,6 +2198,3361 @@
         <w:t>Z = linkage(X_cluster, method="ward")</w:t>
       </w:r>
     </w:p>
+    <w:p>
+      <w:r>
+        <w:br w:type="page"/>
+      </w:r>
+    </w:p>
+    <w:p>
+      <w:pPr>
+        <w:pStyle w:val="Heading1"/>
+      </w:pPr>
+      <w:r>
+        <w:t>Anexo ampliatorio A. Alineaci?n con la propuesta E1</w:t>
+      </w:r>
+    </w:p>
+    <w:p>
+      <w:pPr>
+        <w:spacing w:after="100"/>
+      </w:pPr>
+      <w:r>
+        <w:t>La propuesta original plante? estudiar los accidentes de tr?nsito en Sonora con ?nfasis en causas, gravedad y diferencias regionales. La ampliaci?n del informe retoma ese planteamiento y lo conecta con los resultados reales del cuaderno ATUS, de modo que el documento final no solo describa el modelo, sino que cierre expl?citamente la pregunta de investigaci?n: qu? patrones se observan y c?mo pueden apoyar la prevenci?n vial.</w:t>
+      </w:r>
+    </w:p>
+    <w:tbl>
+      <w:tblPr>
+        <w:tblStyle w:val="TableGrid"/>
+        <w:tblW w:type="auto" w:w="0"/>
+        <w:jc w:val="center"/>
+        <w:tblLook w:firstColumn="1" w:firstRow="1" w:lastColumn="0" w:lastRow="0" w:noHBand="0" w:noVBand="1" w:val="04A0"/>
+      </w:tblPr>
+      <w:tblGrid>
+        <w:gridCol w:w="4896"/>
+        <w:gridCol w:w="4896"/>
+      </w:tblGrid>
+      <w:tr>
+        <w:tc>
+          <w:tcPr>
+            <w:tcW w:type="dxa" w:w="2592"/>
+            <w:vAlign w:val="center"/>
+            <w:shd w:fill="D9EAF7"/>
+          </w:tcPr>
+          <w:p>
+            <w:pPr>
+              <w:jc w:val="left"/>
+            </w:pPr>
+            <w:r/>
+            <w:r>
+              <w:rPr>
+                <w:rFonts w:ascii="Arial" w:hAnsi="Arial"/>
+                <w:b/>
+                <w:sz w:val="17"/>
+              </w:rPr>
+              <w:t>Elemento de la propuesta</w:t>
+            </w:r>
+          </w:p>
+        </w:tc>
+        <w:tc>
+          <w:tcPr>
+            <w:tcW w:type="dxa" w:w="6768"/>
+            <w:vAlign w:val="center"/>
+            <w:shd w:fill="D9EAF7"/>
+          </w:tcPr>
+          <w:p>
+            <w:pPr>
+              <w:jc w:val="left"/>
+            </w:pPr>
+            <w:r/>
+            <w:r>
+              <w:rPr>
+                <w:rFonts w:ascii="Arial" w:hAnsi="Arial"/>
+                <w:b/>
+                <w:sz w:val="17"/>
+              </w:rPr>
+              <w:t>C?mo se resolvi? en el informe final</w:t>
+            </w:r>
+          </w:p>
+        </w:tc>
+      </w:tr>
+      <w:tr>
+        <w:tc>
+          <w:tcPr>
+            <w:tcW w:type="dxa" w:w="2592"/>
+            <w:vAlign w:val="center"/>
+          </w:tcPr>
+          <w:p>
+            <w:pPr>
+              <w:jc w:val="left"/>
+            </w:pPr>
+            <w:r/>
+            <w:r>
+              <w:rPr>
+                <w:rFonts w:ascii="Arial" w:hAnsi="Arial"/>
+                <w:b w:val="0"/>
+                <w:sz w:val="17"/>
+              </w:rPr>
+              <w:t>Problema</w:t>
+            </w:r>
+          </w:p>
+        </w:tc>
+        <w:tc>
+          <w:tcPr>
+            <w:tcW w:type="dxa" w:w="6768"/>
+            <w:vAlign w:val="center"/>
+          </w:tcPr>
+          <w:p>
+            <w:pPr>
+              <w:jc w:val="left"/>
+            </w:pPr>
+            <w:r/>
+            <w:r>
+              <w:rPr>
+                <w:rFonts w:ascii="Arial" w:hAnsi="Arial"/>
+                <w:b w:val="0"/>
+                <w:sz w:val="17"/>
+              </w:rPr>
+              <w:t>Ocurrencia de accidentes de tr?nsito en Sonora, con diferencias entre zonas urbanas, fronterizas, costeras, serranas y del sur.</w:t>
+            </w:r>
+          </w:p>
+        </w:tc>
+      </w:tr>
+      <w:tr>
+        <w:tc>
+          <w:tcPr>
+            <w:tcW w:type="dxa" w:w="2592"/>
+            <w:vAlign w:val="center"/>
+          </w:tcPr>
+          <w:p>
+            <w:pPr>
+              <w:jc w:val="left"/>
+            </w:pPr>
+            <w:r/>
+            <w:r>
+              <w:rPr>
+                <w:rFonts w:ascii="Arial" w:hAnsi="Arial"/>
+                <w:b w:val="0"/>
+                <w:sz w:val="17"/>
+              </w:rPr>
+              <w:t>Pregunta principal</w:t>
+            </w:r>
+          </w:p>
+        </w:tc>
+        <w:tc>
+          <w:tcPr>
+            <w:tcW w:type="dxa" w:w="6768"/>
+            <w:vAlign w:val="center"/>
+          </w:tcPr>
+          <w:p>
+            <w:pPr>
+              <w:jc w:val="left"/>
+            </w:pPr>
+            <w:r/>
+            <w:r>
+              <w:rPr>
+                <w:rFonts w:ascii="Arial" w:hAnsi="Arial"/>
+                <w:b w:val="0"/>
+                <w:sz w:val="17"/>
+              </w:rPr>
+              <w:t>Comparar patrones regionales, causas frecuentes y gravedad para proponer medidas preventivas.</w:t>
+            </w:r>
+          </w:p>
+        </w:tc>
+      </w:tr>
+      <w:tr>
+        <w:tc>
+          <w:tcPr>
+            <w:tcW w:type="dxa" w:w="2592"/>
+            <w:vAlign w:val="center"/>
+          </w:tcPr>
+          <w:p>
+            <w:pPr>
+              <w:jc w:val="left"/>
+            </w:pPr>
+            <w:r/>
+            <w:r>
+              <w:rPr>
+                <w:rFonts w:ascii="Arial" w:hAnsi="Arial"/>
+                <w:b w:val="0"/>
+                <w:sz w:val="17"/>
+              </w:rPr>
+              <w:t>Fuente de datos</w:t>
+            </w:r>
+          </w:p>
+        </w:tc>
+        <w:tc>
+          <w:tcPr>
+            <w:tcW w:type="dxa" w:w="6768"/>
+            <w:vAlign w:val="center"/>
+          </w:tcPr>
+          <w:p>
+            <w:pPr>
+              <w:jc w:val="left"/>
+            </w:pPr>
+            <w:r/>
+            <w:r>
+              <w:rPr>
+                <w:rFonts w:ascii="Arial" w:hAnsi="Arial"/>
+                <w:b w:val="0"/>
+                <w:sz w:val="17"/>
+              </w:rPr>
+              <w:t>ATUS de INEGI, periodo 2015-2024, filtrado a la entidad 26 Sonora.</w:t>
+            </w:r>
+          </w:p>
+        </w:tc>
+      </w:tr>
+      <w:tr>
+        <w:tc>
+          <w:tcPr>
+            <w:tcW w:type="dxa" w:w="2592"/>
+            <w:vAlign w:val="center"/>
+          </w:tcPr>
+          <w:p>
+            <w:pPr>
+              <w:jc w:val="left"/>
+            </w:pPr>
+            <w:r/>
+            <w:r>
+              <w:rPr>
+                <w:rFonts w:ascii="Arial" w:hAnsi="Arial"/>
+                <w:b w:val="0"/>
+                <w:sz w:val="17"/>
+              </w:rPr>
+              <w:t>M?todos previstos</w:t>
+            </w:r>
+          </w:p>
+        </w:tc>
+        <w:tc>
+          <w:tcPr>
+            <w:tcW w:type="dxa" w:w="6768"/>
+            <w:vAlign w:val="center"/>
+          </w:tcPr>
+          <w:p>
+            <w:pPr>
+              <w:jc w:val="left"/>
+            </w:pPr>
+            <w:r/>
+            <w:r>
+              <w:rPr>
+                <w:rFonts w:ascii="Arial" w:hAnsi="Arial"/>
+                <w:b w:val="0"/>
+                <w:sz w:val="17"/>
+              </w:rPr>
+              <w:t>EDA, an?lisis regional y temporal, clasificaci?n de gravedad, clustering y reglas de asociaci?n.</w:t>
+            </w:r>
+          </w:p>
+        </w:tc>
+      </w:tr>
+      <w:tr>
+        <w:tc>
+          <w:tcPr>
+            <w:tcW w:type="dxa" w:w="2592"/>
+            <w:vAlign w:val="center"/>
+          </w:tcPr>
+          <w:p>
+            <w:pPr>
+              <w:jc w:val="left"/>
+            </w:pPr>
+            <w:r/>
+            <w:r>
+              <w:rPr>
+                <w:rFonts w:ascii="Arial" w:hAnsi="Arial"/>
+                <w:b w:val="0"/>
+                <w:sz w:val="17"/>
+              </w:rPr>
+              <w:t>Enfoque preventivo</w:t>
+            </w:r>
+          </w:p>
+        </w:tc>
+        <w:tc>
+          <w:tcPr>
+            <w:tcW w:type="dxa" w:w="6768"/>
+            <w:vAlign w:val="center"/>
+          </w:tcPr>
+          <w:p>
+            <w:pPr>
+              <w:jc w:val="left"/>
+            </w:pPr>
+            <w:r/>
+            <w:r>
+              <w:rPr>
+                <w:rFonts w:ascii="Arial" w:hAnsi="Arial"/>
+                <w:b w:val="0"/>
+                <w:sz w:val="17"/>
+              </w:rPr>
+              <w:t>Traducir los hallazgos en acciones por regi?n, tipo de accidente, horario y perfil de riesgo.</w:t>
+            </w:r>
+          </w:p>
+        </w:tc>
+      </w:tr>
+    </w:tbl>
+    <w:p>
+      <w:pPr>
+        <w:spacing w:after="100"/>
+      </w:pPr>
+      <w:r>
+        <w:t>Esta comparaci?n confirma que el desarrollo conserv? la intenci?n inicial: usar miner?a de datos como apoyo interpretativo y no como una predicci?n absoluta. Tambi?n aclara por qu? la gravedad se defini? con base en heridos o fallecidos, tal como se propuso desde el inicio.</w:t>
+      </w:r>
+    </w:p>
+    <w:p>
+      <w:r>
+        <w:br w:type="page"/>
+      </w:r>
+    </w:p>
+    <w:p>
+      <w:pPr>
+        <w:pStyle w:val="Heading1"/>
+      </w:pPr>
+      <w:r>
+        <w:t>Anexo ampliatorio B. Verificaci?n de datos y depuraci?n</w:t>
+      </w:r>
+    </w:p>
+    <w:p>
+      <w:pPr>
+        <w:spacing w:after="100"/>
+      </w:pPr>
+      <w:r>
+        <w:t>Para verificar los datos, se recalcularon los principales indicadores directamente desde los CSV locales de ATUS 2015-2024 y el cat?logo municipal. Los resultados coinciden con los valores reportados en el cuaderno principal, por lo que las cifras del informe se consideran consistentes con la fuente de trabajo del proyecto.</w:t>
+      </w:r>
+    </w:p>
+    <w:tbl>
+      <w:tblPr>
+        <w:tblStyle w:val="TableGrid"/>
+        <w:tblW w:type="auto" w:w="0"/>
+        <w:jc w:val="center"/>
+        <w:tblLook w:firstColumn="1" w:firstRow="1" w:lastColumn="0" w:lastRow="0" w:noHBand="0" w:noVBand="1" w:val="04A0"/>
+      </w:tblPr>
+      <w:tblGrid>
+        <w:gridCol w:w="4896"/>
+        <w:gridCol w:w="4896"/>
+      </w:tblGrid>
+      <w:tr>
+        <w:tc>
+          <w:tcPr>
+            <w:tcW w:type="dxa" w:w="3888"/>
+            <w:vAlign w:val="center"/>
+            <w:shd w:fill="D9EAF7"/>
+          </w:tcPr>
+          <w:p>
+            <w:pPr>
+              <w:jc w:val="left"/>
+            </w:pPr>
+            <w:r/>
+            <w:r>
+              <w:rPr>
+                <w:rFonts w:ascii="Arial" w:hAnsi="Arial"/>
+                <w:b/>
+                <w:sz w:val="17"/>
+              </w:rPr>
+              <w:t>Indicador validado</w:t>
+            </w:r>
+          </w:p>
+        </w:tc>
+        <w:tc>
+          <w:tcPr>
+            <w:tcW w:type="dxa" w:w="3312"/>
+            <w:vAlign w:val="center"/>
+            <w:shd w:fill="D9EAF7"/>
+          </w:tcPr>
+          <w:p>
+            <w:pPr>
+              <w:jc w:val="left"/>
+            </w:pPr>
+            <w:r/>
+            <w:r>
+              <w:rPr>
+                <w:rFonts w:ascii="Arial" w:hAnsi="Arial"/>
+                <w:b/>
+                <w:sz w:val="17"/>
+              </w:rPr>
+              <w:t>Resultado recalculado</w:t>
+            </w:r>
+          </w:p>
+        </w:tc>
+      </w:tr>
+      <w:tr>
+        <w:tc>
+          <w:tcPr>
+            <w:tcW w:type="dxa" w:w="3888"/>
+            <w:vAlign w:val="center"/>
+          </w:tcPr>
+          <w:p>
+            <w:pPr>
+              <w:jc w:val="left"/>
+            </w:pPr>
+            <w:r/>
+            <w:r>
+              <w:rPr>
+                <w:rFonts w:ascii="Arial" w:hAnsi="Arial"/>
+                <w:b w:val="0"/>
+                <w:sz w:val="17"/>
+              </w:rPr>
+              <w:t>Registros de Sonora antes de depurar</w:t>
+            </w:r>
+          </w:p>
+        </w:tc>
+        <w:tc>
+          <w:tcPr>
+            <w:tcW w:type="dxa" w:w="3312"/>
+            <w:vAlign w:val="center"/>
+          </w:tcPr>
+          <w:p>
+            <w:pPr>
+              <w:jc w:val="left"/>
+            </w:pPr>
+            <w:r/>
+            <w:r>
+              <w:rPr>
+                <w:rFonts w:ascii="Arial" w:hAnsi="Arial"/>
+                <w:b w:val="0"/>
+                <w:sz w:val="17"/>
+              </w:rPr>
+              <w:t>187,104</w:t>
+            </w:r>
+          </w:p>
+        </w:tc>
+      </w:tr>
+      <w:tr>
+        <w:tc>
+          <w:tcPr>
+            <w:tcW w:type="dxa" w:w="3888"/>
+            <w:vAlign w:val="center"/>
+          </w:tcPr>
+          <w:p>
+            <w:pPr>
+              <w:jc w:val="left"/>
+            </w:pPr>
+            <w:r/>
+            <w:r>
+              <w:rPr>
+                <w:rFonts w:ascii="Arial" w:hAnsi="Arial"/>
+                <w:b w:val="0"/>
+                <w:sz w:val="17"/>
+              </w:rPr>
+              <w:t>Registros Certificado cero eliminados</w:t>
+            </w:r>
+          </w:p>
+        </w:tc>
+        <w:tc>
+          <w:tcPr>
+            <w:tcW w:type="dxa" w:w="3312"/>
+            <w:vAlign w:val="center"/>
+          </w:tcPr>
+          <w:p>
+            <w:pPr>
+              <w:jc w:val="left"/>
+            </w:pPr>
+            <w:r/>
+            <w:r>
+              <w:rPr>
+                <w:rFonts w:ascii="Arial" w:hAnsi="Arial"/>
+                <w:b w:val="0"/>
+                <w:sz w:val="17"/>
+              </w:rPr>
+              <w:t>3,193</w:t>
+            </w:r>
+          </w:p>
+        </w:tc>
+      </w:tr>
+      <w:tr>
+        <w:tc>
+          <w:tcPr>
+            <w:tcW w:type="dxa" w:w="3888"/>
+            <w:vAlign w:val="center"/>
+          </w:tcPr>
+          <w:p>
+            <w:pPr>
+              <w:jc w:val="left"/>
+            </w:pPr>
+            <w:r/>
+            <w:r>
+              <w:rPr>
+                <w:rFonts w:ascii="Arial" w:hAnsi="Arial"/>
+                <w:b w:val="0"/>
+                <w:sz w:val="17"/>
+              </w:rPr>
+              <w:t>Accidentes reales analizados</w:t>
+            </w:r>
+          </w:p>
+        </w:tc>
+        <w:tc>
+          <w:tcPr>
+            <w:tcW w:type="dxa" w:w="3312"/>
+            <w:vAlign w:val="center"/>
+          </w:tcPr>
+          <w:p>
+            <w:pPr>
+              <w:jc w:val="left"/>
+            </w:pPr>
+            <w:r/>
+            <w:r>
+              <w:rPr>
+                <w:rFonts w:ascii="Arial" w:hAnsi="Arial"/>
+                <w:b w:val="0"/>
+                <w:sz w:val="17"/>
+              </w:rPr>
+              <w:t>183,911</w:t>
+            </w:r>
+          </w:p>
+        </w:tc>
+      </w:tr>
+      <w:tr>
+        <w:tc>
+          <w:tcPr>
+            <w:tcW w:type="dxa" w:w="3888"/>
+            <w:vAlign w:val="center"/>
+          </w:tcPr>
+          <w:p>
+            <w:pPr>
+              <w:jc w:val="left"/>
+            </w:pPr>
+            <w:r/>
+            <w:r>
+              <w:rPr>
+                <w:rFonts w:ascii="Arial" w:hAnsi="Arial"/>
+                <w:b w:val="0"/>
+                <w:sz w:val="17"/>
+              </w:rPr>
+              <w:t>Accidentes solo da?os</w:t>
+            </w:r>
+          </w:p>
+        </w:tc>
+        <w:tc>
+          <w:tcPr>
+            <w:tcW w:type="dxa" w:w="3312"/>
+            <w:vAlign w:val="center"/>
+          </w:tcPr>
+          <w:p>
+            <w:pPr>
+              <w:jc w:val="left"/>
+            </w:pPr>
+            <w:r/>
+            <w:r>
+              <w:rPr>
+                <w:rFonts w:ascii="Arial" w:hAnsi="Arial"/>
+                <w:b w:val="0"/>
+                <w:sz w:val="17"/>
+              </w:rPr>
+              <w:t>152,659</w:t>
+            </w:r>
+          </w:p>
+        </w:tc>
+      </w:tr>
+      <w:tr>
+        <w:tc>
+          <w:tcPr>
+            <w:tcW w:type="dxa" w:w="3888"/>
+            <w:vAlign w:val="center"/>
+          </w:tcPr>
+          <w:p>
+            <w:pPr>
+              <w:jc w:val="left"/>
+            </w:pPr>
+            <w:r/>
+            <w:r>
+              <w:rPr>
+                <w:rFonts w:ascii="Arial" w:hAnsi="Arial"/>
+                <w:b w:val="0"/>
+                <w:sz w:val="17"/>
+              </w:rPr>
+              <w:t>Accidentes con heridos</w:t>
+            </w:r>
+          </w:p>
+        </w:tc>
+        <w:tc>
+          <w:tcPr>
+            <w:tcW w:type="dxa" w:w="3312"/>
+            <w:vAlign w:val="center"/>
+          </w:tcPr>
+          <w:p>
+            <w:pPr>
+              <w:jc w:val="left"/>
+            </w:pPr>
+            <w:r/>
+            <w:r>
+              <w:rPr>
+                <w:rFonts w:ascii="Arial" w:hAnsi="Arial"/>
+                <w:b w:val="0"/>
+                <w:sz w:val="17"/>
+              </w:rPr>
+              <w:t>29,277</w:t>
+            </w:r>
+          </w:p>
+        </w:tc>
+      </w:tr>
+      <w:tr>
+        <w:tc>
+          <w:tcPr>
+            <w:tcW w:type="dxa" w:w="3888"/>
+            <w:vAlign w:val="center"/>
+          </w:tcPr>
+          <w:p>
+            <w:pPr>
+              <w:jc w:val="left"/>
+            </w:pPr>
+            <w:r/>
+            <w:r>
+              <w:rPr>
+                <w:rFonts w:ascii="Arial" w:hAnsi="Arial"/>
+                <w:b w:val="0"/>
+                <w:sz w:val="17"/>
+              </w:rPr>
+              <w:t>Accidentes fatales</w:t>
+            </w:r>
+          </w:p>
+        </w:tc>
+        <w:tc>
+          <w:tcPr>
+            <w:tcW w:type="dxa" w:w="3312"/>
+            <w:vAlign w:val="center"/>
+          </w:tcPr>
+          <w:p>
+            <w:pPr>
+              <w:jc w:val="left"/>
+            </w:pPr>
+            <w:r/>
+            <w:r>
+              <w:rPr>
+                <w:rFonts w:ascii="Arial" w:hAnsi="Arial"/>
+                <w:b w:val="0"/>
+                <w:sz w:val="17"/>
+              </w:rPr>
+              <w:t>1,975</w:t>
+            </w:r>
+          </w:p>
+        </w:tc>
+      </w:tr>
+      <w:tr>
+        <w:tc>
+          <w:tcPr>
+            <w:tcW w:type="dxa" w:w="3888"/>
+            <w:vAlign w:val="center"/>
+          </w:tcPr>
+          <w:p>
+            <w:pPr>
+              <w:jc w:val="left"/>
+            </w:pPr>
+            <w:r/>
+            <w:r>
+              <w:rPr>
+                <w:rFonts w:ascii="Arial" w:hAnsi="Arial"/>
+                <w:b w:val="0"/>
+                <w:sz w:val="17"/>
+              </w:rPr>
+              <w:t>Porcentaje de accidentes graves</w:t>
+            </w:r>
+          </w:p>
+        </w:tc>
+        <w:tc>
+          <w:tcPr>
+            <w:tcW w:type="dxa" w:w="3312"/>
+            <w:vAlign w:val="center"/>
+          </w:tcPr>
+          <w:p>
+            <w:pPr>
+              <w:jc w:val="left"/>
+            </w:pPr>
+            <w:r/>
+            <w:r>
+              <w:rPr>
+                <w:rFonts w:ascii="Arial" w:hAnsi="Arial"/>
+                <w:b w:val="0"/>
+                <w:sz w:val="17"/>
+              </w:rPr>
+              <w:t>16.99%</w:t>
+            </w:r>
+          </w:p>
+        </w:tc>
+      </w:tr>
+      <w:tr>
+        <w:tc>
+          <w:tcPr>
+            <w:tcW w:type="dxa" w:w="3888"/>
+            <w:vAlign w:val="center"/>
+          </w:tcPr>
+          <w:p>
+            <w:pPr>
+              <w:jc w:val="left"/>
+            </w:pPr>
+            <w:r/>
+            <w:r>
+              <w:rPr>
+                <w:rFonts w:ascii="Arial" w:hAnsi="Arial"/>
+                <w:b w:val="0"/>
+                <w:sz w:val="17"/>
+              </w:rPr>
+              <w:t>Personas heridas registradas</w:t>
+            </w:r>
+          </w:p>
+        </w:tc>
+        <w:tc>
+          <w:tcPr>
+            <w:tcW w:type="dxa" w:w="3312"/>
+            <w:vAlign w:val="center"/>
+          </w:tcPr>
+          <w:p>
+            <w:pPr>
+              <w:jc w:val="left"/>
+            </w:pPr>
+            <w:r/>
+            <w:r>
+              <w:rPr>
+                <w:rFonts w:ascii="Arial" w:hAnsi="Arial"/>
+                <w:b w:val="0"/>
+                <w:sz w:val="17"/>
+              </w:rPr>
+              <w:t>39,686</w:t>
+            </w:r>
+          </w:p>
+        </w:tc>
+      </w:tr>
+      <w:tr>
+        <w:tc>
+          <w:tcPr>
+            <w:tcW w:type="dxa" w:w="3888"/>
+            <w:vAlign w:val="center"/>
+          </w:tcPr>
+          <w:p>
+            <w:pPr>
+              <w:jc w:val="left"/>
+            </w:pPr>
+            <w:r/>
+            <w:r>
+              <w:rPr>
+                <w:rFonts w:ascii="Arial" w:hAnsi="Arial"/>
+                <w:b w:val="0"/>
+                <w:sz w:val="17"/>
+              </w:rPr>
+              <w:t>Personas fallecidas registradas</w:t>
+            </w:r>
+          </w:p>
+        </w:tc>
+        <w:tc>
+          <w:tcPr>
+            <w:tcW w:type="dxa" w:w="3312"/>
+            <w:vAlign w:val="center"/>
+          </w:tcPr>
+          <w:p>
+            <w:pPr>
+              <w:jc w:val="left"/>
+            </w:pPr>
+            <w:r/>
+            <w:r>
+              <w:rPr>
+                <w:rFonts w:ascii="Arial" w:hAnsi="Arial"/>
+                <w:b w:val="0"/>
+                <w:sz w:val="17"/>
+              </w:rPr>
+              <w:t>2,221</w:t>
+            </w:r>
+          </w:p>
+        </w:tc>
+      </w:tr>
+    </w:tbl>
+    <w:p>
+      <w:pPr>
+        <w:spacing w:after="100"/>
+      </w:pPr>
+      <w:r>
+        <w:t>La eliminaci?n de Certificado cero es metodol?gicamente necesaria porque esos renglones indican ausencia de accidente. Mantenerlos habr?a reducido artificialmente la proporci?n de gravedad y habr?a introducido ruido en las comparaciones regionales y temporales.</w:t>
+      </w:r>
+    </w:p>
+    <w:p>
+      <w:r>
+        <w:br w:type="page"/>
+      </w:r>
+    </w:p>
+    <w:p>
+      <w:pPr>
+        <w:pStyle w:val="Heading1"/>
+      </w:pPr>
+      <w:r>
+        <w:t>Anexo ampliatorio C. Lectura territorial de los resultados</w:t>
+      </w:r>
+    </w:p>
+    <w:p>
+      <w:pPr>
+        <w:spacing w:after="100"/>
+      </w:pPr>
+      <w:r>
+        <w:t>El an?lisis regional muestra que el volumen de accidentes y la gravedad relativa no apuntan siempre al mismo lugar. Hermosillo concentra la mayor cantidad de registros, pero Sierra, Centro y Sur y Valle presentan porcentajes de gravedad superiores. Esta distinci?n es central para proponer medidas preventivas m?s justas: no basta con ordenar municipios por n?mero de accidentes.</w:t>
+      </w:r>
+    </w:p>
+    <w:tbl>
+      <w:tblPr>
+        <w:tblStyle w:val="TableGrid"/>
+        <w:tblW w:type="auto" w:w="0"/>
+        <w:jc w:val="center"/>
+        <w:tblLook w:firstColumn="1" w:firstRow="1" w:lastColumn="0" w:lastRow="0" w:noHBand="0" w:noVBand="1" w:val="04A0"/>
+      </w:tblPr>
+      <w:tblGrid>
+        <w:gridCol w:w="1632"/>
+        <w:gridCol w:w="1632"/>
+        <w:gridCol w:w="1632"/>
+        <w:gridCol w:w="1632"/>
+        <w:gridCol w:w="1632"/>
+        <w:gridCol w:w="1632"/>
+      </w:tblGrid>
+      <w:tr>
+        <w:tc>
+          <w:tcPr>
+            <w:tcW w:type="dxa" w:w="1944"/>
+            <w:vAlign w:val="center"/>
+            <w:shd w:fill="D9EAF7"/>
+          </w:tcPr>
+          <w:p>
+            <w:pPr>
+              <w:jc w:val="left"/>
+            </w:pPr>
+            <w:r/>
+            <w:r>
+              <w:rPr>
+                <w:rFonts w:ascii="Arial" w:hAnsi="Arial"/>
+                <w:b/>
+                <w:sz w:val="17"/>
+              </w:rPr>
+              <w:t>Regi?n</w:t>
+            </w:r>
+          </w:p>
+        </w:tc>
+        <w:tc>
+          <w:tcPr>
+            <w:tcW w:type="dxa" w:w="1440"/>
+            <w:vAlign w:val="center"/>
+            <w:shd w:fill="D9EAF7"/>
+          </w:tcPr>
+          <w:p>
+            <w:pPr>
+              <w:jc w:val="left"/>
+            </w:pPr>
+            <w:r/>
+            <w:r>
+              <w:rPr>
+                <w:rFonts w:ascii="Arial" w:hAnsi="Arial"/>
+                <w:b/>
+                <w:sz w:val="17"/>
+              </w:rPr>
+              <w:t>Accidentes</w:t>
+            </w:r>
+          </w:p>
+        </w:tc>
+        <w:tc>
+          <w:tcPr>
+            <w:tcW w:type="dxa" w:w="1224"/>
+            <w:vAlign w:val="center"/>
+            <w:shd w:fill="D9EAF7"/>
+          </w:tcPr>
+          <w:p>
+            <w:pPr>
+              <w:jc w:val="left"/>
+            </w:pPr>
+            <w:r/>
+            <w:r>
+              <w:rPr>
+                <w:rFonts w:ascii="Arial" w:hAnsi="Arial"/>
+                <w:b/>
+                <w:sz w:val="17"/>
+              </w:rPr>
+              <w:t>Graves</w:t>
+            </w:r>
+          </w:p>
+        </w:tc>
+        <w:tc>
+          <w:tcPr>
+            <w:tcW w:type="dxa" w:w="1152"/>
+            <w:vAlign w:val="center"/>
+            <w:shd w:fill="D9EAF7"/>
+          </w:tcPr>
+          <w:p>
+            <w:pPr>
+              <w:jc w:val="left"/>
+            </w:pPr>
+            <w:r/>
+            <w:r>
+              <w:rPr>
+                <w:rFonts w:ascii="Arial" w:hAnsi="Arial"/>
+                <w:b/>
+                <w:sz w:val="17"/>
+              </w:rPr>
+              <w:t>% graves</w:t>
+            </w:r>
+          </w:p>
+        </w:tc>
+        <w:tc>
+          <w:tcPr>
+            <w:tcW w:type="dxa" w:w="1224"/>
+            <w:vAlign w:val="center"/>
+            <w:shd w:fill="D9EAF7"/>
+          </w:tcPr>
+          <w:p>
+            <w:pPr>
+              <w:jc w:val="left"/>
+            </w:pPr>
+            <w:r/>
+            <w:r>
+              <w:rPr>
+                <w:rFonts w:ascii="Arial" w:hAnsi="Arial"/>
+                <w:b/>
+                <w:sz w:val="17"/>
+              </w:rPr>
+              <w:t>Heridos</w:t>
+            </w:r>
+          </w:p>
+        </w:tc>
+        <w:tc>
+          <w:tcPr>
+            <w:tcW w:type="dxa" w:w="1224"/>
+            <w:vAlign w:val="center"/>
+            <w:shd w:fill="D9EAF7"/>
+          </w:tcPr>
+          <w:p>
+            <w:pPr>
+              <w:jc w:val="left"/>
+            </w:pPr>
+            <w:r/>
+            <w:r>
+              <w:rPr>
+                <w:rFonts w:ascii="Arial" w:hAnsi="Arial"/>
+                <w:b/>
+                <w:sz w:val="17"/>
+              </w:rPr>
+              <w:t>Fallecidos</w:t>
+            </w:r>
+          </w:p>
+        </w:tc>
+      </w:tr>
+      <w:tr>
+        <w:tc>
+          <w:tcPr>
+            <w:tcW w:type="dxa" w:w="1944"/>
+            <w:vAlign w:val="center"/>
+          </w:tcPr>
+          <w:p>
+            <w:pPr>
+              <w:jc w:val="left"/>
+            </w:pPr>
+            <w:r/>
+            <w:r>
+              <w:rPr>
+                <w:rFonts w:ascii="Arial" w:hAnsi="Arial"/>
+                <w:b w:val="0"/>
+                <w:sz w:val="17"/>
+              </w:rPr>
+              <w:t>Hermosillo</w:t>
+            </w:r>
+          </w:p>
+        </w:tc>
+        <w:tc>
+          <w:tcPr>
+            <w:tcW w:type="dxa" w:w="1440"/>
+            <w:vAlign w:val="center"/>
+          </w:tcPr>
+          <w:p>
+            <w:pPr>
+              <w:jc w:val="left"/>
+            </w:pPr>
+            <w:r/>
+            <w:r>
+              <w:rPr>
+                <w:rFonts w:ascii="Arial" w:hAnsi="Arial"/>
+                <w:b w:val="0"/>
+                <w:sz w:val="17"/>
+              </w:rPr>
+              <w:t>65,252</w:t>
+            </w:r>
+          </w:p>
+        </w:tc>
+        <w:tc>
+          <w:tcPr>
+            <w:tcW w:type="dxa" w:w="1224"/>
+            <w:vAlign w:val="center"/>
+          </w:tcPr>
+          <w:p>
+            <w:pPr>
+              <w:jc w:val="left"/>
+            </w:pPr>
+            <w:r/>
+            <w:r>
+              <w:rPr>
+                <w:rFonts w:ascii="Arial" w:hAnsi="Arial"/>
+                <w:b w:val="0"/>
+                <w:sz w:val="17"/>
+              </w:rPr>
+              <w:t>8,736</w:t>
+            </w:r>
+          </w:p>
+        </w:tc>
+        <w:tc>
+          <w:tcPr>
+            <w:tcW w:type="dxa" w:w="1152"/>
+            <w:vAlign w:val="center"/>
+          </w:tcPr>
+          <w:p>
+            <w:pPr>
+              <w:jc w:val="left"/>
+            </w:pPr>
+            <w:r/>
+            <w:r>
+              <w:rPr>
+                <w:rFonts w:ascii="Arial" w:hAnsi="Arial"/>
+                <w:b w:val="0"/>
+                <w:sz w:val="17"/>
+              </w:rPr>
+              <w:t>13.39%</w:t>
+            </w:r>
+          </w:p>
+        </w:tc>
+        <w:tc>
+          <w:tcPr>
+            <w:tcW w:type="dxa" w:w="1224"/>
+            <w:vAlign w:val="center"/>
+          </w:tcPr>
+          <w:p>
+            <w:pPr>
+              <w:jc w:val="left"/>
+            </w:pPr>
+            <w:r/>
+            <w:r>
+              <w:rPr>
+                <w:rFonts w:ascii="Arial" w:hAnsi="Arial"/>
+                <w:b w:val="0"/>
+                <w:sz w:val="17"/>
+              </w:rPr>
+              <w:t>10,563</w:t>
+            </w:r>
+          </w:p>
+        </w:tc>
+        <w:tc>
+          <w:tcPr>
+            <w:tcW w:type="dxa" w:w="1224"/>
+            <w:vAlign w:val="center"/>
+          </w:tcPr>
+          <w:p>
+            <w:pPr>
+              <w:jc w:val="left"/>
+            </w:pPr>
+            <w:r/>
+            <w:r>
+              <w:rPr>
+                <w:rFonts w:ascii="Arial" w:hAnsi="Arial"/>
+                <w:b w:val="0"/>
+                <w:sz w:val="17"/>
+              </w:rPr>
+              <w:t>480</w:t>
+            </w:r>
+          </w:p>
+        </w:tc>
+      </w:tr>
+      <w:tr>
+        <w:tc>
+          <w:tcPr>
+            <w:tcW w:type="dxa" w:w="1944"/>
+            <w:vAlign w:val="center"/>
+          </w:tcPr>
+          <w:p>
+            <w:pPr>
+              <w:jc w:val="left"/>
+            </w:pPr>
+            <w:r/>
+            <w:r>
+              <w:rPr>
+                <w:rFonts w:ascii="Arial" w:hAnsi="Arial"/>
+                <w:b w:val="0"/>
+                <w:sz w:val="17"/>
+              </w:rPr>
+              <w:t>Sur y Valle</w:t>
+            </w:r>
+          </w:p>
+        </w:tc>
+        <w:tc>
+          <w:tcPr>
+            <w:tcW w:type="dxa" w:w="1440"/>
+            <w:vAlign w:val="center"/>
+          </w:tcPr>
+          <w:p>
+            <w:pPr>
+              <w:jc w:val="left"/>
+            </w:pPr>
+            <w:r/>
+            <w:r>
+              <w:rPr>
+                <w:rFonts w:ascii="Arial" w:hAnsi="Arial"/>
+                <w:b w:val="0"/>
+                <w:sz w:val="17"/>
+              </w:rPr>
+              <w:t>54,154</w:t>
+            </w:r>
+          </w:p>
+        </w:tc>
+        <w:tc>
+          <w:tcPr>
+            <w:tcW w:type="dxa" w:w="1224"/>
+            <w:vAlign w:val="center"/>
+          </w:tcPr>
+          <w:p>
+            <w:pPr>
+              <w:jc w:val="left"/>
+            </w:pPr>
+            <w:r/>
+            <w:r>
+              <w:rPr>
+                <w:rFonts w:ascii="Arial" w:hAnsi="Arial"/>
+                <w:b w:val="0"/>
+                <w:sz w:val="17"/>
+              </w:rPr>
+              <w:t>11,436</w:t>
+            </w:r>
+          </w:p>
+        </w:tc>
+        <w:tc>
+          <w:tcPr>
+            <w:tcW w:type="dxa" w:w="1152"/>
+            <w:vAlign w:val="center"/>
+          </w:tcPr>
+          <w:p>
+            <w:pPr>
+              <w:jc w:val="left"/>
+            </w:pPr>
+            <w:r/>
+            <w:r>
+              <w:rPr>
+                <w:rFonts w:ascii="Arial" w:hAnsi="Arial"/>
+                <w:b w:val="0"/>
+                <w:sz w:val="17"/>
+              </w:rPr>
+              <w:t>21.12%</w:t>
+            </w:r>
+          </w:p>
+        </w:tc>
+        <w:tc>
+          <w:tcPr>
+            <w:tcW w:type="dxa" w:w="1224"/>
+            <w:vAlign w:val="center"/>
+          </w:tcPr>
+          <w:p>
+            <w:pPr>
+              <w:jc w:val="left"/>
+            </w:pPr>
+            <w:r/>
+            <w:r>
+              <w:rPr>
+                <w:rFonts w:ascii="Arial" w:hAnsi="Arial"/>
+                <w:b w:val="0"/>
+                <w:sz w:val="17"/>
+              </w:rPr>
+              <w:t>14,403</w:t>
+            </w:r>
+          </w:p>
+        </w:tc>
+        <w:tc>
+          <w:tcPr>
+            <w:tcW w:type="dxa" w:w="1224"/>
+            <w:vAlign w:val="center"/>
+          </w:tcPr>
+          <w:p>
+            <w:pPr>
+              <w:jc w:val="left"/>
+            </w:pPr>
+            <w:r/>
+            <w:r>
+              <w:rPr>
+                <w:rFonts w:ascii="Arial" w:hAnsi="Arial"/>
+                <w:b w:val="0"/>
+                <w:sz w:val="17"/>
+              </w:rPr>
+              <w:t>783</w:t>
+            </w:r>
+          </w:p>
+        </w:tc>
+      </w:tr>
+      <w:tr>
+        <w:tc>
+          <w:tcPr>
+            <w:tcW w:type="dxa" w:w="1944"/>
+            <w:vAlign w:val="center"/>
+          </w:tcPr>
+          <w:p>
+            <w:pPr>
+              <w:jc w:val="left"/>
+            </w:pPr>
+            <w:r/>
+            <w:r>
+              <w:rPr>
+                <w:rFonts w:ascii="Arial" w:hAnsi="Arial"/>
+                <w:b w:val="0"/>
+                <w:sz w:val="17"/>
+              </w:rPr>
+              <w:t>Frontera</w:t>
+            </w:r>
+          </w:p>
+        </w:tc>
+        <w:tc>
+          <w:tcPr>
+            <w:tcW w:type="dxa" w:w="1440"/>
+            <w:vAlign w:val="center"/>
+          </w:tcPr>
+          <w:p>
+            <w:pPr>
+              <w:jc w:val="left"/>
+            </w:pPr>
+            <w:r/>
+            <w:r>
+              <w:rPr>
+                <w:rFonts w:ascii="Arial" w:hAnsi="Arial"/>
+                <w:b w:val="0"/>
+                <w:sz w:val="17"/>
+              </w:rPr>
+              <w:t>44,264</w:t>
+            </w:r>
+          </w:p>
+        </w:tc>
+        <w:tc>
+          <w:tcPr>
+            <w:tcW w:type="dxa" w:w="1224"/>
+            <w:vAlign w:val="center"/>
+          </w:tcPr>
+          <w:p>
+            <w:pPr>
+              <w:jc w:val="left"/>
+            </w:pPr>
+            <w:r/>
+            <w:r>
+              <w:rPr>
+                <w:rFonts w:ascii="Arial" w:hAnsi="Arial"/>
+                <w:b w:val="0"/>
+                <w:sz w:val="17"/>
+              </w:rPr>
+              <w:t>7,415</w:t>
+            </w:r>
+          </w:p>
+        </w:tc>
+        <w:tc>
+          <w:tcPr>
+            <w:tcW w:type="dxa" w:w="1152"/>
+            <w:vAlign w:val="center"/>
+          </w:tcPr>
+          <w:p>
+            <w:pPr>
+              <w:jc w:val="left"/>
+            </w:pPr>
+            <w:r/>
+            <w:r>
+              <w:rPr>
+                <w:rFonts w:ascii="Arial" w:hAnsi="Arial"/>
+                <w:b w:val="0"/>
+                <w:sz w:val="17"/>
+              </w:rPr>
+              <w:t>16.75%</w:t>
+            </w:r>
+          </w:p>
+        </w:tc>
+        <w:tc>
+          <w:tcPr>
+            <w:tcW w:type="dxa" w:w="1224"/>
+            <w:vAlign w:val="center"/>
+          </w:tcPr>
+          <w:p>
+            <w:pPr>
+              <w:jc w:val="left"/>
+            </w:pPr>
+            <w:r/>
+            <w:r>
+              <w:rPr>
+                <w:rFonts w:ascii="Arial" w:hAnsi="Arial"/>
+                <w:b w:val="0"/>
+                <w:sz w:val="17"/>
+              </w:rPr>
+              <w:t>9,671</w:t>
+            </w:r>
+          </w:p>
+        </w:tc>
+        <w:tc>
+          <w:tcPr>
+            <w:tcW w:type="dxa" w:w="1224"/>
+            <w:vAlign w:val="center"/>
+          </w:tcPr>
+          <w:p>
+            <w:pPr>
+              <w:jc w:val="left"/>
+            </w:pPr>
+            <w:r/>
+            <w:r>
+              <w:rPr>
+                <w:rFonts w:ascii="Arial" w:hAnsi="Arial"/>
+                <w:b w:val="0"/>
+                <w:sz w:val="17"/>
+              </w:rPr>
+              <w:t>499</w:t>
+            </w:r>
+          </w:p>
+        </w:tc>
+      </w:tr>
+      <w:tr>
+        <w:tc>
+          <w:tcPr>
+            <w:tcW w:type="dxa" w:w="1944"/>
+            <w:vAlign w:val="center"/>
+          </w:tcPr>
+          <w:p>
+            <w:pPr>
+              <w:jc w:val="left"/>
+            </w:pPr>
+            <w:r/>
+            <w:r>
+              <w:rPr>
+                <w:rFonts w:ascii="Arial" w:hAnsi="Arial"/>
+                <w:b w:val="0"/>
+                <w:sz w:val="17"/>
+              </w:rPr>
+              <w:t>Costa y desierto</w:t>
+            </w:r>
+          </w:p>
+        </w:tc>
+        <w:tc>
+          <w:tcPr>
+            <w:tcW w:type="dxa" w:w="1440"/>
+            <w:vAlign w:val="center"/>
+          </w:tcPr>
+          <w:p>
+            <w:pPr>
+              <w:jc w:val="left"/>
+            </w:pPr>
+            <w:r/>
+            <w:r>
+              <w:rPr>
+                <w:rFonts w:ascii="Arial" w:hAnsi="Arial"/>
+                <w:b w:val="0"/>
+                <w:sz w:val="17"/>
+              </w:rPr>
+              <w:t>16,943</w:t>
+            </w:r>
+          </w:p>
+        </w:tc>
+        <w:tc>
+          <w:tcPr>
+            <w:tcW w:type="dxa" w:w="1224"/>
+            <w:vAlign w:val="center"/>
+          </w:tcPr>
+          <w:p>
+            <w:pPr>
+              <w:jc w:val="left"/>
+            </w:pPr>
+            <w:r/>
+            <w:r>
+              <w:rPr>
+                <w:rFonts w:ascii="Arial" w:hAnsi="Arial"/>
+                <w:b w:val="0"/>
+                <w:sz w:val="17"/>
+              </w:rPr>
+              <w:t>2,935</w:t>
+            </w:r>
+          </w:p>
+        </w:tc>
+        <w:tc>
+          <w:tcPr>
+            <w:tcW w:type="dxa" w:w="1152"/>
+            <w:vAlign w:val="center"/>
+          </w:tcPr>
+          <w:p>
+            <w:pPr>
+              <w:jc w:val="left"/>
+            </w:pPr>
+            <w:r/>
+            <w:r>
+              <w:rPr>
+                <w:rFonts w:ascii="Arial" w:hAnsi="Arial"/>
+                <w:b w:val="0"/>
+                <w:sz w:val="17"/>
+              </w:rPr>
+              <w:t>17.32%</w:t>
+            </w:r>
+          </w:p>
+        </w:tc>
+        <w:tc>
+          <w:tcPr>
+            <w:tcW w:type="dxa" w:w="1224"/>
+            <w:vAlign w:val="center"/>
+          </w:tcPr>
+          <w:p>
+            <w:pPr>
+              <w:jc w:val="left"/>
+            </w:pPr>
+            <w:r/>
+            <w:r>
+              <w:rPr>
+                <w:rFonts w:ascii="Arial" w:hAnsi="Arial"/>
+                <w:b w:val="0"/>
+                <w:sz w:val="17"/>
+              </w:rPr>
+              <w:t>4,035</w:t>
+            </w:r>
+          </w:p>
+        </w:tc>
+        <w:tc>
+          <w:tcPr>
+            <w:tcW w:type="dxa" w:w="1224"/>
+            <w:vAlign w:val="center"/>
+          </w:tcPr>
+          <w:p>
+            <w:pPr>
+              <w:jc w:val="left"/>
+            </w:pPr>
+            <w:r/>
+            <w:r>
+              <w:rPr>
+                <w:rFonts w:ascii="Arial" w:hAnsi="Arial"/>
+                <w:b w:val="0"/>
+                <w:sz w:val="17"/>
+              </w:rPr>
+              <w:t>305</w:t>
+            </w:r>
+          </w:p>
+        </w:tc>
+      </w:tr>
+      <w:tr>
+        <w:tc>
+          <w:tcPr>
+            <w:tcW w:type="dxa" w:w="1944"/>
+            <w:vAlign w:val="center"/>
+          </w:tcPr>
+          <w:p>
+            <w:pPr>
+              <w:jc w:val="left"/>
+            </w:pPr>
+            <w:r/>
+            <w:r>
+              <w:rPr>
+                <w:rFonts w:ascii="Arial" w:hAnsi="Arial"/>
+                <w:b w:val="0"/>
+                <w:sz w:val="17"/>
+              </w:rPr>
+              <w:t>Centro</w:t>
+            </w:r>
+          </w:p>
+        </w:tc>
+        <w:tc>
+          <w:tcPr>
+            <w:tcW w:type="dxa" w:w="1440"/>
+            <w:vAlign w:val="center"/>
+          </w:tcPr>
+          <w:p>
+            <w:pPr>
+              <w:jc w:val="left"/>
+            </w:pPr>
+            <w:r/>
+            <w:r>
+              <w:rPr>
+                <w:rFonts w:ascii="Arial" w:hAnsi="Arial"/>
+                <w:b w:val="0"/>
+                <w:sz w:val="17"/>
+              </w:rPr>
+              <w:t>1,872</w:t>
+            </w:r>
+          </w:p>
+        </w:tc>
+        <w:tc>
+          <w:tcPr>
+            <w:tcW w:type="dxa" w:w="1224"/>
+            <w:vAlign w:val="center"/>
+          </w:tcPr>
+          <w:p>
+            <w:pPr>
+              <w:jc w:val="left"/>
+            </w:pPr>
+            <w:r/>
+            <w:r>
+              <w:rPr>
+                <w:rFonts w:ascii="Arial" w:hAnsi="Arial"/>
+                <w:b w:val="0"/>
+                <w:sz w:val="17"/>
+              </w:rPr>
+              <w:t>419</w:t>
+            </w:r>
+          </w:p>
+        </w:tc>
+        <w:tc>
+          <w:tcPr>
+            <w:tcW w:type="dxa" w:w="1152"/>
+            <w:vAlign w:val="center"/>
+          </w:tcPr>
+          <w:p>
+            <w:pPr>
+              <w:jc w:val="left"/>
+            </w:pPr>
+            <w:r/>
+            <w:r>
+              <w:rPr>
+                <w:rFonts w:ascii="Arial" w:hAnsi="Arial"/>
+                <w:b w:val="0"/>
+                <w:sz w:val="17"/>
+              </w:rPr>
+              <w:t>22.38%</w:t>
+            </w:r>
+          </w:p>
+        </w:tc>
+        <w:tc>
+          <w:tcPr>
+            <w:tcW w:type="dxa" w:w="1224"/>
+            <w:vAlign w:val="center"/>
+          </w:tcPr>
+          <w:p>
+            <w:pPr>
+              <w:jc w:val="left"/>
+            </w:pPr>
+            <w:r/>
+            <w:r>
+              <w:rPr>
+                <w:rFonts w:ascii="Arial" w:hAnsi="Arial"/>
+                <w:b w:val="0"/>
+                <w:sz w:val="17"/>
+              </w:rPr>
+              <w:t>605</w:t>
+            </w:r>
+          </w:p>
+        </w:tc>
+        <w:tc>
+          <w:tcPr>
+            <w:tcW w:type="dxa" w:w="1224"/>
+            <w:vAlign w:val="center"/>
+          </w:tcPr>
+          <w:p>
+            <w:pPr>
+              <w:jc w:val="left"/>
+            </w:pPr>
+            <w:r/>
+            <w:r>
+              <w:rPr>
+                <w:rFonts w:ascii="Arial" w:hAnsi="Arial"/>
+                <w:b w:val="0"/>
+                <w:sz w:val="17"/>
+              </w:rPr>
+              <w:t>99</w:t>
+            </w:r>
+          </w:p>
+        </w:tc>
+      </w:tr>
+      <w:tr>
+        <w:tc>
+          <w:tcPr>
+            <w:tcW w:type="dxa" w:w="1944"/>
+            <w:vAlign w:val="center"/>
+          </w:tcPr>
+          <w:p>
+            <w:pPr>
+              <w:jc w:val="left"/>
+            </w:pPr>
+            <w:r/>
+            <w:r>
+              <w:rPr>
+                <w:rFonts w:ascii="Arial" w:hAnsi="Arial"/>
+                <w:b w:val="0"/>
+                <w:sz w:val="17"/>
+              </w:rPr>
+              <w:t>Sierra</w:t>
+            </w:r>
+          </w:p>
+        </w:tc>
+        <w:tc>
+          <w:tcPr>
+            <w:tcW w:type="dxa" w:w="1440"/>
+            <w:vAlign w:val="center"/>
+          </w:tcPr>
+          <w:p>
+            <w:pPr>
+              <w:jc w:val="left"/>
+            </w:pPr>
+            <w:r/>
+            <w:r>
+              <w:rPr>
+                <w:rFonts w:ascii="Arial" w:hAnsi="Arial"/>
+                <w:b w:val="0"/>
+                <w:sz w:val="17"/>
+              </w:rPr>
+              <w:t>763</w:t>
+            </w:r>
+          </w:p>
+        </w:tc>
+        <w:tc>
+          <w:tcPr>
+            <w:tcW w:type="dxa" w:w="1224"/>
+            <w:vAlign w:val="center"/>
+          </w:tcPr>
+          <w:p>
+            <w:pPr>
+              <w:jc w:val="left"/>
+            </w:pPr>
+            <w:r/>
+            <w:r>
+              <w:rPr>
+                <w:rFonts w:ascii="Arial" w:hAnsi="Arial"/>
+                <w:b w:val="0"/>
+                <w:sz w:val="17"/>
+              </w:rPr>
+              <w:t>185</w:t>
+            </w:r>
+          </w:p>
+        </w:tc>
+        <w:tc>
+          <w:tcPr>
+            <w:tcW w:type="dxa" w:w="1152"/>
+            <w:vAlign w:val="center"/>
+          </w:tcPr>
+          <w:p>
+            <w:pPr>
+              <w:jc w:val="left"/>
+            </w:pPr>
+            <w:r/>
+            <w:r>
+              <w:rPr>
+                <w:rFonts w:ascii="Arial" w:hAnsi="Arial"/>
+                <w:b w:val="0"/>
+                <w:sz w:val="17"/>
+              </w:rPr>
+              <w:t>24.25%</w:t>
+            </w:r>
+          </w:p>
+        </w:tc>
+        <w:tc>
+          <w:tcPr>
+            <w:tcW w:type="dxa" w:w="1224"/>
+            <w:vAlign w:val="center"/>
+          </w:tcPr>
+          <w:p>
+            <w:pPr>
+              <w:jc w:val="left"/>
+            </w:pPr>
+            <w:r/>
+            <w:r>
+              <w:rPr>
+                <w:rFonts w:ascii="Arial" w:hAnsi="Arial"/>
+                <w:b w:val="0"/>
+                <w:sz w:val="17"/>
+              </w:rPr>
+              <w:t>249</w:t>
+            </w:r>
+          </w:p>
+        </w:tc>
+        <w:tc>
+          <w:tcPr>
+            <w:tcW w:type="dxa" w:w="1224"/>
+            <w:vAlign w:val="center"/>
+          </w:tcPr>
+          <w:p>
+            <w:pPr>
+              <w:jc w:val="left"/>
+            </w:pPr>
+            <w:r/>
+            <w:r>
+              <w:rPr>
+                <w:rFonts w:ascii="Arial" w:hAnsi="Arial"/>
+                <w:b w:val="0"/>
+                <w:sz w:val="17"/>
+              </w:rPr>
+              <w:t>44</w:t>
+            </w:r>
+          </w:p>
+        </w:tc>
+      </w:tr>
+    </w:tbl>
+    <w:p>
+      <w:pPr>
+        <w:pStyle w:val="ListBullet"/>
+        <w:spacing w:after="40"/>
+      </w:pPr>
+      <w:r>
+        <w:t>Hermosillo requiere acciones de cobertura amplia por su volumen absoluto de accidentes.</w:t>
+      </w:r>
+    </w:p>
+    <w:p>
+      <w:pPr>
+        <w:pStyle w:val="ListBullet"/>
+        <w:spacing w:after="40"/>
+      </w:pPr>
+      <w:r>
+        <w:t>Sur y Valle combina volumen alto con una proporci?n de gravedad elevada, por lo que debe ser prioridad preventiva.</w:t>
+      </w:r>
+    </w:p>
+    <w:p>
+      <w:pPr>
+        <w:pStyle w:val="ListBullet"/>
+        <w:spacing w:after="40"/>
+      </w:pPr>
+      <w:r>
+        <w:t>Sierra y Centro requieren atenci?n focalizada, aunque tengan menor n?mero de registros, porque su porcentaje de accidentes graves es mayor.</w:t>
+      </w:r>
+    </w:p>
+    <w:p>
+      <w:r>
+        <w:br w:type="page"/>
+      </w:r>
+    </w:p>
+    <w:p>
+      <w:pPr>
+        <w:pStyle w:val="Heading1"/>
+      </w:pPr>
+      <w:r>
+        <w:t>Anexo ampliatorio D. Patrones temporales, causas y tipos de accidente</w:t>
+      </w:r>
+    </w:p>
+    <w:p>
+      <w:pPr>
+        <w:spacing w:after="100"/>
+      </w:pPr>
+      <w:r>
+        <w:t>El cuaderno ATUS muestra una recuperaci?n fuerte del volumen de accidentes despu?s de 2020. El punto mensual m?s bajo fue abril de 2020, con 664 accidentes, mientras que el m?ximo mensual ocurri? en octubre de 2023, con 2,539 accidentes. El promedio mensual del periodo fue de 1,532.59 accidentes.</w:t>
+      </w:r>
+    </w:p>
+    <w:tbl>
+      <w:tblPr>
+        <w:tblStyle w:val="TableGrid"/>
+        <w:tblW w:type="auto" w:w="0"/>
+        <w:jc w:val="center"/>
+        <w:tblLook w:firstColumn="1" w:firstRow="1" w:lastColumn="0" w:lastRow="0" w:noHBand="0" w:noVBand="1" w:val="04A0"/>
+      </w:tblPr>
+      <w:tblGrid>
+        <w:gridCol w:w="4896"/>
+        <w:gridCol w:w="4896"/>
+      </w:tblGrid>
+      <w:tr>
+        <w:tc>
+          <w:tcPr>
+            <w:tcW w:type="dxa" w:w="1440"/>
+            <w:vAlign w:val="center"/>
+            <w:shd w:fill="D9EAF7"/>
+          </w:tcPr>
+          <w:p>
+            <w:pPr>
+              <w:jc w:val="left"/>
+            </w:pPr>
+            <w:r/>
+            <w:r>
+              <w:rPr>
+                <w:rFonts w:ascii="Arial" w:hAnsi="Arial"/>
+                <w:b/>
+                <w:sz w:val="17"/>
+              </w:rPr>
+              <w:t>A?o</w:t>
+            </w:r>
+          </w:p>
+        </w:tc>
+        <w:tc>
+          <w:tcPr>
+            <w:tcW w:type="dxa" w:w="1728"/>
+            <w:vAlign w:val="center"/>
+            <w:shd w:fill="D9EAF7"/>
+          </w:tcPr>
+          <w:p>
+            <w:pPr>
+              <w:jc w:val="left"/>
+            </w:pPr>
+            <w:r/>
+            <w:r>
+              <w:rPr>
+                <w:rFonts w:ascii="Arial" w:hAnsi="Arial"/>
+                <w:b/>
+                <w:sz w:val="17"/>
+              </w:rPr>
+              <w:t>Accidentes</w:t>
+            </w:r>
+          </w:p>
+        </w:tc>
+      </w:tr>
+      <w:tr>
+        <w:tc>
+          <w:tcPr>
+            <w:tcW w:type="dxa" w:w="1440"/>
+            <w:vAlign w:val="center"/>
+          </w:tcPr>
+          <w:p>
+            <w:pPr>
+              <w:jc w:val="left"/>
+            </w:pPr>
+            <w:r/>
+            <w:r>
+              <w:rPr>
+                <w:rFonts w:ascii="Arial" w:hAnsi="Arial"/>
+                <w:b w:val="0"/>
+                <w:sz w:val="17"/>
+              </w:rPr>
+              <w:t>2015</w:t>
+            </w:r>
+          </w:p>
+        </w:tc>
+        <w:tc>
+          <w:tcPr>
+            <w:tcW w:type="dxa" w:w="1728"/>
+            <w:vAlign w:val="center"/>
+          </w:tcPr>
+          <w:p>
+            <w:pPr>
+              <w:jc w:val="left"/>
+            </w:pPr>
+            <w:r/>
+            <w:r>
+              <w:rPr>
+                <w:rFonts w:ascii="Arial" w:hAnsi="Arial"/>
+                <w:b w:val="0"/>
+                <w:sz w:val="17"/>
+              </w:rPr>
+              <w:t>11,960</w:t>
+            </w:r>
+          </w:p>
+        </w:tc>
+      </w:tr>
+      <w:tr>
+        <w:tc>
+          <w:tcPr>
+            <w:tcW w:type="dxa" w:w="1440"/>
+            <w:vAlign w:val="center"/>
+          </w:tcPr>
+          <w:p>
+            <w:pPr>
+              <w:jc w:val="left"/>
+            </w:pPr>
+            <w:r/>
+            <w:r>
+              <w:rPr>
+                <w:rFonts w:ascii="Arial" w:hAnsi="Arial"/>
+                <w:b w:val="0"/>
+                <w:sz w:val="17"/>
+              </w:rPr>
+              <w:t>2016</w:t>
+            </w:r>
+          </w:p>
+        </w:tc>
+        <w:tc>
+          <w:tcPr>
+            <w:tcW w:type="dxa" w:w="1728"/>
+            <w:vAlign w:val="center"/>
+          </w:tcPr>
+          <w:p>
+            <w:pPr>
+              <w:jc w:val="left"/>
+            </w:pPr>
+            <w:r/>
+            <w:r>
+              <w:rPr>
+                <w:rFonts w:ascii="Arial" w:hAnsi="Arial"/>
+                <w:b w:val="0"/>
+                <w:sz w:val="17"/>
+              </w:rPr>
+              <w:t>13,145</w:t>
+            </w:r>
+          </w:p>
+        </w:tc>
+      </w:tr>
+      <w:tr>
+        <w:tc>
+          <w:tcPr>
+            <w:tcW w:type="dxa" w:w="1440"/>
+            <w:vAlign w:val="center"/>
+          </w:tcPr>
+          <w:p>
+            <w:pPr>
+              <w:jc w:val="left"/>
+            </w:pPr>
+            <w:r/>
+            <w:r>
+              <w:rPr>
+                <w:rFonts w:ascii="Arial" w:hAnsi="Arial"/>
+                <w:b w:val="0"/>
+                <w:sz w:val="17"/>
+              </w:rPr>
+              <w:t>2017</w:t>
+            </w:r>
+          </w:p>
+        </w:tc>
+        <w:tc>
+          <w:tcPr>
+            <w:tcW w:type="dxa" w:w="1728"/>
+            <w:vAlign w:val="center"/>
+          </w:tcPr>
+          <w:p>
+            <w:pPr>
+              <w:jc w:val="left"/>
+            </w:pPr>
+            <w:r/>
+            <w:r>
+              <w:rPr>
+                <w:rFonts w:ascii="Arial" w:hAnsi="Arial"/>
+                <w:b w:val="0"/>
+                <w:sz w:val="17"/>
+              </w:rPr>
+              <w:t>15,927</w:t>
+            </w:r>
+          </w:p>
+        </w:tc>
+      </w:tr>
+      <w:tr>
+        <w:tc>
+          <w:tcPr>
+            <w:tcW w:type="dxa" w:w="1440"/>
+            <w:vAlign w:val="center"/>
+          </w:tcPr>
+          <w:p>
+            <w:pPr>
+              <w:jc w:val="left"/>
+            </w:pPr>
+            <w:r/>
+            <w:r>
+              <w:rPr>
+                <w:rFonts w:ascii="Arial" w:hAnsi="Arial"/>
+                <w:b w:val="0"/>
+                <w:sz w:val="17"/>
+              </w:rPr>
+              <w:t>2018</w:t>
+            </w:r>
+          </w:p>
+        </w:tc>
+        <w:tc>
+          <w:tcPr>
+            <w:tcW w:type="dxa" w:w="1728"/>
+            <w:vAlign w:val="center"/>
+          </w:tcPr>
+          <w:p>
+            <w:pPr>
+              <w:jc w:val="left"/>
+            </w:pPr>
+            <w:r/>
+            <w:r>
+              <w:rPr>
+                <w:rFonts w:ascii="Arial" w:hAnsi="Arial"/>
+                <w:b w:val="0"/>
+                <w:sz w:val="17"/>
+              </w:rPr>
+              <w:t>15,938</w:t>
+            </w:r>
+          </w:p>
+        </w:tc>
+      </w:tr>
+      <w:tr>
+        <w:tc>
+          <w:tcPr>
+            <w:tcW w:type="dxa" w:w="1440"/>
+            <w:vAlign w:val="center"/>
+          </w:tcPr>
+          <w:p>
+            <w:pPr>
+              <w:jc w:val="left"/>
+            </w:pPr>
+            <w:r/>
+            <w:r>
+              <w:rPr>
+                <w:rFonts w:ascii="Arial" w:hAnsi="Arial"/>
+                <w:b w:val="0"/>
+                <w:sz w:val="17"/>
+              </w:rPr>
+              <w:t>2019</w:t>
+            </w:r>
+          </w:p>
+        </w:tc>
+        <w:tc>
+          <w:tcPr>
+            <w:tcW w:type="dxa" w:w="1728"/>
+            <w:vAlign w:val="center"/>
+          </w:tcPr>
+          <w:p>
+            <w:pPr>
+              <w:jc w:val="left"/>
+            </w:pPr>
+            <w:r/>
+            <w:r>
+              <w:rPr>
+                <w:rFonts w:ascii="Arial" w:hAnsi="Arial"/>
+                <w:b w:val="0"/>
+                <w:sz w:val="17"/>
+              </w:rPr>
+              <w:t>16,624</w:t>
+            </w:r>
+          </w:p>
+        </w:tc>
+      </w:tr>
+      <w:tr>
+        <w:tc>
+          <w:tcPr>
+            <w:tcW w:type="dxa" w:w="1440"/>
+            <w:vAlign w:val="center"/>
+          </w:tcPr>
+          <w:p>
+            <w:pPr>
+              <w:jc w:val="left"/>
+            </w:pPr>
+            <w:r/>
+            <w:r>
+              <w:rPr>
+                <w:rFonts w:ascii="Arial" w:hAnsi="Arial"/>
+                <w:b w:val="0"/>
+                <w:sz w:val="17"/>
+              </w:rPr>
+              <w:t>2020</w:t>
+            </w:r>
+          </w:p>
+        </w:tc>
+        <w:tc>
+          <w:tcPr>
+            <w:tcW w:type="dxa" w:w="1728"/>
+            <w:vAlign w:val="center"/>
+          </w:tcPr>
+          <w:p>
+            <w:pPr>
+              <w:jc w:val="left"/>
+            </w:pPr>
+            <w:r/>
+            <w:r>
+              <w:rPr>
+                <w:rFonts w:ascii="Arial" w:hAnsi="Arial"/>
+                <w:b w:val="0"/>
+                <w:sz w:val="17"/>
+              </w:rPr>
+              <w:t>12,893</w:t>
+            </w:r>
+          </w:p>
+        </w:tc>
+      </w:tr>
+      <w:tr>
+        <w:tc>
+          <w:tcPr>
+            <w:tcW w:type="dxa" w:w="1440"/>
+            <w:vAlign w:val="center"/>
+          </w:tcPr>
+          <w:p>
+            <w:pPr>
+              <w:jc w:val="left"/>
+            </w:pPr>
+            <w:r/>
+            <w:r>
+              <w:rPr>
+                <w:rFonts w:ascii="Arial" w:hAnsi="Arial"/>
+                <w:b w:val="0"/>
+                <w:sz w:val="17"/>
+              </w:rPr>
+              <w:t>2021</w:t>
+            </w:r>
+          </w:p>
+        </w:tc>
+        <w:tc>
+          <w:tcPr>
+            <w:tcW w:type="dxa" w:w="1728"/>
+            <w:vAlign w:val="center"/>
+          </w:tcPr>
+          <w:p>
+            <w:pPr>
+              <w:jc w:val="left"/>
+            </w:pPr>
+            <w:r/>
+            <w:r>
+              <w:rPr>
+                <w:rFonts w:ascii="Arial" w:hAnsi="Arial"/>
+                <w:b w:val="0"/>
+                <w:sz w:val="17"/>
+              </w:rPr>
+              <w:t>20,743</w:t>
+            </w:r>
+          </w:p>
+        </w:tc>
+      </w:tr>
+      <w:tr>
+        <w:tc>
+          <w:tcPr>
+            <w:tcW w:type="dxa" w:w="1440"/>
+            <w:vAlign w:val="center"/>
+          </w:tcPr>
+          <w:p>
+            <w:pPr>
+              <w:jc w:val="left"/>
+            </w:pPr>
+            <w:r/>
+            <w:r>
+              <w:rPr>
+                <w:rFonts w:ascii="Arial" w:hAnsi="Arial"/>
+                <w:b w:val="0"/>
+                <w:sz w:val="17"/>
+              </w:rPr>
+              <w:t>2022</w:t>
+            </w:r>
+          </w:p>
+        </w:tc>
+        <w:tc>
+          <w:tcPr>
+            <w:tcW w:type="dxa" w:w="1728"/>
+            <w:vAlign w:val="center"/>
+          </w:tcPr>
+          <w:p>
+            <w:pPr>
+              <w:jc w:val="left"/>
+            </w:pPr>
+            <w:r/>
+            <w:r>
+              <w:rPr>
+                <w:rFonts w:ascii="Arial" w:hAnsi="Arial"/>
+                <w:b w:val="0"/>
+                <w:sz w:val="17"/>
+              </w:rPr>
+              <w:t>25,325</w:t>
+            </w:r>
+          </w:p>
+        </w:tc>
+      </w:tr>
+      <w:tr>
+        <w:tc>
+          <w:tcPr>
+            <w:tcW w:type="dxa" w:w="1440"/>
+            <w:vAlign w:val="center"/>
+          </w:tcPr>
+          <w:p>
+            <w:pPr>
+              <w:jc w:val="left"/>
+            </w:pPr>
+            <w:r/>
+            <w:r>
+              <w:rPr>
+                <w:rFonts w:ascii="Arial" w:hAnsi="Arial"/>
+                <w:b w:val="0"/>
+                <w:sz w:val="17"/>
+              </w:rPr>
+              <w:t>2023</w:t>
+            </w:r>
+          </w:p>
+        </w:tc>
+        <w:tc>
+          <w:tcPr>
+            <w:tcW w:type="dxa" w:w="1728"/>
+            <w:vAlign w:val="center"/>
+          </w:tcPr>
+          <w:p>
+            <w:pPr>
+              <w:jc w:val="left"/>
+            </w:pPr>
+            <w:r/>
+            <w:r>
+              <w:rPr>
+                <w:rFonts w:ascii="Arial" w:hAnsi="Arial"/>
+                <w:b w:val="0"/>
+                <w:sz w:val="17"/>
+              </w:rPr>
+              <w:t>26,557</w:t>
+            </w:r>
+          </w:p>
+        </w:tc>
+      </w:tr>
+      <w:tr>
+        <w:tc>
+          <w:tcPr>
+            <w:tcW w:type="dxa" w:w="1440"/>
+            <w:vAlign w:val="center"/>
+          </w:tcPr>
+          <w:p>
+            <w:pPr>
+              <w:jc w:val="left"/>
+            </w:pPr>
+            <w:r/>
+            <w:r>
+              <w:rPr>
+                <w:rFonts w:ascii="Arial" w:hAnsi="Arial"/>
+                <w:b w:val="0"/>
+                <w:sz w:val="17"/>
+              </w:rPr>
+              <w:t>2024</w:t>
+            </w:r>
+          </w:p>
+        </w:tc>
+        <w:tc>
+          <w:tcPr>
+            <w:tcW w:type="dxa" w:w="1728"/>
+            <w:vAlign w:val="center"/>
+          </w:tcPr>
+          <w:p>
+            <w:pPr>
+              <w:jc w:val="left"/>
+            </w:pPr>
+            <w:r/>
+            <w:r>
+              <w:rPr>
+                <w:rFonts w:ascii="Arial" w:hAnsi="Arial"/>
+                <w:b w:val="0"/>
+                <w:sz w:val="17"/>
+              </w:rPr>
+              <w:t>24,799</w:t>
+            </w:r>
+          </w:p>
+        </w:tc>
+      </w:tr>
+    </w:tbl>
+    <w:p>
+      <w:pPr>
+        <w:spacing w:after="100"/>
+      </w:pPr>
+      <w:r>
+        <w:t>Por causa probable, la categor?a Conductor domina con 96.86% de los registros. Le siguen Peat?n o pasajero con 1.23%, Falla del veh?culo con 1.06% y Mala condici?n del camino con 0.74%. Por tipo de accidente, sobresalen la colisi?n con veh?culo automotor, la colisi?n con motocicleta, la colisi?n con objeto fijo y la colisi?n con peat?n.</w:t>
+      </w:r>
+    </w:p>
+    <w:p>
+      <w:pPr>
+        <w:spacing w:after="100"/>
+      </w:pPr>
+      <w:r>
+        <w:t>El rango de hora con m?s accidentes fue la tarde, con 69,114 casos, seguido por noche con 51,156, ma?ana con 45,260 y madrugada con 18,380. Esto sugiere campa?as y vigilancia en horarios de alta movilidad, sin descuidar la gravedad de eventos nocturnos y de madrugada.</w:t>
+      </w:r>
+    </w:p>
+    <w:p>
+      <w:r>
+        <w:br w:type="page"/>
+      </w:r>
+    </w:p>
+    <w:p>
+      <w:pPr>
+        <w:pStyle w:val="Heading1"/>
+      </w:pPr>
+      <w:r>
+        <w:t>Anexo ampliatorio E. Evidencia estad?stica y desempe?o de modelos</w:t>
+      </w:r>
+    </w:p>
+    <w:p>
+      <w:pPr>
+        <w:spacing w:after="100"/>
+      </w:pPr>
+      <w:r>
+        <w:t>Las pruebas de Chi-cuadrada del cuaderno respaldan que las variables categ?ricas analizadas no se comportan como independientes. La asociaci?n m?s fuerte observada fue entre regi?n y tipo de accidente, con Cram?r V de 0.143. Aunque el tama?o del efecto es moderado-bajo, es suficiente para justificar lecturas regionales diferenciadas.</w:t>
+      </w:r>
+    </w:p>
+    <w:tbl>
+      <w:tblPr>
+        <w:tblStyle w:val="TableGrid"/>
+        <w:tblW w:type="auto" w:w="0"/>
+        <w:jc w:val="center"/>
+        <w:tblLook w:firstColumn="1" w:firstRow="1" w:lastColumn="0" w:lastRow="0" w:noHBand="0" w:noVBand="1" w:val="04A0"/>
+      </w:tblPr>
+      <w:tblGrid>
+        <w:gridCol w:w="3264"/>
+        <w:gridCol w:w="3264"/>
+        <w:gridCol w:w="3264"/>
+      </w:tblGrid>
+      <w:tr>
+        <w:tc>
+          <w:tcPr>
+            <w:tcW w:type="dxa" w:w="3024"/>
+            <w:vAlign w:val="center"/>
+            <w:shd w:fill="D9EAF7"/>
+          </w:tcPr>
+          <w:p>
+            <w:pPr>
+              <w:jc w:val="left"/>
+            </w:pPr>
+            <w:r/>
+            <w:r>
+              <w:rPr>
+                <w:rFonts w:ascii="Arial" w:hAnsi="Arial"/>
+                <w:b/>
+                <w:sz w:val="17"/>
+              </w:rPr>
+              <w:t>Relaci?n evaluada</w:t>
+            </w:r>
+          </w:p>
+        </w:tc>
+        <w:tc>
+          <w:tcPr>
+            <w:tcW w:type="dxa" w:w="1080"/>
+            <w:vAlign w:val="center"/>
+            <w:shd w:fill="D9EAF7"/>
+          </w:tcPr>
+          <w:p>
+            <w:pPr>
+              <w:jc w:val="left"/>
+            </w:pPr>
+            <w:r/>
+            <w:r>
+              <w:rPr>
+                <w:rFonts w:ascii="Arial" w:hAnsi="Arial"/>
+                <w:b/>
+                <w:sz w:val="17"/>
+              </w:rPr>
+              <w:t>Cram?r V</w:t>
+            </w:r>
+          </w:p>
+        </w:tc>
+        <w:tc>
+          <w:tcPr>
+            <w:tcW w:type="dxa" w:w="4608"/>
+            <w:vAlign w:val="center"/>
+            <w:shd w:fill="D9EAF7"/>
+          </w:tcPr>
+          <w:p>
+            <w:pPr>
+              <w:jc w:val="left"/>
+            </w:pPr>
+            <w:r/>
+            <w:r>
+              <w:rPr>
+                <w:rFonts w:ascii="Arial" w:hAnsi="Arial"/>
+                <w:b/>
+                <w:sz w:val="17"/>
+              </w:rPr>
+              <w:t>Lectura</w:t>
+            </w:r>
+          </w:p>
+        </w:tc>
+      </w:tr>
+      <w:tr>
+        <w:tc>
+          <w:tcPr>
+            <w:tcW w:type="dxa" w:w="3024"/>
+            <w:vAlign w:val="center"/>
+          </w:tcPr>
+          <w:p>
+            <w:pPr>
+              <w:jc w:val="left"/>
+            </w:pPr>
+            <w:r/>
+            <w:r>
+              <w:rPr>
+                <w:rFonts w:ascii="Arial" w:hAnsi="Arial"/>
+                <w:b w:val="0"/>
+                <w:sz w:val="17"/>
+              </w:rPr>
+              <w:t>Regi?n - tipo de accidente</w:t>
+            </w:r>
+          </w:p>
+        </w:tc>
+        <w:tc>
+          <w:tcPr>
+            <w:tcW w:type="dxa" w:w="1080"/>
+            <w:vAlign w:val="center"/>
+          </w:tcPr>
+          <w:p>
+            <w:pPr>
+              <w:jc w:val="left"/>
+            </w:pPr>
+            <w:r/>
+            <w:r>
+              <w:rPr>
+                <w:rFonts w:ascii="Arial" w:hAnsi="Arial"/>
+                <w:b w:val="0"/>
+                <w:sz w:val="17"/>
+              </w:rPr>
+              <w:t>0.143</w:t>
+            </w:r>
+          </w:p>
+        </w:tc>
+        <w:tc>
+          <w:tcPr>
+            <w:tcW w:type="dxa" w:w="4608"/>
+            <w:vAlign w:val="center"/>
+          </w:tcPr>
+          <w:p>
+            <w:pPr>
+              <w:jc w:val="left"/>
+            </w:pPr>
+            <w:r/>
+            <w:r>
+              <w:rPr>
+                <w:rFonts w:ascii="Arial" w:hAnsi="Arial"/>
+                <w:b w:val="0"/>
+                <w:sz w:val="17"/>
+              </w:rPr>
+              <w:t>El tipo de accidente cambia seg?n la zona del estado.</w:t>
+            </w:r>
+          </w:p>
+        </w:tc>
+      </w:tr>
+      <w:tr>
+        <w:tc>
+          <w:tcPr>
+            <w:tcW w:type="dxa" w:w="3024"/>
+            <w:vAlign w:val="center"/>
+          </w:tcPr>
+          <w:p>
+            <w:pPr>
+              <w:jc w:val="left"/>
+            </w:pPr>
+            <w:r/>
+            <w:r>
+              <w:rPr>
+                <w:rFonts w:ascii="Arial" w:hAnsi="Arial"/>
+                <w:b w:val="0"/>
+                <w:sz w:val="17"/>
+              </w:rPr>
+              <w:t>Regi?n - causa probable</w:t>
+            </w:r>
+          </w:p>
+        </w:tc>
+        <w:tc>
+          <w:tcPr>
+            <w:tcW w:type="dxa" w:w="1080"/>
+            <w:vAlign w:val="center"/>
+          </w:tcPr>
+          <w:p>
+            <w:pPr>
+              <w:jc w:val="left"/>
+            </w:pPr>
+            <w:r/>
+            <w:r>
+              <w:rPr>
+                <w:rFonts w:ascii="Arial" w:hAnsi="Arial"/>
+                <w:b w:val="0"/>
+                <w:sz w:val="17"/>
+              </w:rPr>
+              <w:t>0.091</w:t>
+            </w:r>
+          </w:p>
+        </w:tc>
+        <w:tc>
+          <w:tcPr>
+            <w:tcW w:type="dxa" w:w="4608"/>
+            <w:vAlign w:val="center"/>
+          </w:tcPr>
+          <w:p>
+            <w:pPr>
+              <w:jc w:val="left"/>
+            </w:pPr>
+            <w:r/>
+            <w:r>
+              <w:rPr>
+                <w:rFonts w:ascii="Arial" w:hAnsi="Arial"/>
+                <w:b w:val="0"/>
+                <w:sz w:val="17"/>
+              </w:rPr>
+              <w:t>Las causas mantienen diferencias regionales observables.</w:t>
+            </w:r>
+          </w:p>
+        </w:tc>
+      </w:tr>
+      <w:tr>
+        <w:tc>
+          <w:tcPr>
+            <w:tcW w:type="dxa" w:w="3024"/>
+            <w:vAlign w:val="center"/>
+          </w:tcPr>
+          <w:p>
+            <w:pPr>
+              <w:jc w:val="left"/>
+            </w:pPr>
+            <w:r/>
+            <w:r>
+              <w:rPr>
+                <w:rFonts w:ascii="Arial" w:hAnsi="Arial"/>
+                <w:b w:val="0"/>
+                <w:sz w:val="17"/>
+              </w:rPr>
+              <w:t>Regi?n - nivel de gravedad</w:t>
+            </w:r>
+          </w:p>
+        </w:tc>
+        <w:tc>
+          <w:tcPr>
+            <w:tcW w:type="dxa" w:w="1080"/>
+            <w:vAlign w:val="center"/>
+          </w:tcPr>
+          <w:p>
+            <w:pPr>
+              <w:jc w:val="left"/>
+            </w:pPr>
+            <w:r/>
+            <w:r>
+              <w:rPr>
+                <w:rFonts w:ascii="Arial" w:hAnsi="Arial"/>
+                <w:b w:val="0"/>
+                <w:sz w:val="17"/>
+              </w:rPr>
+              <w:t>0.068</w:t>
+            </w:r>
+          </w:p>
+        </w:tc>
+        <w:tc>
+          <w:tcPr>
+            <w:tcW w:type="dxa" w:w="4608"/>
+            <w:vAlign w:val="center"/>
+          </w:tcPr>
+          <w:p>
+            <w:pPr>
+              <w:jc w:val="left"/>
+            </w:pPr>
+            <w:r/>
+            <w:r>
+              <w:rPr>
+                <w:rFonts w:ascii="Arial" w:hAnsi="Arial"/>
+                <w:b w:val="0"/>
+                <w:sz w:val="17"/>
+              </w:rPr>
+              <w:t>La gravedad no se distribuye igual entre regiones.</w:t>
+            </w:r>
+          </w:p>
+        </w:tc>
+      </w:tr>
+      <w:tr>
+        <w:tc>
+          <w:tcPr>
+            <w:tcW w:type="dxa" w:w="3024"/>
+            <w:vAlign w:val="center"/>
+          </w:tcPr>
+          <w:p>
+            <w:pPr>
+              <w:jc w:val="left"/>
+            </w:pPr>
+            <w:r/>
+            <w:r>
+              <w:rPr>
+                <w:rFonts w:ascii="Arial" w:hAnsi="Arial"/>
+                <w:b w:val="0"/>
+                <w:sz w:val="17"/>
+              </w:rPr>
+              <w:t>Rango de hora - gravedad</w:t>
+            </w:r>
+          </w:p>
+        </w:tc>
+        <w:tc>
+          <w:tcPr>
+            <w:tcW w:type="dxa" w:w="1080"/>
+            <w:vAlign w:val="center"/>
+          </w:tcPr>
+          <w:p>
+            <w:pPr>
+              <w:jc w:val="left"/>
+            </w:pPr>
+            <w:r/>
+            <w:r>
+              <w:rPr>
+                <w:rFonts w:ascii="Arial" w:hAnsi="Arial"/>
+                <w:b w:val="0"/>
+                <w:sz w:val="17"/>
+              </w:rPr>
+              <w:t>0.052</w:t>
+            </w:r>
+          </w:p>
+        </w:tc>
+        <w:tc>
+          <w:tcPr>
+            <w:tcW w:type="dxa" w:w="4608"/>
+            <w:vAlign w:val="center"/>
+          </w:tcPr>
+          <w:p>
+            <w:pPr>
+              <w:jc w:val="left"/>
+            </w:pPr>
+            <w:r/>
+            <w:r>
+              <w:rPr>
+                <w:rFonts w:ascii="Arial" w:hAnsi="Arial"/>
+                <w:b w:val="0"/>
+                <w:sz w:val="17"/>
+              </w:rPr>
+              <w:t>El horario aporta se?al, aunque limitada.</w:t>
+            </w:r>
+          </w:p>
+        </w:tc>
+      </w:tr>
+      <w:tr>
+        <w:tc>
+          <w:tcPr>
+            <w:tcW w:type="dxa" w:w="3024"/>
+            <w:vAlign w:val="center"/>
+          </w:tcPr>
+          <w:p>
+            <w:pPr>
+              <w:jc w:val="left"/>
+            </w:pPr>
+            <w:r/>
+            <w:r>
+              <w:rPr>
+                <w:rFonts w:ascii="Arial" w:hAnsi="Arial"/>
+                <w:b w:val="0"/>
+                <w:sz w:val="17"/>
+              </w:rPr>
+              <w:t>D?a de semana - gravedad</w:t>
+            </w:r>
+          </w:p>
+        </w:tc>
+        <w:tc>
+          <w:tcPr>
+            <w:tcW w:type="dxa" w:w="1080"/>
+            <w:vAlign w:val="center"/>
+          </w:tcPr>
+          <w:p>
+            <w:pPr>
+              <w:jc w:val="left"/>
+            </w:pPr>
+            <w:r/>
+            <w:r>
+              <w:rPr>
+                <w:rFonts w:ascii="Arial" w:hAnsi="Arial"/>
+                <w:b w:val="0"/>
+                <w:sz w:val="17"/>
+              </w:rPr>
+              <w:t>0.035</w:t>
+            </w:r>
+          </w:p>
+        </w:tc>
+        <w:tc>
+          <w:tcPr>
+            <w:tcW w:type="dxa" w:w="4608"/>
+            <w:vAlign w:val="center"/>
+          </w:tcPr>
+          <w:p>
+            <w:pPr>
+              <w:jc w:val="left"/>
+            </w:pPr>
+            <w:r/>
+            <w:r>
+              <w:rPr>
+                <w:rFonts w:ascii="Arial" w:hAnsi="Arial"/>
+                <w:b w:val="0"/>
+                <w:sz w:val="17"/>
+              </w:rPr>
+              <w:t>La asociaci?n existe, pero es d?bil.</w:t>
+            </w:r>
+          </w:p>
+        </w:tc>
+      </w:tr>
+    </w:tbl>
+    <w:tbl>
+      <w:tblPr>
+        <w:tblStyle w:val="TableGrid"/>
+        <w:tblW w:type="auto" w:w="0"/>
+        <w:jc w:val="center"/>
+        <w:tblLook w:firstColumn="1" w:firstRow="1" w:lastColumn="0" w:lastRow="0" w:noHBand="0" w:noVBand="1" w:val="04A0"/>
+      </w:tblPr>
+      <w:tblGrid>
+        <w:gridCol w:w="1958"/>
+        <w:gridCol w:w="1958"/>
+        <w:gridCol w:w="1958"/>
+        <w:gridCol w:w="1958"/>
+        <w:gridCol w:w="1958"/>
+      </w:tblGrid>
+      <w:tr>
+        <w:tc>
+          <w:tcPr>
+            <w:tcW w:type="dxa" w:w="2088"/>
+            <w:vAlign w:val="center"/>
+            <w:shd w:fill="D9EAF7"/>
+          </w:tcPr>
+          <w:p>
+            <w:pPr>
+              <w:jc w:val="left"/>
+            </w:pPr>
+            <w:r/>
+            <w:r>
+              <w:rPr>
+                <w:rFonts w:ascii="Arial" w:hAnsi="Arial"/>
+                <w:b/>
+                <w:sz w:val="17"/>
+              </w:rPr>
+              <w:t>Modelo</w:t>
+            </w:r>
+          </w:p>
+        </w:tc>
+        <w:tc>
+          <w:tcPr>
+            <w:tcW w:type="dxa" w:w="1152"/>
+            <w:vAlign w:val="center"/>
+            <w:shd w:fill="D9EAF7"/>
+          </w:tcPr>
+          <w:p>
+            <w:pPr>
+              <w:jc w:val="left"/>
+            </w:pPr>
+            <w:r/>
+            <w:r>
+              <w:rPr>
+                <w:rFonts w:ascii="Arial" w:hAnsi="Arial"/>
+                <w:b/>
+                <w:sz w:val="17"/>
+              </w:rPr>
+              <w:t>Accuracy</w:t>
+            </w:r>
+          </w:p>
+        </w:tc>
+        <w:tc>
+          <w:tcPr>
+            <w:tcW w:type="dxa" w:w="1440"/>
+            <w:vAlign w:val="center"/>
+            <w:shd w:fill="D9EAF7"/>
+          </w:tcPr>
+          <w:p>
+            <w:pPr>
+              <w:jc w:val="left"/>
+            </w:pPr>
+            <w:r/>
+            <w:r>
+              <w:rPr>
+                <w:rFonts w:ascii="Arial" w:hAnsi="Arial"/>
+                <w:b/>
+                <w:sz w:val="17"/>
+              </w:rPr>
+              <w:t>Precisi?n grave</w:t>
+            </w:r>
+          </w:p>
+        </w:tc>
+        <w:tc>
+          <w:tcPr>
+            <w:tcW w:type="dxa" w:w="1296"/>
+            <w:vAlign w:val="center"/>
+            <w:shd w:fill="D9EAF7"/>
+          </w:tcPr>
+          <w:p>
+            <w:pPr>
+              <w:jc w:val="left"/>
+            </w:pPr>
+            <w:r/>
+            <w:r>
+              <w:rPr>
+                <w:rFonts w:ascii="Arial" w:hAnsi="Arial"/>
+                <w:b/>
+                <w:sz w:val="17"/>
+              </w:rPr>
+              <w:t>Recall grave</w:t>
+            </w:r>
+          </w:p>
+        </w:tc>
+        <w:tc>
+          <w:tcPr>
+            <w:tcW w:type="dxa" w:w="3024"/>
+            <w:vAlign w:val="center"/>
+            <w:shd w:fill="D9EAF7"/>
+          </w:tcPr>
+          <w:p>
+            <w:pPr>
+              <w:jc w:val="left"/>
+            </w:pPr>
+            <w:r/>
+            <w:r>
+              <w:rPr>
+                <w:rFonts w:ascii="Arial" w:hAnsi="Arial"/>
+                <w:b/>
+                <w:sz w:val="17"/>
+              </w:rPr>
+              <w:t>Uso recomendado</w:t>
+            </w:r>
+          </w:p>
+        </w:tc>
+      </w:tr>
+      <w:tr>
+        <w:tc>
+          <w:tcPr>
+            <w:tcW w:type="dxa" w:w="2088"/>
+            <w:vAlign w:val="center"/>
+          </w:tcPr>
+          <w:p>
+            <w:pPr>
+              <w:jc w:val="left"/>
+            </w:pPr>
+            <w:r/>
+            <w:r>
+              <w:rPr>
+                <w:rFonts w:ascii="Arial" w:hAnsi="Arial"/>
+                <w:b w:val="0"/>
+                <w:sz w:val="17"/>
+              </w:rPr>
+              <w:t>Regresi?n log?stica</w:t>
+            </w:r>
+          </w:p>
+        </w:tc>
+        <w:tc>
+          <w:tcPr>
+            <w:tcW w:type="dxa" w:w="1152"/>
+            <w:vAlign w:val="center"/>
+          </w:tcPr>
+          <w:p>
+            <w:pPr>
+              <w:jc w:val="left"/>
+            </w:pPr>
+            <w:r/>
+            <w:r>
+              <w:rPr>
+                <w:rFonts w:ascii="Arial" w:hAnsi="Arial"/>
+                <w:b w:val="0"/>
+                <w:sz w:val="17"/>
+              </w:rPr>
+              <w:t>0.8163</w:t>
+            </w:r>
+          </w:p>
+        </w:tc>
+        <w:tc>
+          <w:tcPr>
+            <w:tcW w:type="dxa" w:w="1440"/>
+            <w:vAlign w:val="center"/>
+          </w:tcPr>
+          <w:p>
+            <w:pPr>
+              <w:jc w:val="left"/>
+            </w:pPr>
+            <w:r/>
+            <w:r>
+              <w:rPr>
+                <w:rFonts w:ascii="Arial" w:hAnsi="Arial"/>
+                <w:b w:val="0"/>
+                <w:sz w:val="17"/>
+              </w:rPr>
+              <w:t>0.47</w:t>
+            </w:r>
+          </w:p>
+        </w:tc>
+        <w:tc>
+          <w:tcPr>
+            <w:tcW w:type="dxa" w:w="1296"/>
+            <w:vAlign w:val="center"/>
+          </w:tcPr>
+          <w:p>
+            <w:pPr>
+              <w:jc w:val="left"/>
+            </w:pPr>
+            <w:r/>
+            <w:r>
+              <w:rPr>
+                <w:rFonts w:ascii="Arial" w:hAnsi="Arial"/>
+                <w:b w:val="0"/>
+                <w:sz w:val="17"/>
+              </w:rPr>
+              <w:t>0.75</w:t>
+            </w:r>
+          </w:p>
+        </w:tc>
+        <w:tc>
+          <w:tcPr>
+            <w:tcW w:type="dxa" w:w="3024"/>
+            <w:vAlign w:val="center"/>
+          </w:tcPr>
+          <w:p>
+            <w:pPr>
+              <w:jc w:val="left"/>
+            </w:pPr>
+            <w:r/>
+            <w:r>
+              <w:rPr>
+                <w:rFonts w:ascii="Arial" w:hAnsi="Arial"/>
+                <w:b w:val="0"/>
+                <w:sz w:val="17"/>
+              </w:rPr>
+              <w:t>Explicaci?n simple y sensibilidad alta.</w:t>
+            </w:r>
+          </w:p>
+        </w:tc>
+      </w:tr>
+      <w:tr>
+        <w:tc>
+          <w:tcPr>
+            <w:tcW w:type="dxa" w:w="2088"/>
+            <w:vAlign w:val="center"/>
+          </w:tcPr>
+          <w:p>
+            <w:pPr>
+              <w:jc w:val="left"/>
+            </w:pPr>
+            <w:r/>
+            <w:r>
+              <w:rPr>
+                <w:rFonts w:ascii="Arial" w:hAnsi="Arial"/>
+                <w:b w:val="0"/>
+                <w:sz w:val="17"/>
+              </w:rPr>
+              <w:t>Random Forest</w:t>
+            </w:r>
+          </w:p>
+        </w:tc>
+        <w:tc>
+          <w:tcPr>
+            <w:tcW w:type="dxa" w:w="1152"/>
+            <w:vAlign w:val="center"/>
+          </w:tcPr>
+          <w:p>
+            <w:pPr>
+              <w:jc w:val="left"/>
+            </w:pPr>
+            <w:r/>
+            <w:r>
+              <w:rPr>
+                <w:rFonts w:ascii="Arial" w:hAnsi="Arial"/>
+                <w:b w:val="0"/>
+                <w:sz w:val="17"/>
+              </w:rPr>
+              <w:t>0.8633</w:t>
+            </w:r>
+          </w:p>
+        </w:tc>
+        <w:tc>
+          <w:tcPr>
+            <w:tcW w:type="dxa" w:w="1440"/>
+            <w:vAlign w:val="center"/>
+          </w:tcPr>
+          <w:p>
+            <w:pPr>
+              <w:jc w:val="left"/>
+            </w:pPr>
+            <w:r/>
+            <w:r>
+              <w:rPr>
+                <w:rFonts w:ascii="Arial" w:hAnsi="Arial"/>
+                <w:b w:val="0"/>
+                <w:sz w:val="17"/>
+              </w:rPr>
+              <w:t>0.58</w:t>
+            </w:r>
+          </w:p>
+        </w:tc>
+        <w:tc>
+          <w:tcPr>
+            <w:tcW w:type="dxa" w:w="1296"/>
+            <w:vAlign w:val="center"/>
+          </w:tcPr>
+          <w:p>
+            <w:pPr>
+              <w:jc w:val="left"/>
+            </w:pPr>
+            <w:r/>
+            <w:r>
+              <w:rPr>
+                <w:rFonts w:ascii="Arial" w:hAnsi="Arial"/>
+                <w:b w:val="0"/>
+                <w:sz w:val="17"/>
+              </w:rPr>
+              <w:t>0.69</w:t>
+            </w:r>
+          </w:p>
+        </w:tc>
+        <w:tc>
+          <w:tcPr>
+            <w:tcW w:type="dxa" w:w="3024"/>
+            <w:vAlign w:val="center"/>
+          </w:tcPr>
+          <w:p>
+            <w:pPr>
+              <w:jc w:val="left"/>
+            </w:pPr>
+            <w:r/>
+            <w:r>
+              <w:rPr>
+                <w:rFonts w:ascii="Arial" w:hAnsi="Arial"/>
+                <w:b w:val="0"/>
+                <w:sz w:val="17"/>
+              </w:rPr>
+              <w:t>Mejor balance general para clasificaci?n.</w:t>
+            </w:r>
+          </w:p>
+        </w:tc>
+      </w:tr>
+    </w:tbl>
+    <w:p>
+      <w:pPr>
+        <w:spacing w:after="100"/>
+      </w:pPr>
+      <w:r>
+        <w:t>En reglas de asociaci?n, la colisi?n con peat?n hacia gravedad alta alcanz? confianza de 1.0 y lift de 5.88. Esto no significa causalidad autom?tica, pero s? una alerta clara: los atropellamientos deben tratarse como eventos prioritarios dentro de la estrategia preventiva.</w:t>
+      </w:r>
+    </w:p>
+    <w:p>
+      <w:r>
+        <w:br w:type="page"/>
+      </w:r>
+    </w:p>
+    <w:p>
+      <w:pPr>
+        <w:pStyle w:val="Heading1"/>
+      </w:pPr>
+      <w:r>
+        <w:t>Anexo ampliatorio F. S?ntesis preventiva derivada de los hallazgos</w:t>
+      </w:r>
+    </w:p>
+    <w:p>
+      <w:pPr>
+        <w:spacing w:after="100"/>
+      </w:pPr>
+      <w:r>
+        <w:t>La informaci?n adicional permite convertir el an?lisis en una matriz de intervenci?n. La prevenci?n debe diferenciar entre zonas de alto volumen, zonas de alta severidad y tipos de accidente que tienden a producir v?ctimas. Este enfoque evita una recomendaci?n ?nica para todo el estado.</w:t>
+      </w:r>
+    </w:p>
+    <w:tbl>
+      <w:tblPr>
+        <w:tblStyle w:val="TableGrid"/>
+        <w:tblW w:type="auto" w:w="0"/>
+        <w:jc w:val="center"/>
+        <w:tblLook w:firstColumn="1" w:firstRow="1" w:lastColumn="0" w:lastRow="0" w:noHBand="0" w:noVBand="1" w:val="04A0"/>
+      </w:tblPr>
+      <w:tblGrid>
+        <w:gridCol w:w="3264"/>
+        <w:gridCol w:w="3264"/>
+        <w:gridCol w:w="3264"/>
+      </w:tblGrid>
+      <w:tr>
+        <w:tc>
+          <w:tcPr>
+            <w:tcW w:type="dxa" w:w="1728"/>
+            <w:vAlign w:val="center"/>
+            <w:shd w:fill="D9EAF7"/>
+          </w:tcPr>
+          <w:p>
+            <w:pPr>
+              <w:jc w:val="left"/>
+            </w:pPr>
+            <w:r/>
+            <w:r>
+              <w:rPr>
+                <w:rFonts w:ascii="Arial" w:hAnsi="Arial"/>
+                <w:b/>
+                <w:sz w:val="17"/>
+              </w:rPr>
+              <w:t>Prioridad</w:t>
+            </w:r>
+          </w:p>
+        </w:tc>
+        <w:tc>
+          <w:tcPr>
+            <w:tcW w:type="dxa" w:w="2880"/>
+            <w:vAlign w:val="center"/>
+            <w:shd w:fill="D9EAF7"/>
+          </w:tcPr>
+          <w:p>
+            <w:pPr>
+              <w:jc w:val="left"/>
+            </w:pPr>
+            <w:r/>
+            <w:r>
+              <w:rPr>
+                <w:rFonts w:ascii="Arial" w:hAnsi="Arial"/>
+                <w:b/>
+                <w:sz w:val="17"/>
+              </w:rPr>
+              <w:t>Evidencia</w:t>
+            </w:r>
+          </w:p>
+        </w:tc>
+        <w:tc>
+          <w:tcPr>
+            <w:tcW w:type="dxa" w:w="4320"/>
+            <w:vAlign w:val="center"/>
+            <w:shd w:fill="D9EAF7"/>
+          </w:tcPr>
+          <w:p>
+            <w:pPr>
+              <w:jc w:val="left"/>
+            </w:pPr>
+            <w:r/>
+            <w:r>
+              <w:rPr>
+                <w:rFonts w:ascii="Arial" w:hAnsi="Arial"/>
+                <w:b/>
+                <w:sz w:val="17"/>
+              </w:rPr>
+              <w:t>Acci?n preventiva sugerida</w:t>
+            </w:r>
+          </w:p>
+        </w:tc>
+      </w:tr>
+      <w:tr>
+        <w:tc>
+          <w:tcPr>
+            <w:tcW w:type="dxa" w:w="1728"/>
+            <w:vAlign w:val="center"/>
+          </w:tcPr>
+          <w:p>
+            <w:pPr>
+              <w:jc w:val="left"/>
+            </w:pPr>
+            <w:r/>
+            <w:r>
+              <w:rPr>
+                <w:rFonts w:ascii="Arial" w:hAnsi="Arial"/>
+                <w:b w:val="0"/>
+                <w:sz w:val="17"/>
+              </w:rPr>
+              <w:t>Alto volumen urbano</w:t>
+            </w:r>
+          </w:p>
+        </w:tc>
+        <w:tc>
+          <w:tcPr>
+            <w:tcW w:type="dxa" w:w="2880"/>
+            <w:vAlign w:val="center"/>
+          </w:tcPr>
+          <w:p>
+            <w:pPr>
+              <w:jc w:val="left"/>
+            </w:pPr>
+            <w:r/>
+            <w:r>
+              <w:rPr>
+                <w:rFonts w:ascii="Arial" w:hAnsi="Arial"/>
+                <w:b w:val="0"/>
+                <w:sz w:val="17"/>
+              </w:rPr>
+              <w:t>Hermosillo: 65,252 accidentes.</w:t>
+            </w:r>
+          </w:p>
+        </w:tc>
+        <w:tc>
+          <w:tcPr>
+            <w:tcW w:type="dxa" w:w="4320"/>
+            <w:vAlign w:val="center"/>
+          </w:tcPr>
+          <w:p>
+            <w:pPr>
+              <w:jc w:val="left"/>
+            </w:pPr>
+            <w:r/>
+            <w:r>
+              <w:rPr>
+                <w:rFonts w:ascii="Arial" w:hAnsi="Arial"/>
+                <w:b w:val="0"/>
+                <w:sz w:val="17"/>
+              </w:rPr>
+              <w:t>Operativos en intersecciones, control de velocidad y educaci?n vial masiva.</w:t>
+            </w:r>
+          </w:p>
+        </w:tc>
+      </w:tr>
+      <w:tr>
+        <w:tc>
+          <w:tcPr>
+            <w:tcW w:type="dxa" w:w="1728"/>
+            <w:vAlign w:val="center"/>
+          </w:tcPr>
+          <w:p>
+            <w:pPr>
+              <w:jc w:val="left"/>
+            </w:pPr>
+            <w:r/>
+            <w:r>
+              <w:rPr>
+                <w:rFonts w:ascii="Arial" w:hAnsi="Arial"/>
+                <w:b w:val="0"/>
+                <w:sz w:val="17"/>
+              </w:rPr>
+              <w:t>Alta severidad regional</w:t>
+            </w:r>
+          </w:p>
+        </w:tc>
+        <w:tc>
+          <w:tcPr>
+            <w:tcW w:type="dxa" w:w="2880"/>
+            <w:vAlign w:val="center"/>
+          </w:tcPr>
+          <w:p>
+            <w:pPr>
+              <w:jc w:val="left"/>
+            </w:pPr>
+            <w:r/>
+            <w:r>
+              <w:rPr>
+                <w:rFonts w:ascii="Arial" w:hAnsi="Arial"/>
+                <w:b w:val="0"/>
+                <w:sz w:val="17"/>
+              </w:rPr>
+              <w:t>Sierra 24.25%, Centro 22.38%, Sur y Valle 21.12% graves.</w:t>
+            </w:r>
+          </w:p>
+        </w:tc>
+        <w:tc>
+          <w:tcPr>
+            <w:tcW w:type="dxa" w:w="4320"/>
+            <w:vAlign w:val="center"/>
+          </w:tcPr>
+          <w:p>
+            <w:pPr>
+              <w:jc w:val="left"/>
+            </w:pPr>
+            <w:r/>
+            <w:r>
+              <w:rPr>
+                <w:rFonts w:ascii="Arial" w:hAnsi="Arial"/>
+                <w:b w:val="0"/>
+                <w:sz w:val="17"/>
+              </w:rPr>
+              <w:t>Revisi?n de tramos, se?alizaci?n, atenci?n a traslados intermunicipales y respuesta de emergencia.</w:t>
+            </w:r>
+          </w:p>
+        </w:tc>
+      </w:tr>
+      <w:tr>
+        <w:tc>
+          <w:tcPr>
+            <w:tcW w:type="dxa" w:w="1728"/>
+            <w:vAlign w:val="center"/>
+          </w:tcPr>
+          <w:p>
+            <w:pPr>
+              <w:jc w:val="left"/>
+            </w:pPr>
+            <w:r/>
+            <w:r>
+              <w:rPr>
+                <w:rFonts w:ascii="Arial" w:hAnsi="Arial"/>
+                <w:b w:val="0"/>
+                <w:sz w:val="17"/>
+              </w:rPr>
+              <w:t>Atropellamientos</w:t>
+            </w:r>
+          </w:p>
+        </w:tc>
+        <w:tc>
+          <w:tcPr>
+            <w:tcW w:type="dxa" w:w="2880"/>
+            <w:vAlign w:val="center"/>
+          </w:tcPr>
+          <w:p>
+            <w:pPr>
+              <w:jc w:val="left"/>
+            </w:pPr>
+            <w:r/>
+            <w:r>
+              <w:rPr>
+                <w:rFonts w:ascii="Arial" w:hAnsi="Arial"/>
+                <w:b w:val="0"/>
+                <w:sz w:val="17"/>
+              </w:rPr>
+              <w:t>Regla Apriori con lift 5.88 hacia gravedad alta.</w:t>
+            </w:r>
+          </w:p>
+        </w:tc>
+        <w:tc>
+          <w:tcPr>
+            <w:tcW w:type="dxa" w:w="4320"/>
+            <w:vAlign w:val="center"/>
+          </w:tcPr>
+          <w:p>
+            <w:pPr>
+              <w:jc w:val="left"/>
+            </w:pPr>
+            <w:r/>
+            <w:r>
+              <w:rPr>
+                <w:rFonts w:ascii="Arial" w:hAnsi="Arial"/>
+                <w:b w:val="0"/>
+                <w:sz w:val="17"/>
+              </w:rPr>
+              <w:t>Cruces seguros, iluminaci?n, zonas escolares, campa?as para peatones y conductores.</w:t>
+            </w:r>
+          </w:p>
+        </w:tc>
+      </w:tr>
+      <w:tr>
+        <w:tc>
+          <w:tcPr>
+            <w:tcW w:type="dxa" w:w="1728"/>
+            <w:vAlign w:val="center"/>
+          </w:tcPr>
+          <w:p>
+            <w:pPr>
+              <w:jc w:val="left"/>
+            </w:pPr>
+            <w:r/>
+            <w:r>
+              <w:rPr>
+                <w:rFonts w:ascii="Arial" w:hAnsi="Arial"/>
+                <w:b w:val="0"/>
+                <w:sz w:val="17"/>
+              </w:rPr>
+              <w:t>Motocicletas</w:t>
+            </w:r>
+          </w:p>
+        </w:tc>
+        <w:tc>
+          <w:tcPr>
+            <w:tcW w:type="dxa" w:w="2880"/>
+            <w:vAlign w:val="center"/>
+          </w:tcPr>
+          <w:p>
+            <w:pPr>
+              <w:jc w:val="left"/>
+            </w:pPr>
+            <w:r/>
+            <w:r>
+              <w:rPr>
+                <w:rFonts w:ascii="Arial" w:hAnsi="Arial"/>
+                <w:b w:val="0"/>
+                <w:sz w:val="17"/>
+              </w:rPr>
+              <w:t>12.19% de accidentes involucran motocicleta.</w:t>
+            </w:r>
+          </w:p>
+        </w:tc>
+        <w:tc>
+          <w:tcPr>
+            <w:tcW w:type="dxa" w:w="4320"/>
+            <w:vAlign w:val="center"/>
+          </w:tcPr>
+          <w:p>
+            <w:pPr>
+              <w:jc w:val="left"/>
+            </w:pPr>
+            <w:r/>
+            <w:r>
+              <w:rPr>
+                <w:rFonts w:ascii="Arial" w:hAnsi="Arial"/>
+                <w:b w:val="0"/>
+                <w:sz w:val="17"/>
+              </w:rPr>
+              <w:t>Uso de casco, visibilidad, carriles compartidos y vigilancia de maniobras riesgosas.</w:t>
+            </w:r>
+          </w:p>
+        </w:tc>
+      </w:tr>
+      <w:tr>
+        <w:tc>
+          <w:tcPr>
+            <w:tcW w:type="dxa" w:w="1728"/>
+            <w:vAlign w:val="center"/>
+          </w:tcPr>
+          <w:p>
+            <w:pPr>
+              <w:jc w:val="left"/>
+            </w:pPr>
+            <w:r/>
+            <w:r>
+              <w:rPr>
+                <w:rFonts w:ascii="Arial" w:hAnsi="Arial"/>
+                <w:b w:val="0"/>
+                <w:sz w:val="17"/>
+              </w:rPr>
+              <w:t>Temporalidad</w:t>
+            </w:r>
+          </w:p>
+        </w:tc>
+        <w:tc>
+          <w:tcPr>
+            <w:tcW w:type="dxa" w:w="2880"/>
+            <w:vAlign w:val="center"/>
+          </w:tcPr>
+          <w:p>
+            <w:pPr>
+              <w:jc w:val="left"/>
+            </w:pPr>
+            <w:r/>
+            <w:r>
+              <w:rPr>
+                <w:rFonts w:ascii="Arial" w:hAnsi="Arial"/>
+                <w:b w:val="0"/>
+                <w:sz w:val="17"/>
+              </w:rPr>
+              <w:t>M?ximo mensual en octubre de 2023; tarde concentra 69,114 casos.</w:t>
+            </w:r>
+          </w:p>
+        </w:tc>
+        <w:tc>
+          <w:tcPr>
+            <w:tcW w:type="dxa" w:w="4320"/>
+            <w:vAlign w:val="center"/>
+          </w:tcPr>
+          <w:p>
+            <w:pPr>
+              <w:jc w:val="left"/>
+            </w:pPr>
+            <w:r/>
+            <w:r>
+              <w:rPr>
+                <w:rFonts w:ascii="Arial" w:hAnsi="Arial"/>
+                <w:b w:val="0"/>
+                <w:sz w:val="17"/>
+              </w:rPr>
+              <w:t>Campa?as por temporada y refuerzo en horarios de mayor movilidad.</w:t>
+            </w:r>
+          </w:p>
+        </w:tc>
+      </w:tr>
+    </w:tbl>
+    <w:p>
+      <w:pPr>
+        <w:spacing w:after="100"/>
+      </w:pPr>
+      <w:r>
+        <w:t>Con esta ampliaci?n, el informe final queda sustentado por la propuesta E1, por el cuaderno ATUS y por una verificaci?n independiente de los principales conteos. Las recomendaciones se mantienen como apoyo para la toma de decisiones, no como sustituto de diagn?sticos viales de campo.</w:t>
+      </w:r>
+    </w:p>
     <w:sectPr>
       <w:footerReference w:type="default" r:id="rId9"/>
       <w:pgSz w:w="12240" w:h="15840"/>
@@ -2590,8 +5945,11 @@
     <w:name w:val="Normal"/>
     <w:qFormat/>
     <w:rsid w:val="00FC693F"/>
+    <w:pPr>
+      <w:spacing w:after="100" w:line="252" w:lineRule="auto"/>
+    </w:pPr>
     <w:rPr>
-      <w:rFonts w:ascii="Aptos" w:hAnsi="Aptos" w:eastAsia="Aptos"/>
+      <w:rFonts w:ascii="Arial" w:hAnsi="Arial" w:eastAsia="Aptos"/>
       <w:sz w:val="21"/>
     </w:rPr>
   </w:style>
@@ -2650,14 +6008,14 @@
     <w:pPr>
       <w:keepNext/>
       <w:keepLines/>
-      <w:spacing w:before="480" w:after="0"/>
+      <w:spacing w:before="80" w:after="120"/>
       <w:outlineLvl w:val="0"/>
     </w:pPr>
     <w:rPr>
-      <w:rFonts w:asciiTheme="majorHAnsi" w:eastAsiaTheme="majorEastAsia" w:hAnsiTheme="majorHAnsi" w:cstheme="majorBidi" w:ascii="Aptos Display" w:hAnsi="Aptos Display" w:eastAsia="Aptos Display"/>
+      <w:rFonts w:asciiTheme="majorHAnsi" w:eastAsiaTheme="majorEastAsia" w:hAnsiTheme="majorHAnsi" w:cstheme="majorBidi" w:ascii="Arial" w:hAnsi="Arial" w:eastAsia="Aptos Display"/>
       <w:b/>
       <w:bCs/>
-      <w:color w:val="207E76"/>
+      <w:color w:val="1F4E79"/>
       <w:sz w:val="30"/>
       <w:szCs w:val="28"/>
     </w:rPr>
@@ -2674,15 +6032,15 @@
     <w:pPr>
       <w:keepNext/>
       <w:keepLines/>
-      <w:spacing w:before="200" w:after="0"/>
+      <w:spacing w:before="60" w:after="80"/>
       <w:outlineLvl w:val="1"/>
     </w:pPr>
     <w:rPr>
-      <w:rFonts w:asciiTheme="majorHAnsi" w:eastAsiaTheme="majorEastAsia" w:hAnsiTheme="majorHAnsi" w:cstheme="majorBidi" w:ascii="Aptos" w:hAnsi="Aptos" w:eastAsia="Aptos"/>
+      <w:rFonts w:asciiTheme="majorHAnsi" w:eastAsiaTheme="majorEastAsia" w:hAnsiTheme="majorHAnsi" w:cstheme="majorBidi" w:ascii="Arial" w:hAnsi="Arial" w:eastAsia="Aptos"/>
       <w:b/>
       <w:bCs/>
-      <w:color w:val="18324A"/>
-      <w:sz w:val="25"/>
+      <w:color w:val="1F4E79"/>
+      <w:sz w:val="24"/>
       <w:szCs w:val="26"/>
     </w:rPr>
   </w:style>

</xml_diff>